<commit_message>
changed made to activity diagram
</commit_message>
<xml_diff>
--- a/docs/Practical4.docx
+++ b/docs/Practical4.docx
@@ -1,25 +1,21 @@
 
 <file path=word/document.xml><?xml version="1.0" encoding="utf-8"?>
-<w:document xmlns:o="urn:schemas-microsoft-com:office:office" xmlns:r="http://schemas.openxmlformats.org/officeDocument/2006/relationships" xmlns:v="urn:schemas-microsoft-com:vml" xmlns:w="http://schemas.openxmlformats.org/wordprocessingml/2006/main" xmlns:w10="urn:schemas-microsoft-com:office:word" xmlns:wp="http://schemas.openxmlformats.org/drawingml/2006/wordprocessingDrawing" xmlns:pic="http://schemas.openxmlformats.org/drawingml/2006/picture" xmlns:wps="http://schemas.microsoft.com/office/word/2010/wordprocessingShape" xmlns:wpg="http://schemas.microsoft.com/office/word/2010/wordprocessingGroup" xmlns:mc="http://schemas.openxmlformats.org/markup-compatibility/2006" xmlns:wp14="http://schemas.microsoft.com/office/word/2010/wordprocessingDrawing" xmlns:w14="http://schemas.microsoft.com/office/word/2010/wordml" xmlns:w15="http://schemas.microsoft.com/office/word/2012/wordml" mc:Ignorable="w14 wp14 w15">
+<w:document xmlns:wpc="http://schemas.microsoft.com/office/word/2010/wordprocessingCanvas" xmlns:cx="http://schemas.microsoft.com/office/drawing/2014/chartex" xmlns:cx1="http://schemas.microsoft.com/office/drawing/2015/9/8/chartex" xmlns:cx2="http://schemas.microsoft.com/office/drawing/2015/10/21/chartex" xmlns:cx3="http://schemas.microsoft.com/office/drawing/2016/5/9/chartex" xmlns:cx4="http://schemas.microsoft.com/office/drawing/2016/5/10/chartex" xmlns:cx5="http://schemas.microsoft.com/office/drawing/2016/5/11/chartex" xmlns:cx6="http://schemas.microsoft.com/office/drawing/2016/5/12/chartex" xmlns:cx7="http://schemas.microsoft.com/office/drawing/2016/5/13/chartex" xmlns:cx8="http://schemas.microsoft.com/office/drawing/2016/5/14/chartex" xmlns:mc="http://schemas.openxmlformats.org/markup-compatibility/2006" xmlns:aink="http://schemas.microsoft.com/office/drawing/2016/ink" xmlns:am3d="http://schemas.microsoft.com/office/drawing/2017/model3d" xmlns:o="urn:schemas-microsoft-com:office:office" xmlns:oel="http://schemas.microsoft.com/office/2019/extlst" xmlns:r="http://schemas.openxmlformats.org/officeDocument/2006/relationships" xmlns:m="http://schemas.openxmlformats.org/officeDocument/2006/math" xmlns:v="urn:schemas-microsoft-com:vml" xmlns:wp14="http://schemas.microsoft.com/office/word/2010/wordprocessingDrawing" xmlns:wp="http://schemas.openxmlformats.org/drawingml/2006/wordprocessingDrawing" xmlns:w10="urn:schemas-microsoft-com:office:word" xmlns:w="http://schemas.openxmlformats.org/wordprocessingml/2006/main" xmlns:w14="http://schemas.microsoft.com/office/word/2010/wordml" xmlns:w15="http://schemas.microsoft.com/office/word/2012/wordml" xmlns:w16cex="http://schemas.microsoft.com/office/word/2018/wordml/cex" xmlns:w16cid="http://schemas.microsoft.com/office/word/2016/wordml/cid" xmlns:w16="http://schemas.microsoft.com/office/word/2018/wordml" xmlns:w16du="http://schemas.microsoft.com/office/word/2023/wordml/word16du" xmlns:w16sdtdh="http://schemas.microsoft.com/office/word/2020/wordml/sdtdatahash" xmlns:w16sdtfl="http://schemas.microsoft.com/office/word/2024/wordml/sdtformatlock" xmlns:w16se="http://schemas.microsoft.com/office/word/2015/wordml/symex" xmlns:wpg="http://schemas.microsoft.com/office/word/2010/wordprocessingGroup" xmlns:wpi="http://schemas.microsoft.com/office/word/2010/wordprocessingInk" xmlns:wne="http://schemas.microsoft.com/office/word/2006/wordml" xmlns:wps="http://schemas.microsoft.com/office/word/2010/wordprocessingShape" mc:Ignorable="w14 w15 w16se w16cid w16 w16cex w16sdtdh w16sdtfl w16du wp14">
   <w:body>
     <w:p>
       <w:pPr>
         <w:pStyle w:val="Title"/>
         <w:jc w:val="center"/>
-        <w:rPr/>
-      </w:pPr>
-      <w:r>
-        <w:rPr/>
+      </w:pPr>
+      <w:r>
         <w:t>COS214 Practical 4</w:t>
       </w:r>
     </w:p>
     <w:p>
       <w:pPr>
         <w:pStyle w:val="Heading1"/>
-        <w:rPr/>
-      </w:pPr>
-      <w:r>
-        <w:rPr/>
+      </w:pPr>
+      <w:r>
         <w:t>Team:</w:t>
       </w:r>
     </w:p>
@@ -30,24 +26,19 @@
           <w:ilvl w:val="0"/>
           <w:numId w:val="1"/>
         </w:numPr>
-        <w:rPr/>
-      </w:pPr>
-      <w:r>
-        <w:rPr/>
+      </w:pPr>
+      <w:r>
         <w:t>U24876489 – Katlego Sentsho</w:t>
       </w:r>
     </w:p>
     <w:p>
       <w:pPr>
-        <w:pStyle w:val="Normal"/>
         <w:numPr>
           <w:ilvl w:val="0"/>
           <w:numId w:val="1"/>
         </w:numPr>
-        <w:rPr/>
-      </w:pPr>
-      <w:r>
-        <w:rPr/>
+      </w:pPr>
+      <w:r>
         <w:t>u23545756 – Kyle Pillay</w:t>
       </w:r>
     </w:p>
@@ -58,62 +49,44 @@
           <w:ilvl w:val="0"/>
           <w:numId w:val="1"/>
         </w:numPr>
-        <w:rPr/>
-      </w:pPr>
-      <w:r>
-        <w:rPr/>
+      </w:pPr>
+      <w:r>
         <w:t xml:space="preserve">u25108582 – Jonathan Witter </w:t>
       </w:r>
     </w:p>
     <w:p>
       <w:pPr>
         <w:pStyle w:val="Heading1"/>
-        <w:rPr/>
-      </w:pPr>
-      <w:r>
-        <w:rPr/>
+      </w:pPr>
+      <w:r>
         <w:t>System Description</w:t>
       </w:r>
     </w:p>
     <w:p>
-      <w:pPr>
-        <w:pStyle w:val="Normal"/>
-        <w:rPr/>
-      </w:pPr>
-      <w:r>
-        <w:rPr/>
+      <w:r>
         <w:t>We decided on film production for the domain. This design allows for Studios to group their films (produced or in progress of being made) into their type of film (Movie, Tv Series, Animated, ...)</w:t>
       </w:r>
     </w:p>
     <w:p>
-      <w:pPr>
-        <w:pStyle w:val="Normal"/>
-        <w:rPr/>
-      </w:pPr>
-      <w:r>
-        <w:rPr/>
+      <w:r>
         <w:t>Films will have states. They are either in planning/filming/editing phase or they have been released. Films are decorated with how they are accessed (viewed) by the public (such as online platforms for streaming or theaters).</w:t>
       </w:r>
     </w:p>
     <w:p>
       <w:pPr>
         <w:pStyle w:val="Heading1"/>
-        <w:rPr/>
-      </w:pPr>
-      <w:r>
-        <w:rPr/>
+      </w:pPr>
+      <w:r>
         <w:t>UML Diagram</w:t>
       </w:r>
     </w:p>
     <w:p>
-      <w:pPr>
-        <w:pStyle w:val="Normal"/>
-        <w:rPr/>
-      </w:pPr>
-      <w:r>
-        <w:rPr/>
+      <w:r>
+        <w:rPr>
+          <w:noProof/>
+        </w:rPr>
         <w:drawing>
-          <wp:inline distT="0" distB="0" distL="0" distR="0">
+          <wp:inline distT="0" distB="0" distL="0" distR="0" wp14:anchorId="73763045" wp14:editId="73763046">
             <wp:extent cx="5731510" cy="2769870"/>
             <wp:effectExtent l="0" t="0" r="0" b="0"/>
             <wp:docPr id="1" name="Picture 1"/>
@@ -130,7 +103,7 @@
                     </pic:cNvPicPr>
                   </pic:nvPicPr>
                   <pic:blipFill>
-                    <a:blip r:embed="rId2"/>
+                    <a:blip r:embed="rId5"/>
                     <a:stretch>
                       <a:fillRect/>
                     </a:stretch>
@@ -155,408 +128,270 @@
     <w:p>
       <w:pPr>
         <w:pStyle w:val="Heading1"/>
-        <w:rPr/>
-      </w:pPr>
-      <w:r>
-        <w:rPr/>
+      </w:pPr>
+      <w:r>
         <w:t>GoF Participants</w:t>
       </w:r>
     </w:p>
     <w:p>
-      <w:pPr>
-        <w:pStyle w:val="Normal"/>
-        <w:rPr/>
-      </w:pPr>
-      <w:r>
-        <w:rPr/>
+      <w:r>
         <w:t>Composite Design Pattern:</w:t>
       </w:r>
     </w:p>
     <w:p>
       <w:pPr>
-        <w:pStyle w:val="Normal"/>
         <w:numPr>
           <w:ilvl w:val="0"/>
           <w:numId w:val="3"/>
         </w:numPr>
-        <w:rPr/>
-      </w:pPr>
-      <w:r>
-        <w:rPr/>
+      </w:pPr>
+      <w:r>
         <w:t xml:space="preserve">Component – ProductionComponent </w:t>
       </w:r>
     </w:p>
     <w:p>
       <w:pPr>
-        <w:pStyle w:val="Normal"/>
         <w:numPr>
           <w:ilvl w:val="0"/>
           <w:numId w:val="2"/>
         </w:numPr>
-        <w:rPr/>
-      </w:pPr>
-      <w:r>
-        <w:rPr/>
+      </w:pPr>
+      <w:r>
+        <w:lastRenderedPageBreak/>
         <w:t xml:space="preserve">Composite – ProductionGroup </w:t>
       </w:r>
     </w:p>
     <w:p>
       <w:pPr>
-        <w:pStyle w:val="Normal"/>
         <w:numPr>
           <w:ilvl w:val="0"/>
           <w:numId w:val="2"/>
         </w:numPr>
-        <w:rPr/>
-      </w:pPr>
-      <w:r>
-        <w:rPr/>
+      </w:pPr>
+      <w:r>
         <w:t>Leaf – Production</w:t>
       </w:r>
     </w:p>
-    <w:p>
-      <w:pPr>
-        <w:pStyle w:val="Normal"/>
-        <w:rPr/>
-      </w:pPr>
-      <w:r>
-        <w:rPr/>
-      </w:r>
-    </w:p>
-    <w:p>
-      <w:pPr>
-        <w:pStyle w:val="Normal"/>
-        <w:rPr/>
-      </w:pPr>
-      <w:r>
-        <w:rPr/>
+    <w:p/>
+    <w:p>
+      <w:r>
         <w:t>State Design Pattern:</w:t>
       </w:r>
     </w:p>
     <w:p>
       <w:pPr>
-        <w:pStyle w:val="Normal"/>
         <w:numPr>
           <w:ilvl w:val="0"/>
           <w:numId w:val="3"/>
         </w:numPr>
-        <w:rPr/>
-      </w:pPr>
-      <w:r>
-        <w:rPr/>
+      </w:pPr>
+      <w:r>
         <w:t xml:space="preserve">Context – Production </w:t>
       </w:r>
     </w:p>
     <w:p>
       <w:pPr>
-        <w:pStyle w:val="Normal"/>
         <w:numPr>
           <w:ilvl w:val="0"/>
           <w:numId w:val="4"/>
         </w:numPr>
-        <w:rPr/>
-      </w:pPr>
-      <w:r>
-        <w:rPr/>
+      </w:pPr>
+      <w:r>
         <w:t xml:space="preserve">State – ProductionState </w:t>
       </w:r>
     </w:p>
     <w:p>
       <w:pPr>
-        <w:pStyle w:val="Normal"/>
         <w:numPr>
           <w:ilvl w:val="0"/>
           <w:numId w:val="4"/>
         </w:numPr>
-        <w:rPr/>
-      </w:pPr>
-      <w:r>
-        <w:rPr/>
+      </w:pPr>
+      <w:r>
         <w:t>Concrete States – Planning, Filming, Editing, Released</w:t>
       </w:r>
     </w:p>
-    <w:p>
-      <w:pPr>
-        <w:pStyle w:val="Normal"/>
-        <w:rPr/>
-      </w:pPr>
-      <w:r>
-        <w:rPr/>
-      </w:r>
-    </w:p>
-    <w:p>
-      <w:pPr>
-        <w:pStyle w:val="Normal"/>
-        <w:rPr/>
-      </w:pPr>
-      <w:r>
-        <w:rPr/>
+    <w:p/>
+    <w:p>
+      <w:r>
         <w:t>Decorator Design Pattern:</w:t>
       </w:r>
     </w:p>
     <w:p>
       <w:pPr>
-        <w:pStyle w:val="Normal"/>
         <w:numPr>
           <w:ilvl w:val="0"/>
           <w:numId w:val="3"/>
         </w:numPr>
-        <w:rPr/>
-      </w:pPr>
-      <w:r>
-        <w:rPr/>
+      </w:pPr>
+      <w:r>
         <w:t>Component –  ProductionComponent</w:t>
       </w:r>
     </w:p>
     <w:p>
       <w:pPr>
-        <w:pStyle w:val="Normal"/>
         <w:numPr>
           <w:ilvl w:val="0"/>
           <w:numId w:val="3"/>
         </w:numPr>
-        <w:rPr/>
-      </w:pPr>
-      <w:r>
-        <w:rPr/>
+      </w:pPr>
+      <w:r>
         <w:t>Concrete Component – Production</w:t>
       </w:r>
     </w:p>
     <w:p>
       <w:pPr>
-        <w:pStyle w:val="Normal"/>
         <w:numPr>
           <w:ilvl w:val="0"/>
           <w:numId w:val="5"/>
         </w:numPr>
-        <w:rPr/>
-      </w:pPr>
-      <w:r>
-        <w:rPr/>
+      </w:pPr>
+      <w:r>
         <w:t>Decorator –  AvailableDecorator</w:t>
       </w:r>
     </w:p>
     <w:p>
       <w:pPr>
-        <w:pStyle w:val="Normal"/>
         <w:numPr>
           <w:ilvl w:val="0"/>
           <w:numId w:val="5"/>
         </w:numPr>
-        <w:rPr/>
-      </w:pPr>
-      <w:r>
-        <w:rPr/>
+      </w:pPr>
+      <w:r>
         <w:t>Concrete Decorators – TheatricalDecorator, PlatformDecorator</w:t>
       </w:r>
     </w:p>
-    <w:p>
-      <w:pPr>
-        <w:pStyle w:val="Normal"/>
-        <w:rPr/>
-      </w:pPr>
-      <w:r>
-        <w:rPr/>
-      </w:r>
-    </w:p>
-    <w:p>
-      <w:pPr>
-        <w:pStyle w:val="Normal"/>
-        <w:rPr/>
-      </w:pPr>
-      <w:r>
-        <w:rPr/>
+    <w:p/>
+    <w:p>
+      <w:r>
         <w:t>Iterator Design Pattern:</w:t>
       </w:r>
     </w:p>
     <w:p>
       <w:pPr>
-        <w:pStyle w:val="Normal"/>
         <w:numPr>
           <w:ilvl w:val="0"/>
           <w:numId w:val="3"/>
         </w:numPr>
-        <w:rPr/>
-      </w:pPr>
-      <w:r>
-        <w:rPr/>
+      </w:pPr>
+      <w:r>
         <w:t>Iterator – Iterator</w:t>
       </w:r>
     </w:p>
     <w:p>
       <w:pPr>
-        <w:pStyle w:val="Normal"/>
         <w:numPr>
           <w:ilvl w:val="0"/>
           <w:numId w:val="3"/>
         </w:numPr>
-        <w:rPr/>
-      </w:pPr>
-      <w:r>
-        <w:rPr/>
+      </w:pPr>
+      <w:r>
         <w:t>Concrete Iterators – FullTraversalIterator, StateIterator</w:t>
       </w:r>
     </w:p>
     <w:p>
       <w:pPr>
-        <w:pStyle w:val="Normal"/>
         <w:numPr>
           <w:ilvl w:val="0"/>
           <w:numId w:val="3"/>
         </w:numPr>
-        <w:rPr/>
-      </w:pPr>
-      <w:r>
-        <w:rPr/>
+      </w:pPr>
+      <w:r>
         <w:t>Aggregate –  ProductionComponent</w:t>
       </w:r>
     </w:p>
     <w:p>
       <w:pPr>
-        <w:pStyle w:val="Normal"/>
         <w:numPr>
           <w:ilvl w:val="0"/>
           <w:numId w:val="6"/>
         </w:numPr>
-        <w:rPr/>
-      </w:pPr>
-      <w:r>
-        <w:rPr/>
+      </w:pPr>
+      <w:r>
         <w:t>Concrete Aggregates –  ProductionGroup</w:t>
       </w:r>
     </w:p>
-    <w:p>
-      <w:pPr>
-        <w:pStyle w:val="Normal"/>
-        <w:rPr/>
-      </w:pPr>
-      <w:r>
-        <w:rPr/>
-      </w:r>
-    </w:p>
+    <w:p/>
     <w:p>
       <w:pPr>
         <w:pStyle w:val="Heading1"/>
-        <w:rPr/>
-      </w:pPr>
-      <w:r>
-        <w:rPr/>
+      </w:pPr>
+      <w:r>
         <w:t>Design and Ownership Rationale:</w:t>
+      </w:r>
+      <w:r>
         <w:br/>
       </w:r>
     </w:p>
     <w:p>
-      <w:pPr>
-        <w:pStyle w:val="Normal"/>
-        <w:rPr/>
-      </w:pPr>
-      <w:r>
-        <w:rPr/>
-        <w:t>ProductionGroup owns its children by raw pointer in a std::vector&lt;ProductionComponent*&gt; and deletes each one in its destructor, so destroying a group cleanly cascades through its whole subtree. removeChild() deliberately hands ownership back to the caller rather than deleting internally, which is what lets main.cpp relocate or delete a node explicitly, satisfying the requirement for a meaningful structural change at runtime. Both Production (leaf) and ProductionGroup (composite) inherit from ProductionComponent, which declares getDevelopmentCost(), display(), getProgress(), and createIterator() as shared behaviour, so client code and decorators can treat a single production and an entire group identically without ever checking which one they're holding.</w:t>
-      </w:r>
-    </w:p>
-    <w:p>
-      <w:pPr>
-        <w:pStyle w:val="Normal"/>
-        <w:rPr/>
-      </w:pPr>
-      <w:r>
-        <w:rPr/>
+      <w:r>
+        <w:t xml:space="preserve">ProductionGroup owns its children by raw pointer in a std::vector&lt;ProductionComponent*&gt; and deletes each one in its destructor, so destroying a group cleanly cascades through its whole subtree. removeChild() deliberately hands ownership back to the caller rather than deleting internally, which is what lets main.cpp relocate or delete a node explicitly, satisfying the requirement for a meaningful structural change at runtime. Both Production (leaf) and ProductionGroup (composite) inherit from ProductionComponent, which declares </w:t>
+      </w:r>
+      <w:r>
+        <w:lastRenderedPageBreak/>
+        <w:t>getDevelopmentCost(), display(), getProgress(), and createIterator() as shared behaviour, so client code and decorators can treat a single production and an entire group identically without ever checking which one they're holding.</w:t>
+      </w:r>
+    </w:p>
+    <w:p>
+      <w:r>
         <w:t>AvailableDecorator also owns what it wraps, holding a ProductionComponent* and deleting it in its own destructor. This means a whole chain of stacked decorators, such as two PlatformDecorators wrapped around one Production, is destroyed correctly just by deleting the outermost layer, and a fully decorated object can be dropped straight into a group's children vector with no special handling needed for cleanup.</w:t>
       </w:r>
     </w:p>
     <w:p>
-      <w:pPr>
-        <w:pStyle w:val="Normal"/>
-        <w:rPr/>
-      </w:pPr>
-      <w:r>
-        <w:rPr/>
+      <w:r>
         <w:t>Production owns a single ProductionState*, replacing it through setState(), which deletes the old state before assigning the new one. States are stateless data-wise, encoding only behaviour, so a fresh object is created on each transition rather than reusing shared instances, a simpler choice for a system this size.</w:t>
       </w:r>
     </w:p>
     <w:p>
-      <w:pPr>
-        <w:pStyle w:val="Normal"/>
-        <w:rPr/>
-      </w:pPr>
-      <w:r>
-        <w:rPr/>
+      <w:r>
         <w:t>FullTraversalIterator and StateIterator both implement the same Iterator interface but serve different purposes, one lists the entire hierarchy and the other filters leaves by lifecycle state. Both are snapshot iterators, collecting their results once at construction through a private collect() method, and both are declared friends of ProductionGroup so they can walk its private children vector directly without that vector ever being exposed to client code.</w:t>
       </w:r>
     </w:p>
     <w:p>
-      <w:pPr>
-        <w:pStyle w:val="Normal"/>
-        <w:rPr/>
-      </w:pPr>
-      <w:r>
-        <w:rPr/>
+      <w:r>
         <w:t>The main design challenge was making these four patterns cooperate rather than function as separate demos. Since a Production can be wrapped in decorators while sitting inside a composite tree, AvailableDecorator delegates every ProductionComponent method to the component it wraps, so decorated and undecorated productions remain fully interchangeable, and traversal, state, and cost calculations all keep working correctly no matter how many decorator layers are present.</w:t>
       </w:r>
     </w:p>
     <w:p>
       <w:pPr>
-        <w:pStyle w:val="Normal"/>
-        <w:spacing w:lineRule="auto" w:line="240" w:before="0" w:after="0"/>
+        <w:spacing w:after="0" w:line="240" w:lineRule="auto"/>
         <w:rPr>
-          <w:rFonts w:ascii="Aptos Display" w:hAnsi="Aptos Display" w:eastAsia="" w:cs="" w:asciiTheme="majorHAnsi" w:cstheme="majorBidi" w:eastAsiaTheme="majorEastAsia" w:hAnsiTheme="majorHAnsi"/>
-          <w:color w:themeColor="accent1" w:themeShade="bf" w:val="0F4761"/>
+          <w:rFonts w:asciiTheme="majorHAnsi" w:eastAsiaTheme="majorEastAsia" w:hAnsiTheme="majorHAnsi" w:cstheme="majorBidi"/>
+          <w:color w:val="0F4761" w:themeColor="accent1" w:themeShade="BF"/>
           <w:sz w:val="40"/>
           <w:szCs w:val="40"/>
         </w:rPr>
       </w:pPr>
       <w:r>
+        <w:br w:type="page"/>
+      </w:r>
+    </w:p>
+    <w:p>
+      <w:pPr>
+        <w:pStyle w:val="Heading1"/>
+        <w:spacing w:before="0"/>
+      </w:pPr>
+      <w:r>
+        <w:lastRenderedPageBreak/>
+        <w:t>Diagrams</w:t>
+      </w:r>
+    </w:p>
+    <w:p/>
+    <w:p>
+      <w:pPr>
+        <w:pStyle w:val="Heading2"/>
+      </w:pPr>
+      <w:r>
+        <w:t>Object Diagram:</w:t>
+      </w:r>
+    </w:p>
+    <w:p>
+      <w:r>
         <w:rPr>
-          <w:rFonts w:eastAsia="" w:cs="" w:cstheme="majorBidi" w:eastAsiaTheme="majorEastAsia" w:ascii="Aptos Display" w:hAnsi="Aptos Display"/>
-          <w:color w:themeColor="accent1" w:themeShade="bf" w:val="0F4761"/>
-          <w:sz w:val="40"/>
-          <w:szCs w:val="40"/>
+          <w:noProof/>
         </w:rPr>
-      </w:r>
-      <w:r>
-        <w:br w:type="page"/>
-      </w:r>
-    </w:p>
-    <w:p>
-      <w:pPr>
-        <w:pStyle w:val="Heading1"/>
-        <w:spacing w:before="0" w:after="80"/>
-        <w:rPr/>
-      </w:pPr>
-      <w:r>
-        <w:rPr/>
-        <w:t>Diagrams</w:t>
-      </w:r>
-    </w:p>
-    <w:p>
-      <w:pPr>
-        <w:pStyle w:val="Normal"/>
-        <w:rPr/>
-      </w:pPr>
-      <w:r>
-        <w:rPr/>
-      </w:r>
-    </w:p>
-    <w:p>
-      <w:pPr>
-        <w:pStyle w:val="Heading2"/>
-        <w:rPr/>
-      </w:pPr>
-      <w:r>
-        <w:rPr/>
-        <w:t>Object Diagram:</w:t>
-      </w:r>
-    </w:p>
-    <w:p>
-      <w:pPr>
-        <w:pStyle w:val="Normal"/>
-        <w:rPr/>
-      </w:pPr>
-      <w:r>
-        <w:rPr/>
         <w:drawing>
-          <wp:inline distT="0" distB="0" distL="0" distR="0">
+          <wp:inline distT="0" distB="0" distL="0" distR="0" wp14:anchorId="73763047" wp14:editId="73763048">
             <wp:extent cx="5731510" cy="2792095"/>
             <wp:effectExtent l="0" t="0" r="0" b="0"/>
             <wp:docPr id="2" name="Image2"/>
@@ -573,7 +408,7 @@
                     </pic:cNvPicPr>
                   </pic:nvPicPr>
                   <pic:blipFill>
-                    <a:blip r:embed="rId3"/>
+                    <a:blip r:embed="rId6"/>
                     <a:stretch>
                       <a:fillRect/>
                     </a:stretch>
@@ -595,34 +430,22 @@
         </w:drawing>
       </w:r>
     </w:p>
-    <w:p>
-      <w:pPr>
-        <w:pStyle w:val="Normal"/>
-        <w:rPr/>
-      </w:pPr>
-      <w:r>
-        <w:rPr/>
-      </w:r>
-    </w:p>
+    <w:p/>
     <w:p>
       <w:pPr>
         <w:pStyle w:val="Heading2"/>
-        <w:rPr/>
-      </w:pPr>
-      <w:r>
-        <w:rPr/>
+      </w:pPr>
+      <w:r>
         <w:t xml:space="preserve">State Diagram: </w:t>
       </w:r>
     </w:p>
     <w:p>
-      <w:pPr>
-        <w:pStyle w:val="Normal"/>
-        <w:rPr/>
-      </w:pPr>
-      <w:r>
-        <w:rPr/>
+      <w:r>
+        <w:rPr>
+          <w:noProof/>
+        </w:rPr>
         <w:drawing>
-          <wp:inline distT="0" distB="0" distL="0" distR="0">
+          <wp:inline distT="0" distB="0" distL="0" distR="0" wp14:anchorId="73763049" wp14:editId="7376304A">
             <wp:extent cx="4076700" cy="4216400"/>
             <wp:effectExtent l="0" t="0" r="0" b="0"/>
             <wp:docPr id="3" name="Image3"/>
@@ -639,7 +462,7 @@
                     </pic:cNvPicPr>
                   </pic:nvPicPr>
                   <pic:blipFill>
-                    <a:blip r:embed="rId4"/>
+                    <a:blip r:embed="rId7"/>
                     <a:stretch>
                       <a:fillRect/>
                     </a:stretch>
@@ -664,29 +487,31 @@
     <w:p>
       <w:pPr>
         <w:pStyle w:val="Heading2"/>
-        <w:rPr/>
-      </w:pPr>
-      <w:r>
-        <w:rPr/>
+      </w:pPr>
+      <w:r>
+        <w:lastRenderedPageBreak/>
         <w:br/>
       </w:r>
     </w:p>
     <w:p>
-      <w:pPr>
-        <w:pStyle w:val="Normal"/>
-        <w:rPr/>
-      </w:pPr>
       <w:r>
         <w:rPr>
           <w:rStyle w:val="Heading2Char"/>
         </w:rPr>
         <w:t>Traversal Activity Diagram:</w:t>
+      </w:r>
+      <w:r>
+        <w:rPr>
+          <w:rStyle w:val="Heading2Char"/>
+        </w:rPr>
         <w:br/>
       </w:r>
       <w:r>
-        <w:rPr/>
+        <w:rPr>
+          <w:noProof/>
+        </w:rPr>
         <w:drawing>
-          <wp:inline distT="0" distB="0" distL="0" distR="0">
+          <wp:inline distT="0" distB="0" distL="0" distR="0" wp14:anchorId="7376304B" wp14:editId="7376304C">
             <wp:extent cx="5731510" cy="6742430"/>
             <wp:effectExtent l="0" t="0" r="0" b="0"/>
             <wp:docPr id="4" name="Image4"/>
@@ -703,7 +528,7 @@
                     </pic:cNvPicPr>
                   </pic:nvPicPr>
                   <pic:blipFill>
-                    <a:blip r:embed="rId5"/>
+                    <a:blip r:embed="rId8"/>
                     <a:stretch>
                       <a:fillRect/>
                     </a:stretch>
@@ -725,24 +550,18 @@
         </w:drawing>
       </w:r>
       <w:r>
-        <w:rPr/>
         <w:br/>
       </w:r>
     </w:p>
     <w:p>
       <w:pPr>
-        <w:pStyle w:val="Normal"/>
         <w:rPr>
           <w:rStyle w:val="Heading2Char"/>
         </w:rPr>
       </w:pPr>
-      <w:r>
-        <w:rPr/>
-      </w:r>
-    </w:p>
-    <w:p>
-      <w:pPr>
-        <w:pStyle w:val="Normal"/>
+    </w:p>
+    <w:p>
+      <w:pPr>
         <w:rPr>
           <w:rStyle w:val="Heading2Char"/>
         </w:rPr>
@@ -756,18 +575,20 @@
     </w:p>
     <w:p>
       <w:pPr>
-        <w:pStyle w:val="Normal"/>
         <w:rPr>
           <w:rStyle w:val="Heading2Char"/>
         </w:rPr>
       </w:pPr>
       <w:r>
-        <w:rPr/>
+        <w:rPr>
+          <w:rStyle w:val="Heading2Char"/>
+        </w:rPr>
+        <w:lastRenderedPageBreak/>
         <w:drawing>
-          <wp:inline distT="0" distB="0" distL="0" distR="0">
-            <wp:extent cx="4349750" cy="4262120"/>
+          <wp:inline distT="0" distB="0" distL="0" distR="0" wp14:anchorId="68A00D88" wp14:editId="5F340F38">
+            <wp:extent cx="4591286" cy="4292821"/>
             <wp:effectExtent l="0" t="0" r="0" b="0"/>
-            <wp:docPr id="5" name="Picture 3"/>
+            <wp:docPr id="2018024990" name="Picture 1"/>
             <wp:cNvGraphicFramePr>
               <a:graphicFrameLocks xmlns:a="http://schemas.openxmlformats.org/drawingml/2006/main" noChangeAspect="1"/>
             </wp:cNvGraphicFramePr>
@@ -775,26 +596,23 @@
               <a:graphicData uri="http://schemas.openxmlformats.org/drawingml/2006/picture">
                 <pic:pic xmlns:pic="http://schemas.openxmlformats.org/drawingml/2006/picture">
                   <pic:nvPicPr>
-                    <pic:cNvPr id="5" name="Picture 3"/>
-                    <pic:cNvPicPr>
-                      <a:picLocks noChangeAspect="1" noChangeArrowheads="1"/>
-                    </pic:cNvPicPr>
+                    <pic:cNvPr id="2018024990" name=""/>
+                    <pic:cNvPicPr/>
                   </pic:nvPicPr>
                   <pic:blipFill>
-                    <a:blip r:embed="rId6"/>
+                    <a:blip r:embed="rId9"/>
                     <a:stretch>
                       <a:fillRect/>
                     </a:stretch>
                   </pic:blipFill>
-                  <pic:spPr bwMode="auto">
+                  <pic:spPr>
                     <a:xfrm>
                       <a:off x="0" y="0"/>
-                      <a:ext cx="4349750" cy="4262120"/>
+                      <a:ext cx="4591286" cy="4292821"/>
                     </a:xfrm>
                     <a:prstGeom prst="rect">
                       <a:avLst/>
                     </a:prstGeom>
-                    <a:noFill/>
                   </pic:spPr>
                 </pic:pic>
               </a:graphicData>
@@ -803,84 +621,51 @@
         </w:drawing>
       </w:r>
     </w:p>
-    <w:p>
-      <w:pPr>
-        <w:pStyle w:val="Normal"/>
-        <w:rPr/>
-      </w:pPr>
-      <w:r>
-        <w:rPr/>
-      </w:r>
-    </w:p>
+    <w:p/>
     <w:p>
       <w:pPr>
         <w:pStyle w:val="Heading1"/>
-        <w:rPr/>
-      </w:pPr>
-      <w:r>
-        <w:rPr/>
+      </w:pPr>
+      <w:r>
         <w:t>Traversal Modification Policy</w:t>
       </w:r>
     </w:p>
     <w:p>
-      <w:pPr>
-        <w:pStyle w:val="Normal"/>
-        <w:rPr/>
-      </w:pPr>
-      <w:r>
-        <w:rPr/>
+      <w:r>
         <w:t>Our iterators use a snapshot approach rather than a live one. When FullTraversalIterator or StateIterator is created, its collect() method walks the entire composite tree once, right at construction, and copies pointers to the relevant components into its own internal vector. From that point on, first(), next(), isDone(), and currentItem() only ever look at this internal copy, never the live tree again.</w:t>
       </w:r>
     </w:p>
     <w:p>
-      <w:pPr>
-        <w:pStyle w:val="Normal"/>
-        <w:rPr/>
-      </w:pPr>
-      <w:r>
-        <w:rPr/>
+      <w:r>
         <w:t>This means once an iterator exists, it's frozen in time. If you add a child with addChild() or remove one with removeChild() after the iterator was created, that change simply won't show up in the iterator's results, it'll keep returning whatever it originally collected.</w:t>
       </w:r>
     </w:p>
     <w:p>
-      <w:pPr>
-        <w:pStyle w:val="Normal"/>
-        <w:rPr/>
-      </w:pPr>
-      <w:r>
-        <w:rPr/>
+      <w:r>
         <w:t>We chose this deliberately over a live traversal. A live traversal that kept reading directly from ProductionGroup's children vector would be vulnerable to the classic problem of modifying a container while iterating over it, especially risky in our case since main.cpp deletes removed nodes immediately after calling removeChild(). Snapshotting sidesteps that risk entirely, since the iterator's own vector is separate from the live tree, so deleting a node from the tree can't invalidate an iterator that's already finished collecting.</w:t>
       </w:r>
     </w:p>
     <w:p>
-      <w:pPr>
-        <w:pStyle w:val="Normal"/>
-        <w:rPr/>
-      </w:pPr>
-      <w:r>
-        <w:rPr/>
+      <w:r>
+        <w:lastRenderedPageBreak/>
         <w:t>This approach also lets two independent traversals run over the same hierarchy at once without stepping on each other. In main.cpp, we create a full traversal and a state-filtered traversal one after another from the same root, and each one works from its own private snapshot, so neither interferes with the other or with the underlying tree.</w:t>
       </w:r>
     </w:p>
     <w:p>
       <w:pPr>
         <w:pStyle w:val="Heading1"/>
-        <w:rPr/>
-      </w:pPr>
-      <w:r>
-        <w:rPr/>
+      </w:pPr>
+      <w:r>
         <w:t>GDB and Valgrind</w:t>
       </w:r>
     </w:p>
     <w:p>
-      <w:pPr>
-        <w:pStyle w:val="Normal"/>
-        <w:rPr/>
-      </w:pPr>
-      <w:r>
-        <w:rPr/>
+      <w:r>
+        <w:rPr>
+          <w:noProof/>
+        </w:rPr>
         <w:drawing>
-          <wp:inline distT="0" distB="0" distL="0" distR="0">
+          <wp:inline distT="0" distB="0" distL="0" distR="0" wp14:anchorId="7376304F" wp14:editId="73763050">
             <wp:extent cx="5724525" cy="1514475"/>
             <wp:effectExtent l="0" t="0" r="0" b="0"/>
             <wp:docPr id="6" name="Image5"/>
@@ -897,7 +682,7 @@
                     </pic:cNvPicPr>
                   </pic:nvPicPr>
                   <pic:blipFill>
-                    <a:blip r:embed="rId7"/>
+                    <a:blip r:embed="rId10"/>
                     <a:stretch>
                       <a:fillRect/>
                     </a:stretch>
@@ -920,14 +705,12 @@
       </w:r>
     </w:p>
     <w:p>
-      <w:pPr>
-        <w:pStyle w:val="Normal"/>
-        <w:rPr/>
-      </w:pPr>
-      <w:r>
-        <w:rPr/>
+      <w:r>
+        <w:rPr>
+          <w:noProof/>
+        </w:rPr>
         <w:drawing>
-          <wp:inline distT="0" distB="0" distL="0" distR="0">
+          <wp:inline distT="0" distB="0" distL="0" distR="0" wp14:anchorId="73763051" wp14:editId="73763052">
             <wp:extent cx="5724525" cy="2571750"/>
             <wp:effectExtent l="0" t="0" r="0" b="0"/>
             <wp:docPr id="7" name="Picture 2"/>
@@ -944,7 +727,7 @@
                     </pic:cNvPicPr>
                   </pic:nvPicPr>
                   <pic:blipFill>
-                    <a:blip r:embed="rId8"/>
+                    <a:blip r:embed="rId11"/>
                     <a:stretch>
                       <a:fillRect/>
                     </a:stretch>
@@ -966,48 +749,28 @@
         </w:drawing>
       </w:r>
       <w:r>
-        <w:rPr/>
         <w:t>Problem: the program crashes with a segmentation fault shortly after removing "The Force Awakens" from the movies group, specifically when trying to print the removed production's name.</w:t>
       </w:r>
     </w:p>
     <w:p>
-      <w:pPr>
-        <w:pStyle w:val="Normal"/>
-        <w:rPr/>
-      </w:pPr>
-      <w:r>
-        <w:rPr/>
+      <w:r>
         <w:t>Cause: ProductionGroup::removeChild() both erased the child from the children vector and called delete removedChild; on it, before returning the same now-dangling pointer to the caller. main.cpp then used that returned pointer, first reading removed-&gt;getName(), and intended to delete removed; afterwards, unaware the object had already been destroyed inside removeChild(). This violated the intended ownership contract, removeChild() was meant to only detach the child and transfer ownership to the caller, never destroy it itself.</w:t>
       </w:r>
     </w:p>
-    <w:p>
-      <w:pPr>
-        <w:pStyle w:val="Normal"/>
-        <w:rPr/>
-      </w:pPr>
-      <w:r>
-        <w:rPr/>
-      </w:r>
-    </w:p>
-    <w:p>
-      <w:pPr>
-        <w:pStyle w:val="Normal"/>
-        <w:rPr/>
-      </w:pPr>
-      <w:r>
-        <w:rPr/>
+    <w:p/>
+    <w:p>
+      <w:r>
         <w:t>Final Valgrind evidence:</w:t>
       </w:r>
     </w:p>
     <w:p>
-      <w:pPr>
-        <w:pStyle w:val="Normal"/>
-        <w:rPr/>
-      </w:pPr>
-      <w:r>
-        <w:rPr/>
+      <w:r>
+        <w:rPr>
+          <w:noProof/>
+        </w:rPr>
+        <w:lastRenderedPageBreak/>
         <w:drawing>
-          <wp:anchor distT="0" distB="0" distL="0" distR="0" simplePos="0" relativeHeight="13" behindDoc="0" locked="0" layoutInCell="0" allowOverlap="1">
+          <wp:anchor distT="0" distB="0" distL="0" distR="0" simplePos="0" relativeHeight="13" behindDoc="0" locked="0" layoutInCell="0" allowOverlap="1" wp14:anchorId="73763053" wp14:editId="73763054">
             <wp:simplePos x="0" y="0"/>
             <wp:positionH relativeFrom="column">
               <wp:align>center</wp:align>
@@ -1032,7 +795,7 @@
                     </pic:cNvPicPr>
                   </pic:nvPicPr>
                   <pic:blipFill>
-                    <a:blip r:embed="rId9"/>
+                    <a:blip r:embed="rId12"/>
                     <a:stretch>
                       <a:fillRect/>
                     </a:stretch>
@@ -1057,19 +820,13 @@
     <w:p>
       <w:pPr>
         <w:pStyle w:val="Heading1"/>
-        <w:rPr/>
-      </w:pPr>
-      <w:r>
-        <w:rPr/>
+      </w:pPr>
+      <w:r>
         <w:t>GitHub</w:t>
       </w:r>
     </w:p>
     <w:p>
-      <w:pPr>
-        <w:pStyle w:val="Normal"/>
-        <w:rPr/>
-      </w:pPr>
-      <w:hyperlink r:id="rId10">
+      <w:hyperlink r:id="rId13">
         <w:r>
           <w:rPr>
             <w:rStyle w:val="Hyperlink"/>
@@ -1081,52 +838,27 @@
     <w:p>
       <w:pPr>
         <w:pStyle w:val="Heading1"/>
-        <w:rPr/>
-      </w:pPr>
-      <w:r>
-        <w:rPr/>
+      </w:pPr>
+      <w:r>
         <w:t>Contributions</w:t>
       </w:r>
     </w:p>
     <w:p>
-      <w:pPr>
-        <w:pStyle w:val="Normal"/>
-        <w:rPr/>
-      </w:pPr>
-      <w:r>
-        <w:rPr/>
+      <w:r>
         <w:t>Each team member participated in group meeting to discuss the practical and overall design.</w:t>
       </w:r>
     </w:p>
     <w:p>
-      <w:pPr>
-        <w:pStyle w:val="Normal"/>
-        <w:rPr/>
-      </w:pPr>
-      <w:r>
-        <w:rPr/>
+      <w:r>
         <w:t>Each member contributed at least one of the key classes (composite, iterator, decorator, etc) and fully implemented them.</w:t>
       </w:r>
     </w:p>
     <w:p>
-      <w:pPr>
-        <w:pStyle w:val="Normal"/>
-        <w:rPr/>
-      </w:pPr>
-      <w:r>
-        <w:rPr/>
+      <w:r>
         <w:t>Each member also completed at least 2 of the 6 diagrams required.</w:t>
       </w:r>
     </w:p>
-    <w:p>
-      <w:pPr>
-        <w:pStyle w:val="Normal"/>
-        <w:rPr/>
-      </w:pPr>
-      <w:r>
-        <w:rPr/>
-      </w:r>
-    </w:p>
+    <w:p/>
     <w:p>
       <w:pPr>
         <w:pStyle w:val="ListParagraph"/>
@@ -1134,24 +866,19 @@
           <w:ilvl w:val="0"/>
           <w:numId w:val="1"/>
         </w:numPr>
-        <w:rPr/>
-      </w:pPr>
-      <w:r>
-        <w:rPr/>
+      </w:pPr>
+      <w:r>
         <w:t>Katlego Sentsho: Composite, State Diagram, Activity Diagram, PDF work</w:t>
       </w:r>
     </w:p>
     <w:p>
       <w:pPr>
-        <w:pStyle w:val="Normal"/>
         <w:numPr>
           <w:ilvl w:val="0"/>
           <w:numId w:val="1"/>
         </w:numPr>
-        <w:rPr/>
-      </w:pPr>
-      <w:r>
-        <w:rPr/>
+      </w:pPr>
+      <w:r>
         <w:t>Kyle Pillay: Iterator, Object Diagram, State Diagram, PDF work</w:t>
       </w:r>
     </w:p>
@@ -1162,32 +889,27 @@
           <w:ilvl w:val="0"/>
           <w:numId w:val="1"/>
         </w:numPr>
-        <w:rPr/>
-      </w:pPr>
-      <w:r>
-        <w:rPr/>
+      </w:pPr>
+      <w:r>
         <w:t>Jonathan Witter: State, Decorator, UML Diagram, Activity Diagram, Docker, PDF work</w:t>
       </w:r>
     </w:p>
     <w:p>
       <w:pPr>
         <w:pStyle w:val="Heading1"/>
-        <w:rPr/>
-      </w:pPr>
-      <w:r>
-        <w:rPr/>
+      </w:pPr>
+      <w:r>
+        <w:lastRenderedPageBreak/>
         <w:t>Evidence:</w:t>
       </w:r>
     </w:p>
     <w:p>
-      <w:pPr>
-        <w:pStyle w:val="Normal"/>
-        <w:rPr/>
-      </w:pPr>
-      <w:r>
-        <w:rPr/>
+      <w:r>
+        <w:rPr>
+          <w:noProof/>
+        </w:rPr>
         <w:drawing>
-          <wp:inline distT="0" distB="0" distL="0" distR="0">
+          <wp:inline distT="0" distB="0" distL="0" distR="0" wp14:anchorId="73763055" wp14:editId="73763056">
             <wp:extent cx="5731510" cy="4781550"/>
             <wp:effectExtent l="0" t="0" r="0" b="0"/>
             <wp:docPr id="9" name="Image6"/>
@@ -1204,7 +926,7 @@
                     </pic:cNvPicPr>
                   </pic:nvPicPr>
                   <pic:blipFill>
-                    <a:blip r:embed="rId11"/>
+                    <a:blip r:embed="rId14"/>
                     <a:stretch>
                       <a:fillRect/>
                     </a:stretch>
@@ -1227,14 +949,12 @@
       </w:r>
     </w:p>
     <w:p>
-      <w:pPr>
-        <w:pStyle w:val="Normal"/>
-        <w:rPr/>
-      </w:pPr>
-      <w:r>
-        <w:rPr/>
+      <w:r>
+        <w:rPr>
+          <w:noProof/>
+        </w:rPr>
         <w:drawing>
-          <wp:inline distT="0" distB="0" distL="0" distR="0">
+          <wp:inline distT="0" distB="0" distL="0" distR="0" wp14:anchorId="73763057" wp14:editId="73763058">
             <wp:extent cx="5731510" cy="1842135"/>
             <wp:effectExtent l="0" t="0" r="0" b="0"/>
             <wp:docPr id="10" name="Image7"/>
@@ -1251,7 +971,7 @@
                     </pic:cNvPicPr>
                   </pic:nvPicPr>
                   <pic:blipFill>
-                    <a:blip r:embed="rId12"/>
+                    <a:blip r:embed="rId15"/>
                     <a:stretch>
                       <a:fillRect/>
                     </a:stretch>
@@ -1274,14 +994,13 @@
       </w:r>
     </w:p>
     <w:p>
-      <w:pPr>
-        <w:pStyle w:val="Normal"/>
-        <w:rPr/>
-      </w:pPr>
-      <w:r>
-        <w:rPr/>
+      <w:r>
+        <w:rPr>
+          <w:noProof/>
+        </w:rPr>
+        <w:lastRenderedPageBreak/>
         <w:drawing>
-          <wp:inline distT="0" distB="0" distL="0" distR="0">
+          <wp:inline distT="0" distB="0" distL="0" distR="0" wp14:anchorId="73763059" wp14:editId="7376305A">
             <wp:extent cx="5731510" cy="1568450"/>
             <wp:effectExtent l="0" t="0" r="0" b="0"/>
             <wp:docPr id="11" name="Image8"/>
@@ -1298,7 +1017,7 @@
                     </pic:cNvPicPr>
                   </pic:nvPicPr>
                   <pic:blipFill>
-                    <a:blip r:embed="rId13"/>
+                    <a:blip r:embed="rId16"/>
                     <a:stretch>
                       <a:fillRect/>
                     </a:stretch>
@@ -1321,19 +1040,12 @@
       </w:r>
     </w:p>
     <w:p>
-      <w:pPr>
-        <w:pStyle w:val="Normal"/>
-        <w:widowControl/>
-        <w:suppressAutoHyphens w:val="true"/>
-        <w:bidi w:val="0"/>
-        <w:spacing w:lineRule="auto" w:line="278" w:before="0" w:after="160"/>
-        <w:jc w:val="start"/>
-        <w:rPr/>
-      </w:pPr>
-      <w:r>
-        <w:rPr/>
+      <w:r>
+        <w:rPr>
+          <w:noProof/>
+        </w:rPr>
         <w:drawing>
-          <wp:inline distT="0" distB="0" distL="0" distR="0">
+          <wp:inline distT="0" distB="0" distL="0" distR="0" wp14:anchorId="7376305B" wp14:editId="7376305C">
             <wp:extent cx="3077210" cy="3991610"/>
             <wp:effectExtent l="0" t="0" r="0" b="0"/>
             <wp:docPr id="12" name="Image9"/>
@@ -1350,7 +1062,7 @@
                     </pic:cNvPicPr>
                   </pic:nvPicPr>
                   <pic:blipFill>
-                    <a:blip r:embed="rId14"/>
+                    <a:blip r:embed="rId17"/>
                     <a:stretch>
                       <a:fillRect/>
                     </a:stretch>
@@ -1373,31 +1085,312 @@
       </w:r>
     </w:p>
     <w:sectPr>
-      <w:type w:val="nextPage"/>
       <w:pgSz w:w="11906" w:h="16838"/>
-      <w:pgMar w:left="1440" w:right="1440" w:gutter="0" w:header="0" w:top="1440" w:footer="0" w:bottom="1440"/>
-      <w:pgNumType w:fmt="decimal"/>
-      <w:formProt w:val="false"/>
-      <w:textDirection w:val="lrTb"/>
-      <w:docGrid w:type="default" w:linePitch="360" w:charSpace="0"/>
+      <w:pgMar w:top="1440" w:right="1440" w:bottom="1440" w:left="1440" w:header="0" w:footer="0" w:gutter="0"/>
+      <w:cols w:space="720"/>
+      <w:formProt w:val="0"/>
+      <w:docGrid w:linePitch="360"/>
     </w:sectPr>
   </w:body>
 </w:document>
 </file>
 
 <file path=word/numbering.xml><?xml version="1.0" encoding="utf-8"?>
-<w:numbering xmlns:w="http://schemas.openxmlformats.org/wordprocessingml/2006/main" xmlns:o="urn:schemas-microsoft-com:office:office" xmlns:r="http://schemas.openxmlformats.org/officeDocument/2006/relationships" xmlns:v="urn:schemas-microsoft-com:vml" xmlns:mc="http://schemas.openxmlformats.org/markup-compatibility/2006" xmlns:w14="http://schemas.microsoft.com/office/word/2010/wordml" mc:Ignorable="w14">
-  <w:abstractNum w:abstractNumId="1">
+<w:numbering xmlns:wpc="http://schemas.microsoft.com/office/word/2010/wordprocessingCanvas" xmlns:cx="http://schemas.microsoft.com/office/drawing/2014/chartex" xmlns:cx1="http://schemas.microsoft.com/office/drawing/2015/9/8/chartex" xmlns:cx2="http://schemas.microsoft.com/office/drawing/2015/10/21/chartex" xmlns:cx3="http://schemas.microsoft.com/office/drawing/2016/5/9/chartex" xmlns:cx4="http://schemas.microsoft.com/office/drawing/2016/5/10/chartex" xmlns:cx5="http://schemas.microsoft.com/office/drawing/2016/5/11/chartex" xmlns:cx6="http://schemas.microsoft.com/office/drawing/2016/5/12/chartex" xmlns:cx7="http://schemas.microsoft.com/office/drawing/2016/5/13/chartex" xmlns:cx8="http://schemas.microsoft.com/office/drawing/2016/5/14/chartex" xmlns:mc="http://schemas.openxmlformats.org/markup-compatibility/2006" xmlns:aink="http://schemas.microsoft.com/office/drawing/2016/ink" xmlns:am3d="http://schemas.microsoft.com/office/drawing/2017/model3d" xmlns:o="urn:schemas-microsoft-com:office:office" xmlns:oel="http://schemas.microsoft.com/office/2019/extlst" xmlns:r="http://schemas.openxmlformats.org/officeDocument/2006/relationships" xmlns:m="http://schemas.openxmlformats.org/officeDocument/2006/math" xmlns:v="urn:schemas-microsoft-com:vml" xmlns:wp14="http://schemas.microsoft.com/office/word/2010/wordprocessingDrawing" xmlns:wp="http://schemas.openxmlformats.org/drawingml/2006/wordprocessingDrawing" xmlns:w10="urn:schemas-microsoft-com:office:word" xmlns:w="http://schemas.openxmlformats.org/wordprocessingml/2006/main" xmlns:w14="http://schemas.microsoft.com/office/word/2010/wordml" xmlns:w15="http://schemas.microsoft.com/office/word/2012/wordml" xmlns:w16cex="http://schemas.microsoft.com/office/word/2018/wordml/cex" xmlns:w16cid="http://schemas.microsoft.com/office/word/2016/wordml/cid" xmlns:w16="http://schemas.microsoft.com/office/word/2018/wordml" xmlns:w16du="http://schemas.microsoft.com/office/word/2023/wordml/word16du" xmlns:w16sdtdh="http://schemas.microsoft.com/office/word/2020/wordml/sdtdatahash" xmlns:w16sdtfl="http://schemas.microsoft.com/office/word/2024/wordml/sdtformatlock" xmlns:w16se="http://schemas.microsoft.com/office/word/2015/wordml/symex" xmlns:wpg="http://schemas.microsoft.com/office/word/2010/wordprocessingGroup" xmlns:wpi="http://schemas.microsoft.com/office/word/2010/wordprocessingInk" xmlns:wne="http://schemas.microsoft.com/office/word/2006/wordml" xmlns:wps="http://schemas.microsoft.com/office/word/2010/wordprocessingShape" mc:Ignorable="w14 w15 w16se w16cid w16 w16cex w16sdtdh w16sdtfl w16du wp14">
+  <w:abstractNum w:abstractNumId="0" w15:restartNumberingAfterBreak="0">
+    <w:nsid w:val="0B7A08B7"/>
+    <w:multiLevelType w:val="multilevel"/>
+    <w:tmpl w:val="E5662154"/>
     <w:lvl w:ilvl="0">
       <w:start w:val="1"/>
       <w:numFmt w:val="bullet"/>
       <w:lvlText w:val=""/>
-      <w:lvlJc w:val="start"/>
+      <w:lvlJc w:val="left"/>
+      <w:pPr>
+        <w:tabs>
+          <w:tab w:val="num" w:pos="720"/>
+        </w:tabs>
+        <w:ind w:left="720" w:hanging="360"/>
+      </w:pPr>
+      <w:rPr>
+        <w:rFonts w:ascii="Symbol" w:hAnsi="Symbol" w:cs="Symbol" w:hint="default"/>
+      </w:rPr>
+    </w:lvl>
+    <w:lvl w:ilvl="1">
+      <w:start w:val="1"/>
+      <w:numFmt w:val="bullet"/>
+      <w:lvlText w:val="◦"/>
+      <w:lvlJc w:val="left"/>
+      <w:pPr>
+        <w:tabs>
+          <w:tab w:val="num" w:pos="1080"/>
+        </w:tabs>
+        <w:ind w:left="1080" w:hanging="360"/>
+      </w:pPr>
+      <w:rPr>
+        <w:rFonts w:ascii="OpenSymbol" w:hAnsi="OpenSymbol" w:cs="OpenSymbol" w:hint="default"/>
+      </w:rPr>
+    </w:lvl>
+    <w:lvl w:ilvl="2">
+      <w:start w:val="1"/>
+      <w:numFmt w:val="bullet"/>
+      <w:lvlText w:val="▪"/>
+      <w:lvlJc w:val="left"/>
+      <w:pPr>
+        <w:tabs>
+          <w:tab w:val="num" w:pos="1440"/>
+        </w:tabs>
+        <w:ind w:left="1440" w:hanging="360"/>
+      </w:pPr>
+      <w:rPr>
+        <w:rFonts w:ascii="OpenSymbol" w:hAnsi="OpenSymbol" w:cs="OpenSymbol" w:hint="default"/>
+      </w:rPr>
+    </w:lvl>
+    <w:lvl w:ilvl="3">
+      <w:start w:val="1"/>
+      <w:numFmt w:val="bullet"/>
+      <w:lvlText w:val=""/>
+      <w:lvlJc w:val="left"/>
+      <w:pPr>
+        <w:tabs>
+          <w:tab w:val="num" w:pos="1800"/>
+        </w:tabs>
+        <w:ind w:left="1800" w:hanging="360"/>
+      </w:pPr>
+      <w:rPr>
+        <w:rFonts w:ascii="Symbol" w:hAnsi="Symbol" w:cs="Symbol" w:hint="default"/>
+      </w:rPr>
+    </w:lvl>
+    <w:lvl w:ilvl="4">
+      <w:start w:val="1"/>
+      <w:numFmt w:val="bullet"/>
+      <w:lvlText w:val="◦"/>
+      <w:lvlJc w:val="left"/>
+      <w:pPr>
+        <w:tabs>
+          <w:tab w:val="num" w:pos="2160"/>
+        </w:tabs>
+        <w:ind w:left="2160" w:hanging="360"/>
+      </w:pPr>
+      <w:rPr>
+        <w:rFonts w:ascii="OpenSymbol" w:hAnsi="OpenSymbol" w:cs="OpenSymbol" w:hint="default"/>
+      </w:rPr>
+    </w:lvl>
+    <w:lvl w:ilvl="5">
+      <w:start w:val="1"/>
+      <w:numFmt w:val="bullet"/>
+      <w:lvlText w:val="▪"/>
+      <w:lvlJc w:val="left"/>
+      <w:pPr>
+        <w:tabs>
+          <w:tab w:val="num" w:pos="2520"/>
+        </w:tabs>
+        <w:ind w:left="2520" w:hanging="360"/>
+      </w:pPr>
+      <w:rPr>
+        <w:rFonts w:ascii="OpenSymbol" w:hAnsi="OpenSymbol" w:cs="OpenSymbol" w:hint="default"/>
+      </w:rPr>
+    </w:lvl>
+    <w:lvl w:ilvl="6">
+      <w:start w:val="1"/>
+      <w:numFmt w:val="bullet"/>
+      <w:lvlText w:val=""/>
+      <w:lvlJc w:val="left"/>
+      <w:pPr>
+        <w:tabs>
+          <w:tab w:val="num" w:pos="2880"/>
+        </w:tabs>
+        <w:ind w:left="2880" w:hanging="360"/>
+      </w:pPr>
+      <w:rPr>
+        <w:rFonts w:ascii="Symbol" w:hAnsi="Symbol" w:cs="Symbol" w:hint="default"/>
+      </w:rPr>
+    </w:lvl>
+    <w:lvl w:ilvl="7">
+      <w:start w:val="1"/>
+      <w:numFmt w:val="bullet"/>
+      <w:lvlText w:val="◦"/>
+      <w:lvlJc w:val="left"/>
+      <w:pPr>
+        <w:tabs>
+          <w:tab w:val="num" w:pos="3240"/>
+        </w:tabs>
+        <w:ind w:left="3240" w:hanging="360"/>
+      </w:pPr>
+      <w:rPr>
+        <w:rFonts w:ascii="OpenSymbol" w:hAnsi="OpenSymbol" w:cs="OpenSymbol" w:hint="default"/>
+      </w:rPr>
+    </w:lvl>
+    <w:lvl w:ilvl="8">
+      <w:start w:val="1"/>
+      <w:numFmt w:val="bullet"/>
+      <w:lvlText w:val="▪"/>
+      <w:lvlJc w:val="left"/>
+      <w:pPr>
+        <w:tabs>
+          <w:tab w:val="num" w:pos="3600"/>
+        </w:tabs>
+        <w:ind w:left="3600" w:hanging="360"/>
+      </w:pPr>
+      <w:rPr>
+        <w:rFonts w:ascii="OpenSymbol" w:hAnsi="OpenSymbol" w:cs="OpenSymbol" w:hint="default"/>
+      </w:rPr>
+    </w:lvl>
+  </w:abstractNum>
+  <w:abstractNum w:abstractNumId="1" w15:restartNumberingAfterBreak="0">
+    <w:nsid w:val="1094281C"/>
+    <w:multiLevelType w:val="multilevel"/>
+    <w:tmpl w:val="E96EE116"/>
+    <w:lvl w:ilvl="0">
+      <w:start w:val="1"/>
+      <w:numFmt w:val="bullet"/>
+      <w:lvlText w:val=""/>
+      <w:lvlJc w:val="left"/>
+      <w:pPr>
+        <w:tabs>
+          <w:tab w:val="num" w:pos="720"/>
+        </w:tabs>
+        <w:ind w:left="720" w:hanging="360"/>
+      </w:pPr>
+      <w:rPr>
+        <w:rFonts w:ascii="Symbol" w:hAnsi="Symbol" w:cs="Symbol" w:hint="default"/>
+      </w:rPr>
+    </w:lvl>
+    <w:lvl w:ilvl="1">
+      <w:start w:val="1"/>
+      <w:numFmt w:val="bullet"/>
+      <w:lvlText w:val="◦"/>
+      <w:lvlJc w:val="left"/>
+      <w:pPr>
+        <w:tabs>
+          <w:tab w:val="num" w:pos="1080"/>
+        </w:tabs>
+        <w:ind w:left="1080" w:hanging="360"/>
+      </w:pPr>
+      <w:rPr>
+        <w:rFonts w:ascii="OpenSymbol" w:hAnsi="OpenSymbol" w:cs="OpenSymbol" w:hint="default"/>
+      </w:rPr>
+    </w:lvl>
+    <w:lvl w:ilvl="2">
+      <w:start w:val="1"/>
+      <w:numFmt w:val="bullet"/>
+      <w:lvlText w:val="▪"/>
+      <w:lvlJc w:val="left"/>
+      <w:pPr>
+        <w:tabs>
+          <w:tab w:val="num" w:pos="1440"/>
+        </w:tabs>
+        <w:ind w:left="1440" w:hanging="360"/>
+      </w:pPr>
+      <w:rPr>
+        <w:rFonts w:ascii="OpenSymbol" w:hAnsi="OpenSymbol" w:cs="OpenSymbol" w:hint="default"/>
+      </w:rPr>
+    </w:lvl>
+    <w:lvl w:ilvl="3">
+      <w:start w:val="1"/>
+      <w:numFmt w:val="bullet"/>
+      <w:lvlText w:val=""/>
+      <w:lvlJc w:val="left"/>
+      <w:pPr>
+        <w:tabs>
+          <w:tab w:val="num" w:pos="1800"/>
+        </w:tabs>
+        <w:ind w:left="1800" w:hanging="360"/>
+      </w:pPr>
+      <w:rPr>
+        <w:rFonts w:ascii="Symbol" w:hAnsi="Symbol" w:cs="Symbol" w:hint="default"/>
+      </w:rPr>
+    </w:lvl>
+    <w:lvl w:ilvl="4">
+      <w:start w:val="1"/>
+      <w:numFmt w:val="bullet"/>
+      <w:lvlText w:val="◦"/>
+      <w:lvlJc w:val="left"/>
+      <w:pPr>
+        <w:tabs>
+          <w:tab w:val="num" w:pos="2160"/>
+        </w:tabs>
+        <w:ind w:left="2160" w:hanging="360"/>
+      </w:pPr>
+      <w:rPr>
+        <w:rFonts w:ascii="OpenSymbol" w:hAnsi="OpenSymbol" w:cs="OpenSymbol" w:hint="default"/>
+      </w:rPr>
+    </w:lvl>
+    <w:lvl w:ilvl="5">
+      <w:start w:val="1"/>
+      <w:numFmt w:val="bullet"/>
+      <w:lvlText w:val="▪"/>
+      <w:lvlJc w:val="left"/>
+      <w:pPr>
+        <w:tabs>
+          <w:tab w:val="num" w:pos="2520"/>
+        </w:tabs>
+        <w:ind w:left="2520" w:hanging="360"/>
+      </w:pPr>
+      <w:rPr>
+        <w:rFonts w:ascii="OpenSymbol" w:hAnsi="OpenSymbol" w:cs="OpenSymbol" w:hint="default"/>
+      </w:rPr>
+    </w:lvl>
+    <w:lvl w:ilvl="6">
+      <w:start w:val="1"/>
+      <w:numFmt w:val="bullet"/>
+      <w:lvlText w:val=""/>
+      <w:lvlJc w:val="left"/>
+      <w:pPr>
+        <w:tabs>
+          <w:tab w:val="num" w:pos="2880"/>
+        </w:tabs>
+        <w:ind w:left="2880" w:hanging="360"/>
+      </w:pPr>
+      <w:rPr>
+        <w:rFonts w:ascii="Symbol" w:hAnsi="Symbol" w:cs="Symbol" w:hint="default"/>
+      </w:rPr>
+    </w:lvl>
+    <w:lvl w:ilvl="7">
+      <w:start w:val="1"/>
+      <w:numFmt w:val="bullet"/>
+      <w:lvlText w:val="◦"/>
+      <w:lvlJc w:val="left"/>
+      <w:pPr>
+        <w:tabs>
+          <w:tab w:val="num" w:pos="3240"/>
+        </w:tabs>
+        <w:ind w:left="3240" w:hanging="360"/>
+      </w:pPr>
+      <w:rPr>
+        <w:rFonts w:ascii="OpenSymbol" w:hAnsi="OpenSymbol" w:cs="OpenSymbol" w:hint="default"/>
+      </w:rPr>
+    </w:lvl>
+    <w:lvl w:ilvl="8">
+      <w:start w:val="1"/>
+      <w:numFmt w:val="bullet"/>
+      <w:lvlText w:val="▪"/>
+      <w:lvlJc w:val="left"/>
+      <w:pPr>
+        <w:tabs>
+          <w:tab w:val="num" w:pos="3600"/>
+        </w:tabs>
+        <w:ind w:left="3600" w:hanging="360"/>
+      </w:pPr>
+      <w:rPr>
+        <w:rFonts w:ascii="OpenSymbol" w:hAnsi="OpenSymbol" w:cs="OpenSymbol" w:hint="default"/>
+      </w:rPr>
+    </w:lvl>
+  </w:abstractNum>
+  <w:abstractNum w:abstractNumId="2" w15:restartNumberingAfterBreak="0">
+    <w:nsid w:val="181A570A"/>
+    <w:multiLevelType w:val="multilevel"/>
+    <w:tmpl w:val="E0E43CEC"/>
+    <w:lvl w:ilvl="0">
+      <w:start w:val="1"/>
+      <w:numFmt w:val="bullet"/>
+      <w:lvlText w:val=""/>
+      <w:lvlJc w:val="left"/>
       <w:pPr>
         <w:tabs>
           <w:tab w:val="num" w:pos="0"/>
         </w:tabs>
-        <w:ind w:start="720" w:hanging="360"/>
+        <w:ind w:left="720" w:hanging="360"/>
       </w:pPr>
       <w:rPr>
         <w:rFonts w:ascii="Symbol" w:hAnsi="Symbol" w:cs="Symbol" w:hint="default"/>
@@ -1407,12 +1400,12 @@
       <w:start w:val="1"/>
       <w:numFmt w:val="bullet"/>
       <w:lvlText w:val="o"/>
-      <w:lvlJc w:val="start"/>
+      <w:lvlJc w:val="left"/>
       <w:pPr>
         <w:tabs>
           <w:tab w:val="num" w:pos="0"/>
         </w:tabs>
-        <w:ind w:start="1440" w:hanging="360"/>
+        <w:ind w:left="1440" w:hanging="360"/>
       </w:pPr>
       <w:rPr>
         <w:rFonts w:ascii="Courier New" w:hAnsi="Courier New" w:cs="Courier New" w:hint="default"/>
@@ -1422,12 +1415,12 @@
       <w:start w:val="1"/>
       <w:numFmt w:val="bullet"/>
       <w:lvlText w:val=""/>
-      <w:lvlJc w:val="start"/>
+      <w:lvlJc w:val="left"/>
       <w:pPr>
         <w:tabs>
           <w:tab w:val="num" w:pos="0"/>
         </w:tabs>
-        <w:ind w:start="2160" w:hanging="360"/>
+        <w:ind w:left="2160" w:hanging="360"/>
       </w:pPr>
       <w:rPr>
         <w:rFonts w:ascii="Wingdings" w:hAnsi="Wingdings" w:cs="Wingdings" w:hint="default"/>
@@ -1437,12 +1430,12 @@
       <w:start w:val="1"/>
       <w:numFmt w:val="bullet"/>
       <w:lvlText w:val=""/>
-      <w:lvlJc w:val="start"/>
+      <w:lvlJc w:val="left"/>
       <w:pPr>
         <w:tabs>
           <w:tab w:val="num" w:pos="0"/>
         </w:tabs>
-        <w:ind w:start="2880" w:hanging="360"/>
+        <w:ind w:left="2880" w:hanging="360"/>
       </w:pPr>
       <w:rPr>
         <w:rFonts w:ascii="Symbol" w:hAnsi="Symbol" w:cs="Symbol" w:hint="default"/>
@@ -1452,12 +1445,12 @@
       <w:start w:val="1"/>
       <w:numFmt w:val="bullet"/>
       <w:lvlText w:val="o"/>
-      <w:lvlJc w:val="start"/>
+      <w:lvlJc w:val="left"/>
       <w:pPr>
         <w:tabs>
           <w:tab w:val="num" w:pos="0"/>
         </w:tabs>
-        <w:ind w:start="3600" w:hanging="360"/>
+        <w:ind w:left="3600" w:hanging="360"/>
       </w:pPr>
       <w:rPr>
         <w:rFonts w:ascii="Courier New" w:hAnsi="Courier New" w:cs="Courier New" w:hint="default"/>
@@ -1467,12 +1460,12 @@
       <w:start w:val="1"/>
       <w:numFmt w:val="bullet"/>
       <w:lvlText w:val=""/>
-      <w:lvlJc w:val="start"/>
+      <w:lvlJc w:val="left"/>
       <w:pPr>
         <w:tabs>
           <w:tab w:val="num" w:pos="0"/>
         </w:tabs>
-        <w:ind w:start="4320" w:hanging="360"/>
+        <w:ind w:left="4320" w:hanging="360"/>
       </w:pPr>
       <w:rPr>
         <w:rFonts w:ascii="Wingdings" w:hAnsi="Wingdings" w:cs="Wingdings" w:hint="default"/>
@@ -1482,12 +1475,12 @@
       <w:start w:val="1"/>
       <w:numFmt w:val="bullet"/>
       <w:lvlText w:val=""/>
-      <w:lvlJc w:val="start"/>
+      <w:lvlJc w:val="left"/>
       <w:pPr>
         <w:tabs>
           <w:tab w:val="num" w:pos="0"/>
         </w:tabs>
-        <w:ind w:start="5040" w:hanging="360"/>
+        <w:ind w:left="5040" w:hanging="360"/>
       </w:pPr>
       <w:rPr>
         <w:rFonts w:ascii="Symbol" w:hAnsi="Symbol" w:cs="Symbol" w:hint="default"/>
@@ -1497,12 +1490,12 @@
       <w:start w:val="1"/>
       <w:numFmt w:val="bullet"/>
       <w:lvlText w:val="o"/>
-      <w:lvlJc w:val="start"/>
+      <w:lvlJc w:val="left"/>
       <w:pPr>
         <w:tabs>
           <w:tab w:val="num" w:pos="0"/>
         </w:tabs>
-        <w:ind w:start="5760" w:hanging="360"/>
+        <w:ind w:left="5760" w:hanging="360"/>
       </w:pPr>
       <w:rPr>
         <w:rFonts w:ascii="Courier New" w:hAnsi="Courier New" w:cs="Courier New" w:hint="default"/>
@@ -1512,29 +1505,32 @@
       <w:start w:val="1"/>
       <w:numFmt w:val="bullet"/>
       <w:lvlText w:val=""/>
-      <w:lvlJc w:val="start"/>
+      <w:lvlJc w:val="left"/>
       <w:pPr>
         <w:tabs>
           <w:tab w:val="num" w:pos="0"/>
         </w:tabs>
-        <w:ind w:start="6480" w:hanging="360"/>
+        <w:ind w:left="6480" w:hanging="360"/>
       </w:pPr>
       <w:rPr>
         <w:rFonts w:ascii="Wingdings" w:hAnsi="Wingdings" w:cs="Wingdings" w:hint="default"/>
       </w:rPr>
     </w:lvl>
   </w:abstractNum>
-  <w:abstractNum w:abstractNumId="2">
+  <w:abstractNum w:abstractNumId="3" w15:restartNumberingAfterBreak="0">
+    <w:nsid w:val="1E4C78B3"/>
+    <w:multiLevelType w:val="multilevel"/>
+    <w:tmpl w:val="65306590"/>
     <w:lvl w:ilvl="0">
       <w:start w:val="1"/>
       <w:numFmt w:val="bullet"/>
       <w:lvlText w:val=""/>
-      <w:lvlJc w:val="start"/>
+      <w:lvlJc w:val="left"/>
       <w:pPr>
         <w:tabs>
           <w:tab w:val="num" w:pos="720"/>
         </w:tabs>
-        <w:ind w:start="720" w:hanging="360"/>
+        <w:ind w:left="720" w:hanging="360"/>
       </w:pPr>
       <w:rPr>
         <w:rFonts w:ascii="Symbol" w:hAnsi="Symbol" w:cs="Symbol" w:hint="default"/>
@@ -1544,12 +1540,12 @@
       <w:start w:val="1"/>
       <w:numFmt w:val="bullet"/>
       <w:lvlText w:val="◦"/>
-      <w:lvlJc w:val="start"/>
+      <w:lvlJc w:val="left"/>
       <w:pPr>
         <w:tabs>
           <w:tab w:val="num" w:pos="1080"/>
         </w:tabs>
-        <w:ind w:start="1080" w:hanging="360"/>
+        <w:ind w:left="1080" w:hanging="360"/>
       </w:pPr>
       <w:rPr>
         <w:rFonts w:ascii="OpenSymbol" w:hAnsi="OpenSymbol" w:cs="OpenSymbol" w:hint="default"/>
@@ -1559,12 +1555,12 @@
       <w:start w:val="1"/>
       <w:numFmt w:val="bullet"/>
       <w:lvlText w:val="▪"/>
-      <w:lvlJc w:val="start"/>
+      <w:lvlJc w:val="left"/>
       <w:pPr>
         <w:tabs>
           <w:tab w:val="num" w:pos="1440"/>
         </w:tabs>
-        <w:ind w:start="1440" w:hanging="360"/>
+        <w:ind w:left="1440" w:hanging="360"/>
       </w:pPr>
       <w:rPr>
         <w:rFonts w:ascii="OpenSymbol" w:hAnsi="OpenSymbol" w:cs="OpenSymbol" w:hint="default"/>
@@ -1574,12 +1570,12 @@
       <w:start w:val="1"/>
       <w:numFmt w:val="bullet"/>
       <w:lvlText w:val=""/>
-      <w:lvlJc w:val="start"/>
+      <w:lvlJc w:val="left"/>
       <w:pPr>
         <w:tabs>
           <w:tab w:val="num" w:pos="1800"/>
         </w:tabs>
-        <w:ind w:start="1800" w:hanging="360"/>
+        <w:ind w:left="1800" w:hanging="360"/>
       </w:pPr>
       <w:rPr>
         <w:rFonts w:ascii="Symbol" w:hAnsi="Symbol" w:cs="Symbol" w:hint="default"/>
@@ -1589,12 +1585,12 @@
       <w:start w:val="1"/>
       <w:numFmt w:val="bullet"/>
       <w:lvlText w:val="◦"/>
-      <w:lvlJc w:val="start"/>
+      <w:lvlJc w:val="left"/>
       <w:pPr>
         <w:tabs>
           <w:tab w:val="num" w:pos="2160"/>
         </w:tabs>
-        <w:ind w:start="2160" w:hanging="360"/>
+        <w:ind w:left="2160" w:hanging="360"/>
       </w:pPr>
       <w:rPr>
         <w:rFonts w:ascii="OpenSymbol" w:hAnsi="OpenSymbol" w:cs="OpenSymbol" w:hint="default"/>
@@ -1604,12 +1600,12 @@
       <w:start w:val="1"/>
       <w:numFmt w:val="bullet"/>
       <w:lvlText w:val="▪"/>
-      <w:lvlJc w:val="start"/>
+      <w:lvlJc w:val="left"/>
       <w:pPr>
         <w:tabs>
           <w:tab w:val="num" w:pos="2520"/>
         </w:tabs>
-        <w:ind w:start="2520" w:hanging="360"/>
+        <w:ind w:left="2520" w:hanging="360"/>
       </w:pPr>
       <w:rPr>
         <w:rFonts w:ascii="OpenSymbol" w:hAnsi="OpenSymbol" w:cs="OpenSymbol" w:hint="default"/>
@@ -1619,12 +1615,12 @@
       <w:start w:val="1"/>
       <w:numFmt w:val="bullet"/>
       <w:lvlText w:val=""/>
-      <w:lvlJc w:val="start"/>
+      <w:lvlJc w:val="left"/>
       <w:pPr>
         <w:tabs>
           <w:tab w:val="num" w:pos="2880"/>
         </w:tabs>
-        <w:ind w:start="2880" w:hanging="360"/>
+        <w:ind w:left="2880" w:hanging="360"/>
       </w:pPr>
       <w:rPr>
         <w:rFonts w:ascii="Symbol" w:hAnsi="Symbol" w:cs="Symbol" w:hint="default"/>
@@ -1634,12 +1630,12 @@
       <w:start w:val="1"/>
       <w:numFmt w:val="bullet"/>
       <w:lvlText w:val="◦"/>
-      <w:lvlJc w:val="start"/>
+      <w:lvlJc w:val="left"/>
       <w:pPr>
         <w:tabs>
           <w:tab w:val="num" w:pos="3240"/>
         </w:tabs>
-        <w:ind w:start="3240" w:hanging="360"/>
+        <w:ind w:left="3240" w:hanging="360"/>
       </w:pPr>
       <w:rPr>
         <w:rFonts w:ascii="OpenSymbol" w:hAnsi="OpenSymbol" w:cs="OpenSymbol" w:hint="default"/>
@@ -1649,29 +1645,32 @@
       <w:start w:val="1"/>
       <w:numFmt w:val="bullet"/>
       <w:lvlText w:val="▪"/>
-      <w:lvlJc w:val="start"/>
+      <w:lvlJc w:val="left"/>
       <w:pPr>
         <w:tabs>
           <w:tab w:val="num" w:pos="3600"/>
         </w:tabs>
-        <w:ind w:start="3600" w:hanging="360"/>
+        <w:ind w:left="3600" w:hanging="360"/>
       </w:pPr>
       <w:rPr>
         <w:rFonts w:ascii="OpenSymbol" w:hAnsi="OpenSymbol" w:cs="OpenSymbol" w:hint="default"/>
       </w:rPr>
     </w:lvl>
   </w:abstractNum>
-  <w:abstractNum w:abstractNumId="3">
+  <w:abstractNum w:abstractNumId="4" w15:restartNumberingAfterBreak="0">
+    <w:nsid w:val="275934F5"/>
+    <w:multiLevelType w:val="multilevel"/>
+    <w:tmpl w:val="9C784088"/>
     <w:lvl w:ilvl="0">
       <w:start w:val="1"/>
       <w:numFmt w:val="bullet"/>
       <w:lvlText w:val=""/>
-      <w:lvlJc w:val="start"/>
+      <w:lvlJc w:val="left"/>
       <w:pPr>
         <w:tabs>
           <w:tab w:val="num" w:pos="720"/>
         </w:tabs>
-        <w:ind w:start="720" w:hanging="360"/>
+        <w:ind w:left="720" w:hanging="360"/>
       </w:pPr>
       <w:rPr>
         <w:rFonts w:ascii="Symbol" w:hAnsi="Symbol" w:cs="Symbol" w:hint="default"/>
@@ -1681,12 +1680,12 @@
       <w:start w:val="1"/>
       <w:numFmt w:val="bullet"/>
       <w:lvlText w:val="◦"/>
-      <w:lvlJc w:val="start"/>
+      <w:lvlJc w:val="left"/>
       <w:pPr>
         <w:tabs>
           <w:tab w:val="num" w:pos="1080"/>
         </w:tabs>
-        <w:ind w:start="1080" w:hanging="360"/>
+        <w:ind w:left="1080" w:hanging="360"/>
       </w:pPr>
       <w:rPr>
         <w:rFonts w:ascii="OpenSymbol" w:hAnsi="OpenSymbol" w:cs="OpenSymbol" w:hint="default"/>
@@ -1696,12 +1695,12 @@
       <w:start w:val="1"/>
       <w:numFmt w:val="bullet"/>
       <w:lvlText w:val="▪"/>
-      <w:lvlJc w:val="start"/>
+      <w:lvlJc w:val="left"/>
       <w:pPr>
         <w:tabs>
           <w:tab w:val="num" w:pos="1440"/>
         </w:tabs>
-        <w:ind w:start="1440" w:hanging="360"/>
+        <w:ind w:left="1440" w:hanging="360"/>
       </w:pPr>
       <w:rPr>
         <w:rFonts w:ascii="OpenSymbol" w:hAnsi="OpenSymbol" w:cs="OpenSymbol" w:hint="default"/>
@@ -1711,12 +1710,12 @@
       <w:start w:val="1"/>
       <w:numFmt w:val="bullet"/>
       <w:lvlText w:val=""/>
-      <w:lvlJc w:val="start"/>
+      <w:lvlJc w:val="left"/>
       <w:pPr>
         <w:tabs>
           <w:tab w:val="num" w:pos="1800"/>
         </w:tabs>
-        <w:ind w:start="1800" w:hanging="360"/>
+        <w:ind w:left="1800" w:hanging="360"/>
       </w:pPr>
       <w:rPr>
         <w:rFonts w:ascii="Symbol" w:hAnsi="Symbol" w:cs="Symbol" w:hint="default"/>
@@ -1726,12 +1725,12 @@
       <w:start w:val="1"/>
       <w:numFmt w:val="bullet"/>
       <w:lvlText w:val="◦"/>
-      <w:lvlJc w:val="start"/>
+      <w:lvlJc w:val="left"/>
       <w:pPr>
         <w:tabs>
           <w:tab w:val="num" w:pos="2160"/>
         </w:tabs>
-        <w:ind w:start="2160" w:hanging="360"/>
+        <w:ind w:left="2160" w:hanging="360"/>
       </w:pPr>
       <w:rPr>
         <w:rFonts w:ascii="OpenSymbol" w:hAnsi="OpenSymbol" w:cs="OpenSymbol" w:hint="default"/>
@@ -1741,12 +1740,12 @@
       <w:start w:val="1"/>
       <w:numFmt w:val="bullet"/>
       <w:lvlText w:val="▪"/>
-      <w:lvlJc w:val="start"/>
+      <w:lvlJc w:val="left"/>
       <w:pPr>
         <w:tabs>
           <w:tab w:val="num" w:pos="2520"/>
         </w:tabs>
-        <w:ind w:start="2520" w:hanging="360"/>
+        <w:ind w:left="2520" w:hanging="360"/>
       </w:pPr>
       <w:rPr>
         <w:rFonts w:ascii="OpenSymbol" w:hAnsi="OpenSymbol" w:cs="OpenSymbol" w:hint="default"/>
@@ -1756,12 +1755,12 @@
       <w:start w:val="1"/>
       <w:numFmt w:val="bullet"/>
       <w:lvlText w:val=""/>
-      <w:lvlJc w:val="start"/>
+      <w:lvlJc w:val="left"/>
       <w:pPr>
         <w:tabs>
           <w:tab w:val="num" w:pos="2880"/>
         </w:tabs>
-        <w:ind w:start="2880" w:hanging="360"/>
+        <w:ind w:left="2880" w:hanging="360"/>
       </w:pPr>
       <w:rPr>
         <w:rFonts w:ascii="Symbol" w:hAnsi="Symbol" w:cs="Symbol" w:hint="default"/>
@@ -1771,12 +1770,12 @@
       <w:start w:val="1"/>
       <w:numFmt w:val="bullet"/>
       <w:lvlText w:val="◦"/>
-      <w:lvlJc w:val="start"/>
+      <w:lvlJc w:val="left"/>
       <w:pPr>
         <w:tabs>
           <w:tab w:val="num" w:pos="3240"/>
         </w:tabs>
-        <w:ind w:start="3240" w:hanging="360"/>
+        <w:ind w:left="3240" w:hanging="360"/>
       </w:pPr>
       <w:rPr>
         <w:rFonts w:ascii="OpenSymbol" w:hAnsi="OpenSymbol" w:cs="OpenSymbol" w:hint="default"/>
@@ -1786,29 +1785,32 @@
       <w:start w:val="1"/>
       <w:numFmt w:val="bullet"/>
       <w:lvlText w:val="▪"/>
-      <w:lvlJc w:val="start"/>
+      <w:lvlJc w:val="left"/>
       <w:pPr>
         <w:tabs>
           <w:tab w:val="num" w:pos="3600"/>
         </w:tabs>
-        <w:ind w:start="3600" w:hanging="360"/>
+        <w:ind w:left="3600" w:hanging="360"/>
       </w:pPr>
       <w:rPr>
         <w:rFonts w:ascii="OpenSymbol" w:hAnsi="OpenSymbol" w:cs="OpenSymbol" w:hint="default"/>
       </w:rPr>
     </w:lvl>
   </w:abstractNum>
-  <w:abstractNum w:abstractNumId="4">
+  <w:abstractNum w:abstractNumId="5" w15:restartNumberingAfterBreak="0">
+    <w:nsid w:val="5B727E70"/>
+    <w:multiLevelType w:val="multilevel"/>
+    <w:tmpl w:val="AD38B29E"/>
     <w:lvl w:ilvl="0">
       <w:start w:val="1"/>
       <w:numFmt w:val="bullet"/>
       <w:lvlText w:val=""/>
-      <w:lvlJc w:val="start"/>
+      <w:lvlJc w:val="left"/>
       <w:pPr>
         <w:tabs>
           <w:tab w:val="num" w:pos="720"/>
         </w:tabs>
-        <w:ind w:start="720" w:hanging="360"/>
+        <w:ind w:left="720" w:hanging="360"/>
       </w:pPr>
       <w:rPr>
         <w:rFonts w:ascii="Symbol" w:hAnsi="Symbol" w:cs="Symbol" w:hint="default"/>
@@ -1818,12 +1820,12 @@
       <w:start w:val="1"/>
       <w:numFmt w:val="bullet"/>
       <w:lvlText w:val="◦"/>
-      <w:lvlJc w:val="start"/>
+      <w:lvlJc w:val="left"/>
       <w:pPr>
         <w:tabs>
           <w:tab w:val="num" w:pos="1080"/>
         </w:tabs>
-        <w:ind w:start="1080" w:hanging="360"/>
+        <w:ind w:left="1080" w:hanging="360"/>
       </w:pPr>
       <w:rPr>
         <w:rFonts w:ascii="OpenSymbol" w:hAnsi="OpenSymbol" w:cs="OpenSymbol" w:hint="default"/>
@@ -1833,12 +1835,12 @@
       <w:start w:val="1"/>
       <w:numFmt w:val="bullet"/>
       <w:lvlText w:val="▪"/>
-      <w:lvlJc w:val="start"/>
+      <w:lvlJc w:val="left"/>
       <w:pPr>
         <w:tabs>
           <w:tab w:val="num" w:pos="1440"/>
         </w:tabs>
-        <w:ind w:start="1440" w:hanging="360"/>
+        <w:ind w:left="1440" w:hanging="360"/>
       </w:pPr>
       <w:rPr>
         <w:rFonts w:ascii="OpenSymbol" w:hAnsi="OpenSymbol" w:cs="OpenSymbol" w:hint="default"/>
@@ -1848,12 +1850,12 @@
       <w:start w:val="1"/>
       <w:numFmt w:val="bullet"/>
       <w:lvlText w:val=""/>
-      <w:lvlJc w:val="start"/>
+      <w:lvlJc w:val="left"/>
       <w:pPr>
         <w:tabs>
           <w:tab w:val="num" w:pos="1800"/>
         </w:tabs>
-        <w:ind w:start="1800" w:hanging="360"/>
+        <w:ind w:left="1800" w:hanging="360"/>
       </w:pPr>
       <w:rPr>
         <w:rFonts w:ascii="Symbol" w:hAnsi="Symbol" w:cs="Symbol" w:hint="default"/>
@@ -1863,12 +1865,12 @@
       <w:start w:val="1"/>
       <w:numFmt w:val="bullet"/>
       <w:lvlText w:val="◦"/>
-      <w:lvlJc w:val="start"/>
+      <w:lvlJc w:val="left"/>
       <w:pPr>
         <w:tabs>
           <w:tab w:val="num" w:pos="2160"/>
         </w:tabs>
-        <w:ind w:start="2160" w:hanging="360"/>
+        <w:ind w:left="2160" w:hanging="360"/>
       </w:pPr>
       <w:rPr>
         <w:rFonts w:ascii="OpenSymbol" w:hAnsi="OpenSymbol" w:cs="OpenSymbol" w:hint="default"/>
@@ -1878,12 +1880,12 @@
       <w:start w:val="1"/>
       <w:numFmt w:val="bullet"/>
       <w:lvlText w:val="▪"/>
-      <w:lvlJc w:val="start"/>
+      <w:lvlJc w:val="left"/>
       <w:pPr>
         <w:tabs>
           <w:tab w:val="num" w:pos="2520"/>
         </w:tabs>
-        <w:ind w:start="2520" w:hanging="360"/>
+        <w:ind w:left="2520" w:hanging="360"/>
       </w:pPr>
       <w:rPr>
         <w:rFonts w:ascii="OpenSymbol" w:hAnsi="OpenSymbol" w:cs="OpenSymbol" w:hint="default"/>
@@ -1893,12 +1895,12 @@
       <w:start w:val="1"/>
       <w:numFmt w:val="bullet"/>
       <w:lvlText w:val=""/>
-      <w:lvlJc w:val="start"/>
+      <w:lvlJc w:val="left"/>
       <w:pPr>
         <w:tabs>
           <w:tab w:val="num" w:pos="2880"/>
         </w:tabs>
-        <w:ind w:start="2880" w:hanging="360"/>
+        <w:ind w:left="2880" w:hanging="360"/>
       </w:pPr>
       <w:rPr>
         <w:rFonts w:ascii="Symbol" w:hAnsi="Symbol" w:cs="Symbol" w:hint="default"/>
@@ -1908,12 +1910,12 @@
       <w:start w:val="1"/>
       <w:numFmt w:val="bullet"/>
       <w:lvlText w:val="◦"/>
-      <w:lvlJc w:val="start"/>
+      <w:lvlJc w:val="left"/>
       <w:pPr>
         <w:tabs>
           <w:tab w:val="num" w:pos="3240"/>
         </w:tabs>
-        <w:ind w:start="3240" w:hanging="360"/>
+        <w:ind w:left="3240" w:hanging="360"/>
       </w:pPr>
       <w:rPr>
         <w:rFonts w:ascii="OpenSymbol" w:hAnsi="OpenSymbol" w:cs="OpenSymbol" w:hint="default"/>
@@ -1923,304 +1925,33 @@
       <w:start w:val="1"/>
       <w:numFmt w:val="bullet"/>
       <w:lvlText w:val="▪"/>
-      <w:lvlJc w:val="start"/>
+      <w:lvlJc w:val="left"/>
       <w:pPr>
         <w:tabs>
           <w:tab w:val="num" w:pos="3600"/>
         </w:tabs>
-        <w:ind w:start="3600" w:hanging="360"/>
+        <w:ind w:left="3600" w:hanging="360"/>
       </w:pPr>
       <w:rPr>
         <w:rFonts w:ascii="OpenSymbol" w:hAnsi="OpenSymbol" w:cs="OpenSymbol" w:hint="default"/>
       </w:rPr>
     </w:lvl>
   </w:abstractNum>
-  <w:abstractNum w:abstractNumId="5">
-    <w:lvl w:ilvl="0">
-      <w:start w:val="1"/>
-      <w:numFmt w:val="bullet"/>
-      <w:lvlText w:val=""/>
-      <w:lvlJc w:val="start"/>
-      <w:pPr>
-        <w:tabs>
-          <w:tab w:val="num" w:pos="720"/>
-        </w:tabs>
-        <w:ind w:start="720" w:hanging="360"/>
-      </w:pPr>
-      <w:rPr>
-        <w:rFonts w:ascii="Symbol" w:hAnsi="Symbol" w:cs="Symbol" w:hint="default"/>
-      </w:rPr>
-    </w:lvl>
-    <w:lvl w:ilvl="1">
-      <w:start w:val="1"/>
-      <w:numFmt w:val="bullet"/>
-      <w:lvlText w:val="◦"/>
-      <w:lvlJc w:val="start"/>
-      <w:pPr>
-        <w:tabs>
-          <w:tab w:val="num" w:pos="1080"/>
-        </w:tabs>
-        <w:ind w:start="1080" w:hanging="360"/>
-      </w:pPr>
-      <w:rPr>
-        <w:rFonts w:ascii="OpenSymbol" w:hAnsi="OpenSymbol" w:cs="OpenSymbol" w:hint="default"/>
-      </w:rPr>
-    </w:lvl>
-    <w:lvl w:ilvl="2">
-      <w:start w:val="1"/>
-      <w:numFmt w:val="bullet"/>
-      <w:lvlText w:val="▪"/>
-      <w:lvlJc w:val="start"/>
-      <w:pPr>
-        <w:tabs>
-          <w:tab w:val="num" w:pos="1440"/>
-        </w:tabs>
-        <w:ind w:start="1440" w:hanging="360"/>
-      </w:pPr>
-      <w:rPr>
-        <w:rFonts w:ascii="OpenSymbol" w:hAnsi="OpenSymbol" w:cs="OpenSymbol" w:hint="default"/>
-      </w:rPr>
-    </w:lvl>
-    <w:lvl w:ilvl="3">
-      <w:start w:val="1"/>
-      <w:numFmt w:val="bullet"/>
-      <w:lvlText w:val=""/>
-      <w:lvlJc w:val="start"/>
-      <w:pPr>
-        <w:tabs>
-          <w:tab w:val="num" w:pos="1800"/>
-        </w:tabs>
-        <w:ind w:start="1800" w:hanging="360"/>
-      </w:pPr>
-      <w:rPr>
-        <w:rFonts w:ascii="Symbol" w:hAnsi="Symbol" w:cs="Symbol" w:hint="default"/>
-      </w:rPr>
-    </w:lvl>
-    <w:lvl w:ilvl="4">
-      <w:start w:val="1"/>
-      <w:numFmt w:val="bullet"/>
-      <w:lvlText w:val="◦"/>
-      <w:lvlJc w:val="start"/>
-      <w:pPr>
-        <w:tabs>
-          <w:tab w:val="num" w:pos="2160"/>
-        </w:tabs>
-        <w:ind w:start="2160" w:hanging="360"/>
-      </w:pPr>
-      <w:rPr>
-        <w:rFonts w:ascii="OpenSymbol" w:hAnsi="OpenSymbol" w:cs="OpenSymbol" w:hint="default"/>
-      </w:rPr>
-    </w:lvl>
-    <w:lvl w:ilvl="5">
-      <w:start w:val="1"/>
-      <w:numFmt w:val="bullet"/>
-      <w:lvlText w:val="▪"/>
-      <w:lvlJc w:val="start"/>
-      <w:pPr>
-        <w:tabs>
-          <w:tab w:val="num" w:pos="2520"/>
-        </w:tabs>
-        <w:ind w:start="2520" w:hanging="360"/>
-      </w:pPr>
-      <w:rPr>
-        <w:rFonts w:ascii="OpenSymbol" w:hAnsi="OpenSymbol" w:cs="OpenSymbol" w:hint="default"/>
-      </w:rPr>
-    </w:lvl>
-    <w:lvl w:ilvl="6">
-      <w:start w:val="1"/>
-      <w:numFmt w:val="bullet"/>
-      <w:lvlText w:val=""/>
-      <w:lvlJc w:val="start"/>
-      <w:pPr>
-        <w:tabs>
-          <w:tab w:val="num" w:pos="2880"/>
-        </w:tabs>
-        <w:ind w:start="2880" w:hanging="360"/>
-      </w:pPr>
-      <w:rPr>
-        <w:rFonts w:ascii="Symbol" w:hAnsi="Symbol" w:cs="Symbol" w:hint="default"/>
-      </w:rPr>
-    </w:lvl>
-    <w:lvl w:ilvl="7">
-      <w:start w:val="1"/>
-      <w:numFmt w:val="bullet"/>
-      <w:lvlText w:val="◦"/>
-      <w:lvlJc w:val="start"/>
-      <w:pPr>
-        <w:tabs>
-          <w:tab w:val="num" w:pos="3240"/>
-        </w:tabs>
-        <w:ind w:start="3240" w:hanging="360"/>
-      </w:pPr>
-      <w:rPr>
-        <w:rFonts w:ascii="OpenSymbol" w:hAnsi="OpenSymbol" w:cs="OpenSymbol" w:hint="default"/>
-      </w:rPr>
-    </w:lvl>
-    <w:lvl w:ilvl="8">
-      <w:start w:val="1"/>
-      <w:numFmt w:val="bullet"/>
-      <w:lvlText w:val="▪"/>
-      <w:lvlJc w:val="start"/>
-      <w:pPr>
-        <w:tabs>
-          <w:tab w:val="num" w:pos="3600"/>
-        </w:tabs>
-        <w:ind w:start="3600" w:hanging="360"/>
-      </w:pPr>
-      <w:rPr>
-        <w:rFonts w:ascii="OpenSymbol" w:hAnsi="OpenSymbol" w:cs="OpenSymbol" w:hint="default"/>
-      </w:rPr>
-    </w:lvl>
-  </w:abstractNum>
-  <w:abstractNum w:abstractNumId="6">
-    <w:lvl w:ilvl="0">
-      <w:start w:val="1"/>
-      <w:numFmt w:val="bullet"/>
-      <w:lvlText w:val=""/>
-      <w:lvlJc w:val="start"/>
-      <w:pPr>
-        <w:tabs>
-          <w:tab w:val="num" w:pos="720"/>
-        </w:tabs>
-        <w:ind w:start="720" w:hanging="360"/>
-      </w:pPr>
-      <w:rPr>
-        <w:rFonts w:ascii="Symbol" w:hAnsi="Symbol" w:cs="Symbol" w:hint="default"/>
-      </w:rPr>
-    </w:lvl>
-    <w:lvl w:ilvl="1">
-      <w:start w:val="1"/>
-      <w:numFmt w:val="bullet"/>
-      <w:lvlText w:val="◦"/>
-      <w:lvlJc w:val="start"/>
-      <w:pPr>
-        <w:tabs>
-          <w:tab w:val="num" w:pos="1080"/>
-        </w:tabs>
-        <w:ind w:start="1080" w:hanging="360"/>
-      </w:pPr>
-      <w:rPr>
-        <w:rFonts w:ascii="OpenSymbol" w:hAnsi="OpenSymbol" w:cs="OpenSymbol" w:hint="default"/>
-      </w:rPr>
-    </w:lvl>
-    <w:lvl w:ilvl="2">
-      <w:start w:val="1"/>
-      <w:numFmt w:val="bullet"/>
-      <w:lvlText w:val="▪"/>
-      <w:lvlJc w:val="start"/>
-      <w:pPr>
-        <w:tabs>
-          <w:tab w:val="num" w:pos="1440"/>
-        </w:tabs>
-        <w:ind w:start="1440" w:hanging="360"/>
-      </w:pPr>
-      <w:rPr>
-        <w:rFonts w:ascii="OpenSymbol" w:hAnsi="OpenSymbol" w:cs="OpenSymbol" w:hint="default"/>
-      </w:rPr>
-    </w:lvl>
-    <w:lvl w:ilvl="3">
-      <w:start w:val="1"/>
-      <w:numFmt w:val="bullet"/>
-      <w:lvlText w:val=""/>
-      <w:lvlJc w:val="start"/>
-      <w:pPr>
-        <w:tabs>
-          <w:tab w:val="num" w:pos="1800"/>
-        </w:tabs>
-        <w:ind w:start="1800" w:hanging="360"/>
-      </w:pPr>
-      <w:rPr>
-        <w:rFonts w:ascii="Symbol" w:hAnsi="Symbol" w:cs="Symbol" w:hint="default"/>
-      </w:rPr>
-    </w:lvl>
-    <w:lvl w:ilvl="4">
-      <w:start w:val="1"/>
-      <w:numFmt w:val="bullet"/>
-      <w:lvlText w:val="◦"/>
-      <w:lvlJc w:val="start"/>
-      <w:pPr>
-        <w:tabs>
-          <w:tab w:val="num" w:pos="2160"/>
-        </w:tabs>
-        <w:ind w:start="2160" w:hanging="360"/>
-      </w:pPr>
-      <w:rPr>
-        <w:rFonts w:ascii="OpenSymbol" w:hAnsi="OpenSymbol" w:cs="OpenSymbol" w:hint="default"/>
-      </w:rPr>
-    </w:lvl>
-    <w:lvl w:ilvl="5">
-      <w:start w:val="1"/>
-      <w:numFmt w:val="bullet"/>
-      <w:lvlText w:val="▪"/>
-      <w:lvlJc w:val="start"/>
-      <w:pPr>
-        <w:tabs>
-          <w:tab w:val="num" w:pos="2520"/>
-        </w:tabs>
-        <w:ind w:start="2520" w:hanging="360"/>
-      </w:pPr>
-      <w:rPr>
-        <w:rFonts w:ascii="OpenSymbol" w:hAnsi="OpenSymbol" w:cs="OpenSymbol" w:hint="default"/>
-      </w:rPr>
-    </w:lvl>
-    <w:lvl w:ilvl="6">
-      <w:start w:val="1"/>
-      <w:numFmt w:val="bullet"/>
-      <w:lvlText w:val=""/>
-      <w:lvlJc w:val="start"/>
-      <w:pPr>
-        <w:tabs>
-          <w:tab w:val="num" w:pos="2880"/>
-        </w:tabs>
-        <w:ind w:start="2880" w:hanging="360"/>
-      </w:pPr>
-      <w:rPr>
-        <w:rFonts w:ascii="Symbol" w:hAnsi="Symbol" w:cs="Symbol" w:hint="default"/>
-      </w:rPr>
-    </w:lvl>
-    <w:lvl w:ilvl="7">
-      <w:start w:val="1"/>
-      <w:numFmt w:val="bullet"/>
-      <w:lvlText w:val="◦"/>
-      <w:lvlJc w:val="start"/>
-      <w:pPr>
-        <w:tabs>
-          <w:tab w:val="num" w:pos="3240"/>
-        </w:tabs>
-        <w:ind w:start="3240" w:hanging="360"/>
-      </w:pPr>
-      <w:rPr>
-        <w:rFonts w:ascii="OpenSymbol" w:hAnsi="OpenSymbol" w:cs="OpenSymbol" w:hint="default"/>
-      </w:rPr>
-    </w:lvl>
-    <w:lvl w:ilvl="8">
-      <w:start w:val="1"/>
-      <w:numFmt w:val="bullet"/>
-      <w:lvlText w:val="▪"/>
-      <w:lvlJc w:val="start"/>
-      <w:pPr>
-        <w:tabs>
-          <w:tab w:val="num" w:pos="3600"/>
-        </w:tabs>
-        <w:ind w:start="3600" w:hanging="360"/>
-      </w:pPr>
-      <w:rPr>
-        <w:rFonts w:ascii="OpenSymbol" w:hAnsi="OpenSymbol" w:cs="OpenSymbol" w:hint="default"/>
-      </w:rPr>
-    </w:lvl>
-  </w:abstractNum>
-  <w:abstractNum w:abstractNumId="7">
+  <w:abstractNum w:abstractNumId="6" w15:restartNumberingAfterBreak="0">
+    <w:nsid w:val="73316D80"/>
+    <w:multiLevelType w:val="multilevel"/>
+    <w:tmpl w:val="073006FA"/>
     <w:lvl w:ilvl="0">
       <w:start w:val="1"/>
       <w:numFmt w:val="none"/>
       <w:suff w:val="nothing"/>
       <w:lvlText w:val=""/>
-      <w:lvlJc w:val="start"/>
+      <w:lvlJc w:val="left"/>
       <w:pPr>
         <w:tabs>
           <w:tab w:val="num" w:pos="0"/>
         </w:tabs>
-        <w:ind w:start="0" w:hanging="0"/>
+        <w:ind w:left="0" w:firstLine="0"/>
       </w:pPr>
     </w:lvl>
     <w:lvl w:ilvl="1">
@@ -2228,12 +1959,12 @@
       <w:numFmt w:val="none"/>
       <w:suff w:val="nothing"/>
       <w:lvlText w:val=""/>
-      <w:lvlJc w:val="start"/>
+      <w:lvlJc w:val="left"/>
       <w:pPr>
         <w:tabs>
           <w:tab w:val="num" w:pos="0"/>
         </w:tabs>
-        <w:ind w:start="0" w:hanging="0"/>
+        <w:ind w:left="0" w:firstLine="0"/>
       </w:pPr>
     </w:lvl>
     <w:lvl w:ilvl="2">
@@ -2241,12 +1972,12 @@
       <w:numFmt w:val="none"/>
       <w:suff w:val="nothing"/>
       <w:lvlText w:val=""/>
-      <w:lvlJc w:val="start"/>
+      <w:lvlJc w:val="left"/>
       <w:pPr>
         <w:tabs>
           <w:tab w:val="num" w:pos="0"/>
         </w:tabs>
-        <w:ind w:start="0" w:hanging="0"/>
+        <w:ind w:left="0" w:firstLine="0"/>
       </w:pPr>
     </w:lvl>
     <w:lvl w:ilvl="3">
@@ -2254,12 +1985,12 @@
       <w:numFmt w:val="none"/>
       <w:suff w:val="nothing"/>
       <w:lvlText w:val=""/>
-      <w:lvlJc w:val="start"/>
+      <w:lvlJc w:val="left"/>
       <w:pPr>
         <w:tabs>
           <w:tab w:val="num" w:pos="0"/>
         </w:tabs>
-        <w:ind w:start="0" w:hanging="0"/>
+        <w:ind w:left="0" w:firstLine="0"/>
       </w:pPr>
     </w:lvl>
     <w:lvl w:ilvl="4">
@@ -2267,12 +1998,12 @@
       <w:numFmt w:val="none"/>
       <w:suff w:val="nothing"/>
       <w:lvlText w:val=""/>
-      <w:lvlJc w:val="start"/>
+      <w:lvlJc w:val="left"/>
       <w:pPr>
         <w:tabs>
           <w:tab w:val="num" w:pos="0"/>
         </w:tabs>
-        <w:ind w:start="0" w:hanging="0"/>
+        <w:ind w:left="0" w:firstLine="0"/>
       </w:pPr>
     </w:lvl>
     <w:lvl w:ilvl="5">
@@ -2280,12 +2011,12 @@
       <w:numFmt w:val="none"/>
       <w:suff w:val="nothing"/>
       <w:lvlText w:val=""/>
-      <w:lvlJc w:val="start"/>
+      <w:lvlJc w:val="left"/>
       <w:pPr>
         <w:tabs>
           <w:tab w:val="num" w:pos="0"/>
         </w:tabs>
-        <w:ind w:start="0" w:hanging="0"/>
+        <w:ind w:left="0" w:firstLine="0"/>
       </w:pPr>
     </w:lvl>
     <w:lvl w:ilvl="6">
@@ -2293,12 +2024,12 @@
       <w:numFmt w:val="none"/>
       <w:suff w:val="nothing"/>
       <w:lvlText w:val=""/>
-      <w:lvlJc w:val="start"/>
+      <w:lvlJc w:val="left"/>
       <w:pPr>
         <w:tabs>
           <w:tab w:val="num" w:pos="0"/>
         </w:tabs>
-        <w:ind w:start="0" w:hanging="0"/>
+        <w:ind w:left="0" w:firstLine="0"/>
       </w:pPr>
     </w:lvl>
     <w:lvl w:ilvl="7">
@@ -2306,12 +2037,12 @@
       <w:numFmt w:val="none"/>
       <w:suff w:val="nothing"/>
       <w:lvlText w:val=""/>
-      <w:lvlJc w:val="start"/>
+      <w:lvlJc w:val="left"/>
       <w:pPr>
         <w:tabs>
           <w:tab w:val="num" w:pos="0"/>
         </w:tabs>
-        <w:ind w:start="0" w:hanging="0"/>
+        <w:ind w:left="0" w:firstLine="0"/>
       </w:pPr>
     </w:lvl>
     <w:lvl w:ilvl="8">
@@ -2319,45 +2050,45 @@
       <w:numFmt w:val="none"/>
       <w:suff w:val="nothing"/>
       <w:lvlText w:val=""/>
-      <w:lvlJc w:val="start"/>
+      <w:lvlJc w:val="left"/>
       <w:pPr>
         <w:tabs>
           <w:tab w:val="num" w:pos="0"/>
         </w:tabs>
-        <w:ind w:start="0" w:hanging="0"/>
+        <w:ind w:left="0" w:firstLine="0"/>
       </w:pPr>
     </w:lvl>
   </w:abstractNum>
-  <w:num w:numId="1">
+  <w:num w:numId="1" w16cid:durableId="773747469">
+    <w:abstractNumId w:val="2"/>
+  </w:num>
+  <w:num w:numId="2" w16cid:durableId="535310847">
     <w:abstractNumId w:val="1"/>
   </w:num>
-  <w:num w:numId="2">
-    <w:abstractNumId w:val="2"/>
-  </w:num>
-  <w:num w:numId="3">
+  <w:num w:numId="3" w16cid:durableId="1143304445">
     <w:abstractNumId w:val="3"/>
   </w:num>
-  <w:num w:numId="4">
+  <w:num w:numId="4" w16cid:durableId="1770202458">
+    <w:abstractNumId w:val="5"/>
+  </w:num>
+  <w:num w:numId="5" w16cid:durableId="514612448">
+    <w:abstractNumId w:val="0"/>
+  </w:num>
+  <w:num w:numId="6" w16cid:durableId="120080238">
     <w:abstractNumId w:val="4"/>
   </w:num>
-  <w:num w:numId="5">
-    <w:abstractNumId w:val="5"/>
-  </w:num>
-  <w:num w:numId="6">
+  <w:num w:numId="7" w16cid:durableId="670067487">
     <w:abstractNumId w:val="6"/>
-  </w:num>
-  <w:num w:numId="7">
-    <w:abstractNumId w:val="7"/>
   </w:num>
 </w:numbering>
 </file>
 
 <file path=word/styles.xml><?xml version="1.0" encoding="utf-8"?>
-<w:styles xmlns:w="http://schemas.openxmlformats.org/wordprocessingml/2006/main" xmlns:w14="http://schemas.microsoft.com/office/word/2010/wordml" xmlns:mc="http://schemas.openxmlformats.org/markup-compatibility/2006" mc:Ignorable="w14">
+<w:styles xmlns:mc="http://schemas.openxmlformats.org/markup-compatibility/2006" xmlns:r="http://schemas.openxmlformats.org/officeDocument/2006/relationships" xmlns:w="http://schemas.openxmlformats.org/wordprocessingml/2006/main" xmlns:w14="http://schemas.microsoft.com/office/word/2010/wordml" xmlns:w15="http://schemas.microsoft.com/office/word/2012/wordml" xmlns:w16cex="http://schemas.microsoft.com/office/word/2018/wordml/cex" xmlns:w16cid="http://schemas.microsoft.com/office/word/2016/wordml/cid" xmlns:w16="http://schemas.microsoft.com/office/word/2018/wordml" xmlns:w16du="http://schemas.microsoft.com/office/word/2023/wordml/word16du" xmlns:w16sdtdh="http://schemas.microsoft.com/office/word/2020/wordml/sdtdatahash" xmlns:w16sdtfl="http://schemas.microsoft.com/office/word/2024/wordml/sdtformatlock" xmlns:w16se="http://schemas.microsoft.com/office/word/2015/wordml/symex" mc:Ignorable="w14 w15 w16se w16cid w16 w16cex w16sdtdh w16sdtfl w16du">
   <w:docDefaults>
     <w:rPrDefault>
       <w:rPr>
-        <w:rFonts w:ascii="Aptos" w:hAnsi="Aptos" w:eastAsia="Aptos" w:cs="" w:asciiTheme="minorHAnsi" w:cstheme="minorBidi" w:eastAsiaTheme="minorHAnsi" w:hAnsiTheme="minorHAnsi"/>
+        <w:rFonts w:asciiTheme="minorHAnsi" w:eastAsiaTheme="minorHAnsi" w:hAnsiTheme="minorHAnsi" w:cstheme="minorBidi"/>
         <w:kern w:val="2"/>
         <w:sz w:val="24"/>
         <w:szCs w:val="24"/>
@@ -2367,21 +2098,21 @@
     </w:rPrDefault>
     <w:pPrDefault>
       <w:pPr>
-        <w:suppressAutoHyphens w:val="true"/>
+        <w:suppressAutoHyphens/>
       </w:pPr>
     </w:pPrDefault>
   </w:docDefaults>
   <w:latentStyles w:defLockedState="0" w:defUIPriority="99" w:defSemiHidden="0" w:defUnhideWhenUsed="0" w:defQFormat="0" w:count="376">
     <w:lsdException w:name="Normal" w:uiPriority="0" w:qFormat="1"/>
     <w:lsdException w:name="heading 1" w:uiPriority="9" w:qFormat="1"/>
-    <w:lsdException w:name="heading 2" w:uiPriority="9" w:semiHidden="1" w:unhideWhenUsed="1" w:qFormat="1"/>
-    <w:lsdException w:name="heading 3" w:uiPriority="9" w:semiHidden="1" w:unhideWhenUsed="1" w:qFormat="1"/>
-    <w:lsdException w:name="heading 4" w:uiPriority="9" w:semiHidden="1" w:unhideWhenUsed="1" w:qFormat="1"/>
-    <w:lsdException w:name="heading 5" w:uiPriority="9" w:semiHidden="1" w:unhideWhenUsed="1" w:qFormat="1"/>
-    <w:lsdException w:name="heading 6" w:uiPriority="9" w:semiHidden="1" w:unhideWhenUsed="1" w:qFormat="1"/>
-    <w:lsdException w:name="heading 7" w:uiPriority="9" w:semiHidden="1" w:unhideWhenUsed="1" w:qFormat="1"/>
-    <w:lsdException w:name="heading 8" w:uiPriority="9" w:semiHidden="1" w:unhideWhenUsed="1" w:qFormat="1"/>
-    <w:lsdException w:name="heading 9" w:uiPriority="9" w:semiHidden="1" w:unhideWhenUsed="1" w:qFormat="1"/>
+    <w:lsdException w:name="heading 2" w:semiHidden="1" w:uiPriority="9" w:unhideWhenUsed="1" w:qFormat="1"/>
+    <w:lsdException w:name="heading 3" w:semiHidden="1" w:uiPriority="9" w:unhideWhenUsed="1" w:qFormat="1"/>
+    <w:lsdException w:name="heading 4" w:semiHidden="1" w:uiPriority="9" w:unhideWhenUsed="1" w:qFormat="1"/>
+    <w:lsdException w:name="heading 5" w:semiHidden="1" w:uiPriority="9" w:unhideWhenUsed="1" w:qFormat="1"/>
+    <w:lsdException w:name="heading 6" w:semiHidden="1" w:uiPriority="9" w:unhideWhenUsed="1" w:qFormat="1"/>
+    <w:lsdException w:name="heading 7" w:semiHidden="1" w:uiPriority="9" w:unhideWhenUsed="1" w:qFormat="1"/>
+    <w:lsdException w:name="heading 8" w:semiHidden="1" w:uiPriority="9" w:unhideWhenUsed="1" w:qFormat="1"/>
+    <w:lsdException w:name="heading 9" w:semiHidden="1" w:uiPriority="9" w:unhideWhenUsed="1" w:qFormat="1"/>
     <w:lsdException w:name="index 1" w:semiHidden="1" w:unhideWhenUsed="1"/>
     <w:lsdException w:name="index 2" w:semiHidden="1" w:unhideWhenUsed="1"/>
     <w:lsdException w:name="index 3" w:semiHidden="1" w:unhideWhenUsed="1"/>
@@ -2391,22 +2122,22 @@
     <w:lsdException w:name="index 7" w:semiHidden="1" w:unhideWhenUsed="1"/>
     <w:lsdException w:name="index 8" w:semiHidden="1" w:unhideWhenUsed="1"/>
     <w:lsdException w:name="index 9" w:semiHidden="1" w:unhideWhenUsed="1"/>
-    <w:lsdException w:name="toc 1" w:uiPriority="39" w:semiHidden="1" w:unhideWhenUsed="1"/>
-    <w:lsdException w:name="toc 2" w:uiPriority="39" w:semiHidden="1" w:unhideWhenUsed="1"/>
-    <w:lsdException w:name="toc 3" w:uiPriority="39" w:semiHidden="1" w:unhideWhenUsed="1"/>
-    <w:lsdException w:name="toc 4" w:uiPriority="39" w:semiHidden="1" w:unhideWhenUsed="1"/>
-    <w:lsdException w:name="toc 5" w:uiPriority="39" w:semiHidden="1" w:unhideWhenUsed="1"/>
-    <w:lsdException w:name="toc 6" w:uiPriority="39" w:semiHidden="1" w:unhideWhenUsed="1"/>
-    <w:lsdException w:name="toc 7" w:uiPriority="39" w:semiHidden="1" w:unhideWhenUsed="1"/>
-    <w:lsdException w:name="toc 8" w:uiPriority="39" w:semiHidden="1" w:unhideWhenUsed="1"/>
-    <w:lsdException w:name="toc 9" w:uiPriority="39" w:semiHidden="1" w:unhideWhenUsed="1"/>
+    <w:lsdException w:name="toc 1" w:semiHidden="1" w:uiPriority="39" w:unhideWhenUsed="1"/>
+    <w:lsdException w:name="toc 2" w:semiHidden="1" w:uiPriority="39" w:unhideWhenUsed="1"/>
+    <w:lsdException w:name="toc 3" w:semiHidden="1" w:uiPriority="39" w:unhideWhenUsed="1"/>
+    <w:lsdException w:name="toc 4" w:semiHidden="1" w:uiPriority="39" w:unhideWhenUsed="1"/>
+    <w:lsdException w:name="toc 5" w:semiHidden="1" w:uiPriority="39" w:unhideWhenUsed="1"/>
+    <w:lsdException w:name="toc 6" w:semiHidden="1" w:uiPriority="39" w:unhideWhenUsed="1"/>
+    <w:lsdException w:name="toc 7" w:semiHidden="1" w:uiPriority="39" w:unhideWhenUsed="1"/>
+    <w:lsdException w:name="toc 8" w:semiHidden="1" w:uiPriority="39" w:unhideWhenUsed="1"/>
+    <w:lsdException w:name="toc 9" w:semiHidden="1" w:uiPriority="39" w:unhideWhenUsed="1"/>
     <w:lsdException w:name="Normal Indent" w:semiHidden="1" w:unhideWhenUsed="1"/>
     <w:lsdException w:name="footnote text" w:semiHidden="1" w:unhideWhenUsed="1"/>
     <w:lsdException w:name="annotation text" w:semiHidden="1" w:unhideWhenUsed="1"/>
     <w:lsdException w:name="header" w:semiHidden="1" w:unhideWhenUsed="1"/>
     <w:lsdException w:name="footer" w:semiHidden="1" w:unhideWhenUsed="1"/>
     <w:lsdException w:name="index heading" w:semiHidden="1" w:unhideWhenUsed="1"/>
-    <w:lsdException w:name="caption" w:uiPriority="35" w:semiHidden="1" w:unhideWhenUsed="1" w:qFormat="1"/>
+    <w:lsdException w:name="caption" w:semiHidden="1" w:uiPriority="35" w:unhideWhenUsed="1" w:qFormat="1"/>
     <w:lsdException w:name="table of figures" w:semiHidden="1" w:unhideWhenUsed="1"/>
     <w:lsdException w:name="envelope address" w:semiHidden="1" w:unhideWhenUsed="1"/>
     <w:lsdException w:name="envelope return" w:semiHidden="1" w:unhideWhenUsed="1"/>
@@ -2437,7 +2168,7 @@
     <w:lsdException w:name="Title" w:uiPriority="10" w:qFormat="1"/>
     <w:lsdException w:name="Closing" w:semiHidden="1" w:unhideWhenUsed="1"/>
     <w:lsdException w:name="Signature" w:semiHidden="1" w:unhideWhenUsed="1"/>
-    <w:lsdException w:name="Default Paragraph Font" w:uiPriority="1" w:semiHidden="1" w:unhideWhenUsed="1"/>
+    <w:lsdException w:name="Default Paragraph Font" w:semiHidden="1" w:uiPriority="1" w:unhideWhenUsed="1"/>
     <w:lsdException w:name="Body Text" w:semiHidden="1" w:unhideWhenUsed="1"/>
     <w:lsdException w:name="Body Text Indent" w:semiHidden="1" w:unhideWhenUsed="1"/>
     <w:lsdException w:name="List Continue" w:semiHidden="1" w:unhideWhenUsed="1"/>
@@ -2637,8 +2368,8 @@
     <w:lsdException w:name="Subtle Reference" w:uiPriority="31" w:qFormat="1"/>
     <w:lsdException w:name="Intense Reference" w:uiPriority="32" w:qFormat="1"/>
     <w:lsdException w:name="Book Title" w:uiPriority="33" w:qFormat="1"/>
-    <w:lsdException w:name="Bibliography" w:uiPriority="37" w:semiHidden="1" w:unhideWhenUsed="1"/>
-    <w:lsdException w:name="TOC Heading" w:uiPriority="39" w:semiHidden="1" w:unhideWhenUsed="1" w:qFormat="1"/>
+    <w:lsdException w:name="Bibliography" w:semiHidden="1" w:uiPriority="37" w:unhideWhenUsed="1"/>
+    <w:lsdException w:name="TOC Heading" w:semiHidden="1" w:uiPriority="39" w:unhideWhenUsed="1" w:qFormat="1"/>
     <w:lsdException w:name="Plain Table 1" w:uiPriority="41"/>
     <w:lsdException w:name="Plain Table 2" w:uiPriority="42"/>
     <w:lsdException w:name="Plain Table 3" w:uiPriority="43"/>
@@ -2749,25 +2480,12 @@
     <w:lsdException w:name="Unresolved Mention" w:semiHidden="1" w:unhideWhenUsed="1"/>
     <w:lsdException w:name="Smart Link" w:semiHidden="1" w:unhideWhenUsed="1"/>
   </w:latentStyles>
-  <w:style w:type="paragraph" w:styleId="Normal" w:default="1">
+  <w:style w:type="paragraph" w:default="1" w:styleId="Normal">
     <w:name w:val="Normal"/>
     <w:qFormat/>
     <w:pPr>
-      <w:widowControl/>
-      <w:suppressAutoHyphens w:val="true"/>
-      <w:bidi w:val="0"/>
-      <w:spacing w:lineRule="auto" w:line="278" w:before="0" w:after="160"/>
-      <w:jc w:val="start"/>
+      <w:spacing w:after="160" w:line="278" w:lineRule="auto"/>
     </w:pPr>
-    <w:rPr>
-      <w:rFonts w:ascii="Aptos" w:hAnsi="Aptos" w:eastAsia="Aptos" w:cs="" w:asciiTheme="minorHAnsi" w:cstheme="minorBidi" w:eastAsiaTheme="minorHAnsi" w:hAnsiTheme="minorHAnsi"/>
-      <w:color w:val="auto"/>
-      <w:kern w:val="2"/>
-      <w:sz w:val="24"/>
-      <w:szCs w:val="24"/>
-      <w:lang w:val="en-ZA" w:eastAsia="en-US" w:bidi="ar-SA"/>
-      <w14:ligatures w14:val="standardContextual"/>
-    </w:rPr>
   </w:style>
   <w:style w:type="paragraph" w:styleId="Heading1">
     <w:name w:val="heading 1"/>
@@ -2776,16 +2494,16 @@
     <w:link w:val="Heading1Char"/>
     <w:uiPriority w:val="9"/>
     <w:qFormat/>
-    <w:rsid w:val="0046671c"/>
+    <w:rsid w:val="0046671C"/>
     <w:pPr>
-      <w:keepNext w:val="true"/>
+      <w:keepNext/>
       <w:keepLines/>
       <w:spacing w:before="360" w:after="80"/>
       <w:outlineLvl w:val="0"/>
     </w:pPr>
     <w:rPr>
-      <w:rFonts w:ascii="Aptos Display" w:hAnsi="Aptos Display" w:eastAsia="" w:cs="" w:asciiTheme="majorHAnsi" w:cstheme="majorBidi" w:eastAsiaTheme="majorEastAsia" w:hAnsiTheme="majorHAnsi"/>
-      <w:color w:themeColor="accent1" w:themeShade="bf" w:val="0F4761"/>
+      <w:rFonts w:asciiTheme="majorHAnsi" w:eastAsiaTheme="majorEastAsia" w:hAnsiTheme="majorHAnsi" w:cstheme="majorBidi"/>
+      <w:color w:val="0F4761" w:themeColor="accent1" w:themeShade="BF"/>
       <w:sz w:val="40"/>
       <w:szCs w:val="40"/>
     </w:rPr>
@@ -2798,16 +2516,16 @@
     <w:uiPriority w:val="9"/>
     <w:unhideWhenUsed/>
     <w:qFormat/>
-    <w:rsid w:val="0046671c"/>
+    <w:rsid w:val="0046671C"/>
     <w:pPr>
-      <w:keepNext w:val="true"/>
+      <w:keepNext/>
       <w:keepLines/>
       <w:spacing w:before="160" w:after="80"/>
       <w:outlineLvl w:val="1"/>
     </w:pPr>
     <w:rPr>
-      <w:rFonts w:ascii="Aptos Display" w:hAnsi="Aptos Display" w:eastAsia="" w:cs="" w:asciiTheme="majorHAnsi" w:cstheme="majorBidi" w:eastAsiaTheme="majorEastAsia" w:hAnsiTheme="majorHAnsi"/>
-      <w:color w:themeColor="accent1" w:themeShade="bf" w:val="0F4761"/>
+      <w:rFonts w:asciiTheme="majorHAnsi" w:eastAsiaTheme="majorEastAsia" w:hAnsiTheme="majorHAnsi" w:cstheme="majorBidi"/>
+      <w:color w:val="0F4761" w:themeColor="accent1" w:themeShade="BF"/>
       <w:sz w:val="32"/>
       <w:szCs w:val="32"/>
     </w:rPr>
@@ -2821,16 +2539,16 @@
     <w:semiHidden/>
     <w:unhideWhenUsed/>
     <w:qFormat/>
-    <w:rsid w:val="0046671c"/>
+    <w:rsid w:val="0046671C"/>
     <w:pPr>
-      <w:keepNext w:val="true"/>
+      <w:keepNext/>
       <w:keepLines/>
       <w:spacing w:before="160" w:after="80"/>
       <w:outlineLvl w:val="2"/>
     </w:pPr>
     <w:rPr>
-      <w:rFonts w:eastAsia="" w:cs="" w:cstheme="majorBidi" w:eastAsiaTheme="majorEastAsia"/>
-      <w:color w:themeColor="accent1" w:themeShade="bf" w:val="0F4761"/>
+      <w:rFonts w:eastAsiaTheme="majorEastAsia" w:cstheme="majorBidi"/>
+      <w:color w:val="0F4761" w:themeColor="accent1" w:themeShade="BF"/>
       <w:sz w:val="28"/>
       <w:szCs w:val="28"/>
     </w:rPr>
@@ -2844,18 +2562,18 @@
     <w:semiHidden/>
     <w:unhideWhenUsed/>
     <w:qFormat/>
-    <w:rsid w:val="0046671c"/>
+    <w:rsid w:val="0046671C"/>
     <w:pPr>
-      <w:keepNext w:val="true"/>
+      <w:keepNext/>
       <w:keepLines/>
       <w:spacing w:before="80" w:after="40"/>
       <w:outlineLvl w:val="3"/>
     </w:pPr>
     <w:rPr>
-      <w:rFonts w:eastAsia="" w:cs="" w:cstheme="majorBidi" w:eastAsiaTheme="majorEastAsia"/>
+      <w:rFonts w:eastAsiaTheme="majorEastAsia" w:cstheme="majorBidi"/>
       <w:i/>
       <w:iCs/>
-      <w:color w:themeColor="accent1" w:themeShade="bf" w:val="0F4761"/>
+      <w:color w:val="0F4761" w:themeColor="accent1" w:themeShade="BF"/>
     </w:rPr>
   </w:style>
   <w:style w:type="paragraph" w:styleId="Heading5">
@@ -2867,16 +2585,16 @@
     <w:semiHidden/>
     <w:unhideWhenUsed/>
     <w:qFormat/>
-    <w:rsid w:val="0046671c"/>
+    <w:rsid w:val="0046671C"/>
     <w:pPr>
-      <w:keepNext w:val="true"/>
+      <w:keepNext/>
       <w:keepLines/>
       <w:spacing w:before="80" w:after="40"/>
       <w:outlineLvl w:val="4"/>
     </w:pPr>
     <w:rPr>
-      <w:rFonts w:eastAsia="" w:cs="" w:cstheme="majorBidi" w:eastAsiaTheme="majorEastAsia"/>
-      <w:color w:themeColor="accent1" w:themeShade="bf" w:val="0F4761"/>
+      <w:rFonts w:eastAsiaTheme="majorEastAsia" w:cstheme="majorBidi"/>
+      <w:color w:val="0F4761" w:themeColor="accent1" w:themeShade="BF"/>
     </w:rPr>
   </w:style>
   <w:style w:type="paragraph" w:styleId="Heading6">
@@ -2888,18 +2606,18 @@
     <w:semiHidden/>
     <w:unhideWhenUsed/>
     <w:qFormat/>
-    <w:rsid w:val="0046671c"/>
+    <w:rsid w:val="0046671C"/>
     <w:pPr>
-      <w:keepNext w:val="true"/>
+      <w:keepNext/>
       <w:keepLines/>
       <w:spacing w:before="40" w:after="0"/>
       <w:outlineLvl w:val="5"/>
     </w:pPr>
     <w:rPr>
-      <w:rFonts w:eastAsia="" w:cs="" w:cstheme="majorBidi" w:eastAsiaTheme="majorEastAsia"/>
+      <w:rFonts w:eastAsiaTheme="majorEastAsia" w:cstheme="majorBidi"/>
       <w:i/>
       <w:iCs/>
-      <w:color w:themeColor="text1" w:themeTint="a6" w:val="595959"/>
+      <w:color w:val="595959" w:themeColor="text1" w:themeTint="A6"/>
     </w:rPr>
   </w:style>
   <w:style w:type="paragraph" w:styleId="Heading7">
@@ -2911,16 +2629,16 @@
     <w:semiHidden/>
     <w:unhideWhenUsed/>
     <w:qFormat/>
-    <w:rsid w:val="0046671c"/>
+    <w:rsid w:val="0046671C"/>
     <w:pPr>
-      <w:keepNext w:val="true"/>
+      <w:keepNext/>
       <w:keepLines/>
       <w:spacing w:before="40" w:after="0"/>
       <w:outlineLvl w:val="6"/>
     </w:pPr>
     <w:rPr>
-      <w:rFonts w:eastAsia="" w:cs="" w:cstheme="majorBidi" w:eastAsiaTheme="majorEastAsia"/>
-      <w:color w:themeColor="text1" w:themeTint="a6" w:val="595959"/>
+      <w:rFonts w:eastAsiaTheme="majorEastAsia" w:cstheme="majorBidi"/>
+      <w:color w:val="595959" w:themeColor="text1" w:themeTint="A6"/>
     </w:rPr>
   </w:style>
   <w:style w:type="paragraph" w:styleId="Heading8">
@@ -2932,18 +2650,18 @@
     <w:semiHidden/>
     <w:unhideWhenUsed/>
     <w:qFormat/>
-    <w:rsid w:val="0046671c"/>
+    <w:rsid w:val="0046671C"/>
     <w:pPr>
-      <w:keepNext w:val="true"/>
+      <w:keepNext/>
       <w:keepLines/>
-      <w:spacing w:before="0" w:after="0"/>
+      <w:spacing w:after="0"/>
       <w:outlineLvl w:val="7"/>
     </w:pPr>
     <w:rPr>
-      <w:rFonts w:eastAsia="" w:cs="" w:cstheme="majorBidi" w:eastAsiaTheme="majorEastAsia"/>
+      <w:rFonts w:eastAsiaTheme="majorEastAsia" w:cstheme="majorBidi"/>
       <w:i/>
       <w:iCs/>
-      <w:color w:themeColor="text1" w:themeTint="d8" w:val="272727"/>
+      <w:color w:val="272727" w:themeColor="text1" w:themeTint="D8"/>
     </w:rPr>
   </w:style>
   <w:style w:type="paragraph" w:styleId="Heading9">
@@ -2955,417 +2673,23 @@
     <w:semiHidden/>
     <w:unhideWhenUsed/>
     <w:qFormat/>
-    <w:rsid w:val="0046671c"/>
+    <w:rsid w:val="0046671C"/>
     <w:pPr>
-      <w:keepNext w:val="true"/>
+      <w:keepNext/>
       <w:keepLines/>
-      <w:spacing w:before="0" w:after="0"/>
+      <w:spacing w:after="0"/>
       <w:outlineLvl w:val="8"/>
     </w:pPr>
     <w:rPr>
-      <w:rFonts w:eastAsia="" w:cs="" w:cstheme="majorBidi" w:eastAsiaTheme="majorEastAsia"/>
-      <w:color w:themeColor="text1" w:themeTint="d8" w:val="272727"/>
-    </w:rPr>
-  </w:style>
-  <w:style w:type="character" w:styleId="DefaultParagraphFont" w:default="1">
+      <w:rFonts w:eastAsiaTheme="majorEastAsia" w:cstheme="majorBidi"/>
+      <w:color w:val="272727" w:themeColor="text1" w:themeTint="D8"/>
+    </w:rPr>
+  </w:style>
+  <w:style w:type="character" w:default="1" w:styleId="DefaultParagraphFont">
     <w:name w:val="Default Paragraph Font"/>
     <w:uiPriority w:val="1"/>
-    <w:unhideWhenUsed/>
-    <w:qFormat/>
-    <w:rPr/>
-  </w:style>
-  <w:style w:type="character" w:styleId="Heading1Char" w:customStyle="1">
-    <w:name w:val="Heading 1 Char"/>
-    <w:basedOn w:val="DefaultParagraphFont"/>
-    <w:link w:val="Heading1"/>
-    <w:uiPriority w:val="9"/>
-    <w:qFormat/>
-    <w:rsid w:val="0046671c"/>
-    <w:rPr>
-      <w:rFonts w:ascii="Aptos Display" w:hAnsi="Aptos Display" w:eastAsia="" w:cs="" w:asciiTheme="majorHAnsi" w:cstheme="majorBidi" w:eastAsiaTheme="majorEastAsia" w:hAnsiTheme="majorHAnsi"/>
-      <w:color w:themeColor="accent1" w:themeShade="bf" w:val="0F4761"/>
-      <w:sz w:val="40"/>
-      <w:szCs w:val="40"/>
-    </w:rPr>
-  </w:style>
-  <w:style w:type="character" w:styleId="Heading2Char" w:customStyle="1">
-    <w:name w:val="Heading 2 Char"/>
-    <w:basedOn w:val="DefaultParagraphFont"/>
-    <w:link w:val="Heading2"/>
-    <w:uiPriority w:val="9"/>
-    <w:qFormat/>
-    <w:rsid w:val="0046671c"/>
-    <w:rPr>
-      <w:rFonts w:ascii="Aptos Display" w:hAnsi="Aptos Display" w:eastAsia="" w:cs="" w:asciiTheme="majorHAnsi" w:cstheme="majorBidi" w:eastAsiaTheme="majorEastAsia" w:hAnsiTheme="majorHAnsi"/>
-      <w:color w:themeColor="accent1" w:themeShade="bf" w:val="0F4761"/>
-      <w:sz w:val="32"/>
-      <w:szCs w:val="32"/>
-    </w:rPr>
-  </w:style>
-  <w:style w:type="character" w:styleId="Heading3Char" w:customStyle="1">
-    <w:name w:val="Heading 3 Char"/>
-    <w:basedOn w:val="DefaultParagraphFont"/>
-    <w:link w:val="Heading3"/>
-    <w:uiPriority w:val="9"/>
-    <w:semiHidden/>
-    <w:qFormat/>
-    <w:rsid w:val="0046671c"/>
-    <w:rPr>
-      <w:rFonts w:eastAsia="" w:cs="" w:cstheme="majorBidi" w:eastAsiaTheme="majorEastAsia"/>
-      <w:color w:themeColor="accent1" w:themeShade="bf" w:val="0F4761"/>
-      <w:sz w:val="28"/>
-      <w:szCs w:val="28"/>
-    </w:rPr>
-  </w:style>
-  <w:style w:type="character" w:styleId="Heading4Char" w:customStyle="1">
-    <w:name w:val="Heading 4 Char"/>
-    <w:basedOn w:val="DefaultParagraphFont"/>
-    <w:link w:val="Heading4"/>
-    <w:uiPriority w:val="9"/>
-    <w:semiHidden/>
-    <w:qFormat/>
-    <w:rsid w:val="0046671c"/>
-    <w:rPr>
-      <w:rFonts w:eastAsia="" w:cs="" w:cstheme="majorBidi" w:eastAsiaTheme="majorEastAsia"/>
-      <w:i/>
-      <w:iCs/>
-      <w:color w:themeColor="accent1" w:themeShade="bf" w:val="0F4761"/>
-    </w:rPr>
-  </w:style>
-  <w:style w:type="character" w:styleId="Heading5Char" w:customStyle="1">
-    <w:name w:val="Heading 5 Char"/>
-    <w:basedOn w:val="DefaultParagraphFont"/>
-    <w:link w:val="Heading5"/>
-    <w:uiPriority w:val="9"/>
-    <w:semiHidden/>
-    <w:qFormat/>
-    <w:rsid w:val="0046671c"/>
-    <w:rPr>
-      <w:rFonts w:eastAsia="" w:cs="" w:cstheme="majorBidi" w:eastAsiaTheme="majorEastAsia"/>
-      <w:color w:themeColor="accent1" w:themeShade="bf" w:val="0F4761"/>
-    </w:rPr>
-  </w:style>
-  <w:style w:type="character" w:styleId="Heading6Char" w:customStyle="1">
-    <w:name w:val="Heading 6 Char"/>
-    <w:basedOn w:val="DefaultParagraphFont"/>
-    <w:link w:val="Heading6"/>
-    <w:uiPriority w:val="9"/>
-    <w:semiHidden/>
-    <w:qFormat/>
-    <w:rsid w:val="0046671c"/>
-    <w:rPr>
-      <w:rFonts w:eastAsia="" w:cs="" w:cstheme="majorBidi" w:eastAsiaTheme="majorEastAsia"/>
-      <w:i/>
-      <w:iCs/>
-      <w:color w:themeColor="text1" w:themeTint="a6" w:val="595959"/>
-    </w:rPr>
-  </w:style>
-  <w:style w:type="character" w:styleId="Heading7Char" w:customStyle="1">
-    <w:name w:val="Heading 7 Char"/>
-    <w:basedOn w:val="DefaultParagraphFont"/>
-    <w:link w:val="Heading7"/>
-    <w:uiPriority w:val="9"/>
-    <w:semiHidden/>
-    <w:qFormat/>
-    <w:rsid w:val="0046671c"/>
-    <w:rPr>
-      <w:rFonts w:eastAsia="" w:cs="" w:cstheme="majorBidi" w:eastAsiaTheme="majorEastAsia"/>
-      <w:color w:themeColor="text1" w:themeTint="a6" w:val="595959"/>
-    </w:rPr>
-  </w:style>
-  <w:style w:type="character" w:styleId="Heading8Char" w:customStyle="1">
-    <w:name w:val="Heading 8 Char"/>
-    <w:basedOn w:val="DefaultParagraphFont"/>
-    <w:link w:val="Heading8"/>
-    <w:uiPriority w:val="9"/>
-    <w:semiHidden/>
-    <w:qFormat/>
-    <w:rsid w:val="0046671c"/>
-    <w:rPr>
-      <w:rFonts w:eastAsia="" w:cs="" w:cstheme="majorBidi" w:eastAsiaTheme="majorEastAsia"/>
-      <w:i/>
-      <w:iCs/>
-      <w:color w:themeColor="text1" w:themeTint="d8" w:val="272727"/>
-    </w:rPr>
-  </w:style>
-  <w:style w:type="character" w:styleId="Heading9Char" w:customStyle="1">
-    <w:name w:val="Heading 9 Char"/>
-    <w:basedOn w:val="DefaultParagraphFont"/>
-    <w:link w:val="Heading9"/>
-    <w:uiPriority w:val="9"/>
-    <w:semiHidden/>
-    <w:qFormat/>
-    <w:rsid w:val="0046671c"/>
-    <w:rPr>
-      <w:rFonts w:eastAsia="" w:cs="" w:cstheme="majorBidi" w:eastAsiaTheme="majorEastAsia"/>
-      <w:color w:themeColor="text1" w:themeTint="d8" w:val="272727"/>
-    </w:rPr>
-  </w:style>
-  <w:style w:type="character" w:styleId="TitleChar" w:customStyle="1">
-    <w:name w:val="Title Char"/>
-    <w:basedOn w:val="DefaultParagraphFont"/>
-    <w:link w:val="Title"/>
-    <w:uiPriority w:val="10"/>
-    <w:qFormat/>
-    <w:rsid w:val="0046671c"/>
-    <w:rPr>
-      <w:rFonts w:ascii="Aptos Display" w:hAnsi="Aptos Display" w:eastAsia="" w:cs="" w:asciiTheme="majorHAnsi" w:cstheme="majorBidi" w:eastAsiaTheme="majorEastAsia" w:hAnsiTheme="majorHAnsi"/>
-      <w:spacing w:val="-10"/>
-      <w:kern w:val="2"/>
-      <w:sz w:val="56"/>
-      <w:szCs w:val="56"/>
-    </w:rPr>
-  </w:style>
-  <w:style w:type="character" w:styleId="SubtitleChar" w:customStyle="1">
-    <w:name w:val="Subtitle Char"/>
-    <w:basedOn w:val="DefaultParagraphFont"/>
-    <w:link w:val="Subtitle"/>
-    <w:uiPriority w:val="11"/>
-    <w:qFormat/>
-    <w:rsid w:val="0046671c"/>
-    <w:rPr>
-      <w:rFonts w:eastAsia="" w:cs="" w:cstheme="majorBidi" w:eastAsiaTheme="majorEastAsia"/>
-      <w:color w:themeColor="text1" w:themeTint="a6" w:val="595959"/>
-      <w:spacing w:val="15"/>
-      <w:sz w:val="28"/>
-      <w:szCs w:val="28"/>
-    </w:rPr>
-  </w:style>
-  <w:style w:type="character" w:styleId="QuoteChar" w:customStyle="1">
-    <w:name w:val="Quote Char"/>
-    <w:basedOn w:val="DefaultParagraphFont"/>
-    <w:link w:val="Quote"/>
-    <w:uiPriority w:val="29"/>
-    <w:qFormat/>
-    <w:rsid w:val="0046671c"/>
-    <w:rPr>
-      <w:i/>
-      <w:iCs/>
-      <w:color w:themeColor="text1" w:themeTint="bf" w:val="404040"/>
-    </w:rPr>
-  </w:style>
-  <w:style w:type="character" w:styleId="IntenseEmphasis">
-    <w:name w:val="Intense Emphasis"/>
-    <w:basedOn w:val="DefaultParagraphFont"/>
-    <w:uiPriority w:val="21"/>
-    <w:qFormat/>
-    <w:rsid w:val="0046671c"/>
-    <w:rPr>
-      <w:i/>
-      <w:iCs/>
-      <w:color w:themeColor="accent1" w:themeShade="bf" w:val="0F4761"/>
-    </w:rPr>
-  </w:style>
-  <w:style w:type="character" w:styleId="IntenseQuoteChar" w:customStyle="1">
-    <w:name w:val="Intense Quote Char"/>
-    <w:basedOn w:val="DefaultParagraphFont"/>
-    <w:link w:val="IntenseQuote"/>
-    <w:uiPriority w:val="30"/>
-    <w:qFormat/>
-    <w:rsid w:val="0046671c"/>
-    <w:rPr>
-      <w:i/>
-      <w:iCs/>
-      <w:color w:themeColor="accent1" w:themeShade="bf" w:val="0F4761"/>
-    </w:rPr>
-  </w:style>
-  <w:style w:type="character" w:styleId="IntenseReference">
-    <w:name w:val="Intense Reference"/>
-    <w:basedOn w:val="DefaultParagraphFont"/>
-    <w:uiPriority w:val="32"/>
-    <w:qFormat/>
-    <w:rsid w:val="0046671c"/>
-    <w:rPr>
-      <w:b/>
-      <w:bCs/>
-      <w:smallCaps/>
-      <w:color w:themeColor="accent1" w:themeShade="bf" w:val="0F4761"/>
-      <w:spacing w:val="5"/>
-    </w:rPr>
-  </w:style>
-  <w:style w:type="character" w:styleId="Bulletsuser" w:customStyle="1">
-    <w:name w:val="Bullets (user)"/>
-    <w:qFormat/>
-    <w:rPr>
-      <w:rFonts w:ascii="OpenSymbol" w:hAnsi="OpenSymbol" w:eastAsia="OpenSymbol" w:cs="OpenSymbol"/>
-    </w:rPr>
-  </w:style>
-  <w:style w:type="character" w:styleId="Hyperlink">
-    <w:name w:val="Hyperlink"/>
-    <w:basedOn w:val="DefaultParagraphFont"/>
-    <w:uiPriority w:val="99"/>
-    <w:unhideWhenUsed/>
-    <w:rsid w:val="00052255"/>
-    <w:rPr>
-      <w:color w:themeColor="hyperlink" w:val="467886"/>
-      <w:u w:val="single"/>
-    </w:rPr>
-  </w:style>
-  <w:style w:type="character" w:styleId="UnresolvedMention">
-    <w:name w:val="Unresolved Mention"/>
-    <w:basedOn w:val="DefaultParagraphFont"/>
-    <w:uiPriority w:val="99"/>
     <w:semiHidden/>
     <w:unhideWhenUsed/>
-    <w:qFormat/>
-    <w:rsid w:val="00052255"/>
-    <w:rPr>
-      <w:color w:val="605E5C"/>
-      <w:shd w:fill="E1DFDD" w:val="clear"/>
-    </w:rPr>
-  </w:style>
-  <w:style w:type="paragraph" w:styleId="Heading" w:customStyle="1">
-    <w:name w:val="Heading"/>
-    <w:basedOn w:val="Normal"/>
-    <w:next w:val="BodyText"/>
-    <w:qFormat/>
-    <w:pPr>
-      <w:keepNext w:val="true"/>
-      <w:spacing w:before="240" w:after="120"/>
-    </w:pPr>
-    <w:rPr>
-      <w:rFonts w:ascii="Liberation Sans" w:hAnsi="Liberation Sans" w:eastAsia="Noto Sans CJK SC" w:cs="Noto Sans Devanagari"/>
-      <w:sz w:val="28"/>
-      <w:szCs w:val="28"/>
-    </w:rPr>
-  </w:style>
-  <w:style w:type="paragraph" w:styleId="BodyText">
-    <w:name w:val="Body Text"/>
-    <w:basedOn w:val="Normal"/>
-    <w:pPr>
-      <w:spacing w:lineRule="auto" w:line="276" w:before="0" w:after="140"/>
-    </w:pPr>
-    <w:rPr/>
-  </w:style>
-  <w:style w:type="paragraph" w:styleId="List">
-    <w:name w:val="List"/>
-    <w:basedOn w:val="BodyText"/>
-    <w:pPr/>
-    <w:rPr>
-      <w:rFonts w:cs="Noto Sans Devanagari"/>
-    </w:rPr>
-  </w:style>
-  <w:style w:type="paragraph" w:styleId="Caption">
-    <w:name w:val="caption"/>
-    <w:basedOn w:val="Normal"/>
-    <w:qFormat/>
-    <w:pPr>
-      <w:suppressLineNumbers/>
-      <w:spacing w:before="120" w:after="120"/>
-    </w:pPr>
-    <w:rPr>
-      <w:rFonts w:cs="Noto Sans Devanagari"/>
-      <w:i/>
-      <w:iCs/>
-    </w:rPr>
-  </w:style>
-  <w:style w:type="paragraph" w:styleId="Index" w:customStyle="1">
-    <w:name w:val="Index"/>
-    <w:basedOn w:val="Normal"/>
-    <w:qFormat/>
-    <w:pPr>
-      <w:suppressLineNumbers/>
-    </w:pPr>
-    <w:rPr>
-      <w:rFonts w:cs="Noto Sans Devanagari"/>
-    </w:rPr>
-  </w:style>
-  <w:style w:type="paragraph" w:styleId="Title">
-    <w:name w:val="Title"/>
-    <w:basedOn w:val="Normal"/>
-    <w:next w:val="Normal"/>
-    <w:link w:val="TitleChar"/>
-    <w:uiPriority w:val="10"/>
-    <w:qFormat/>
-    <w:rsid w:val="0046671c"/>
-    <w:pPr>
-      <w:spacing w:lineRule="auto" w:line="240" w:before="0" w:after="80"/>
-      <w:contextualSpacing/>
-    </w:pPr>
-    <w:rPr>
-      <w:rFonts w:ascii="Aptos Display" w:hAnsi="Aptos Display" w:eastAsia="" w:cs="" w:asciiTheme="majorHAnsi" w:cstheme="majorBidi" w:eastAsiaTheme="majorEastAsia" w:hAnsiTheme="majorHAnsi"/>
-      <w:spacing w:val="-10"/>
-      <w:sz w:val="56"/>
-      <w:szCs w:val="56"/>
-    </w:rPr>
-  </w:style>
-  <w:style w:type="paragraph" w:styleId="Subtitle">
-    <w:name w:val="Subtitle"/>
-    <w:basedOn w:val="Normal"/>
-    <w:next w:val="Normal"/>
-    <w:link w:val="SubtitleChar"/>
-    <w:uiPriority w:val="11"/>
-    <w:qFormat/>
-    <w:rsid w:val="0046671c"/>
-    <w:pPr/>
-    <w:rPr>
-      <w:rFonts w:eastAsia="" w:cs="" w:cstheme="majorBidi" w:eastAsiaTheme="majorEastAsia"/>
-      <w:color w:themeColor="text1" w:themeTint="a6" w:val="595959"/>
-      <w:spacing w:val="15"/>
-      <w:sz w:val="28"/>
-      <w:szCs w:val="28"/>
-    </w:rPr>
-  </w:style>
-  <w:style w:type="paragraph" w:styleId="Quote">
-    <w:name w:val="Quote"/>
-    <w:basedOn w:val="Normal"/>
-    <w:next w:val="Normal"/>
-    <w:link w:val="QuoteChar"/>
-    <w:uiPriority w:val="29"/>
-    <w:qFormat/>
-    <w:rsid w:val="0046671c"/>
-    <w:pPr>
-      <w:spacing w:before="160" w:after="160"/>
-      <w:jc w:val="center"/>
-    </w:pPr>
-    <w:rPr>
-      <w:i/>
-      <w:iCs/>
-      <w:color w:themeColor="text1" w:themeTint="bf" w:val="404040"/>
-    </w:rPr>
-  </w:style>
-  <w:style w:type="paragraph" w:styleId="ListParagraph">
-    <w:name w:val="List Paragraph"/>
-    <w:basedOn w:val="Normal"/>
-    <w:uiPriority w:val="34"/>
-    <w:qFormat/>
-    <w:rsid w:val="0046671c"/>
-    <w:pPr>
-      <w:spacing w:before="0" w:after="160"/>
-      <w:ind w:start="720"/>
-      <w:contextualSpacing/>
-    </w:pPr>
-    <w:rPr/>
-  </w:style>
-  <w:style w:type="paragraph" w:styleId="IntenseQuote">
-    <w:name w:val="Intense Quote"/>
-    <w:basedOn w:val="Normal"/>
-    <w:next w:val="Normal"/>
-    <w:link w:val="IntenseQuoteChar"/>
-    <w:uiPriority w:val="30"/>
-    <w:qFormat/>
-    <w:rsid w:val="0046671c"/>
-    <w:pPr>
-      <w:pBdr>
-        <w:top w:val="single" w:sz="4" w:space="10" w:color="0F4761" w:themeColor="accent1" w:themeShade="bf"/>
-        <w:bottom w:val="single" w:sz="4" w:space="10" w:color="0F4761" w:themeColor="accent1" w:themeShade="bf"/>
-      </w:pBdr>
-      <w:spacing w:before="360" w:after="360"/>
-      <w:ind w:start="864" w:end="864"/>
-      <w:jc w:val="center"/>
-    </w:pPr>
-    <w:rPr>
-      <w:i/>
-      <w:iCs/>
-      <w:color w:themeColor="accent1" w:themeShade="bf" w:val="0F4761"/>
-    </w:rPr>
-  </w:style>
-  <w:style w:type="numbering" w:styleId="NoList" w:default="1">
-    <w:name w:val="No List"/>
-    <w:uiPriority w:val="99"/>
-    <w:semiHidden/>
-    <w:unhideWhenUsed/>
-    <w:qFormat/>
   </w:style>
   <w:style w:type="table" w:default="1" w:styleId="TableNormal">
     <w:name w:val="Normal Table"/>
@@ -3373,6 +2697,7 @@
     <w:semiHidden/>
     <w:unhideWhenUsed/>
     <w:tblPr>
+      <w:tblInd w:w="0" w:type="dxa"/>
       <w:tblCellMar>
         <w:top w:w="0" w:type="dxa"/>
         <w:left w:w="108" w:type="dxa"/>
@@ -3381,11 +2706,398 @@
       </w:tblCellMar>
     </w:tblPr>
   </w:style>
+  <w:style w:type="numbering" w:default="1" w:styleId="NoList">
+    <w:name w:val="No List"/>
+    <w:uiPriority w:val="99"/>
+    <w:semiHidden/>
+    <w:unhideWhenUsed/>
+  </w:style>
+  <w:style w:type="character" w:customStyle="1" w:styleId="Heading1Char">
+    <w:name w:val="Heading 1 Char"/>
+    <w:basedOn w:val="DefaultParagraphFont"/>
+    <w:link w:val="Heading1"/>
+    <w:uiPriority w:val="9"/>
+    <w:qFormat/>
+    <w:rsid w:val="0046671C"/>
+    <w:rPr>
+      <w:rFonts w:asciiTheme="majorHAnsi" w:eastAsiaTheme="majorEastAsia" w:hAnsiTheme="majorHAnsi" w:cstheme="majorBidi"/>
+      <w:color w:val="0F4761" w:themeColor="accent1" w:themeShade="BF"/>
+      <w:sz w:val="40"/>
+      <w:szCs w:val="40"/>
+    </w:rPr>
+  </w:style>
+  <w:style w:type="character" w:customStyle="1" w:styleId="Heading2Char">
+    <w:name w:val="Heading 2 Char"/>
+    <w:basedOn w:val="DefaultParagraphFont"/>
+    <w:link w:val="Heading2"/>
+    <w:uiPriority w:val="9"/>
+    <w:qFormat/>
+    <w:rsid w:val="0046671C"/>
+    <w:rPr>
+      <w:rFonts w:asciiTheme="majorHAnsi" w:eastAsiaTheme="majorEastAsia" w:hAnsiTheme="majorHAnsi" w:cstheme="majorBidi"/>
+      <w:color w:val="0F4761" w:themeColor="accent1" w:themeShade="BF"/>
+      <w:sz w:val="32"/>
+      <w:szCs w:val="32"/>
+    </w:rPr>
+  </w:style>
+  <w:style w:type="character" w:customStyle="1" w:styleId="Heading3Char">
+    <w:name w:val="Heading 3 Char"/>
+    <w:basedOn w:val="DefaultParagraphFont"/>
+    <w:link w:val="Heading3"/>
+    <w:uiPriority w:val="9"/>
+    <w:semiHidden/>
+    <w:qFormat/>
+    <w:rsid w:val="0046671C"/>
+    <w:rPr>
+      <w:rFonts w:eastAsiaTheme="majorEastAsia" w:cstheme="majorBidi"/>
+      <w:color w:val="0F4761" w:themeColor="accent1" w:themeShade="BF"/>
+      <w:sz w:val="28"/>
+      <w:szCs w:val="28"/>
+    </w:rPr>
+  </w:style>
+  <w:style w:type="character" w:customStyle="1" w:styleId="Heading4Char">
+    <w:name w:val="Heading 4 Char"/>
+    <w:basedOn w:val="DefaultParagraphFont"/>
+    <w:link w:val="Heading4"/>
+    <w:uiPriority w:val="9"/>
+    <w:semiHidden/>
+    <w:qFormat/>
+    <w:rsid w:val="0046671C"/>
+    <w:rPr>
+      <w:rFonts w:eastAsiaTheme="majorEastAsia" w:cstheme="majorBidi"/>
+      <w:i/>
+      <w:iCs/>
+      <w:color w:val="0F4761" w:themeColor="accent1" w:themeShade="BF"/>
+    </w:rPr>
+  </w:style>
+  <w:style w:type="character" w:customStyle="1" w:styleId="Heading5Char">
+    <w:name w:val="Heading 5 Char"/>
+    <w:basedOn w:val="DefaultParagraphFont"/>
+    <w:link w:val="Heading5"/>
+    <w:uiPriority w:val="9"/>
+    <w:semiHidden/>
+    <w:qFormat/>
+    <w:rsid w:val="0046671C"/>
+    <w:rPr>
+      <w:rFonts w:eastAsiaTheme="majorEastAsia" w:cstheme="majorBidi"/>
+      <w:color w:val="0F4761" w:themeColor="accent1" w:themeShade="BF"/>
+    </w:rPr>
+  </w:style>
+  <w:style w:type="character" w:customStyle="1" w:styleId="Heading6Char">
+    <w:name w:val="Heading 6 Char"/>
+    <w:basedOn w:val="DefaultParagraphFont"/>
+    <w:link w:val="Heading6"/>
+    <w:uiPriority w:val="9"/>
+    <w:semiHidden/>
+    <w:qFormat/>
+    <w:rsid w:val="0046671C"/>
+    <w:rPr>
+      <w:rFonts w:eastAsiaTheme="majorEastAsia" w:cstheme="majorBidi"/>
+      <w:i/>
+      <w:iCs/>
+      <w:color w:val="595959" w:themeColor="text1" w:themeTint="A6"/>
+    </w:rPr>
+  </w:style>
+  <w:style w:type="character" w:customStyle="1" w:styleId="Heading7Char">
+    <w:name w:val="Heading 7 Char"/>
+    <w:basedOn w:val="DefaultParagraphFont"/>
+    <w:link w:val="Heading7"/>
+    <w:uiPriority w:val="9"/>
+    <w:semiHidden/>
+    <w:qFormat/>
+    <w:rsid w:val="0046671C"/>
+    <w:rPr>
+      <w:rFonts w:eastAsiaTheme="majorEastAsia" w:cstheme="majorBidi"/>
+      <w:color w:val="595959" w:themeColor="text1" w:themeTint="A6"/>
+    </w:rPr>
+  </w:style>
+  <w:style w:type="character" w:customStyle="1" w:styleId="Heading8Char">
+    <w:name w:val="Heading 8 Char"/>
+    <w:basedOn w:val="DefaultParagraphFont"/>
+    <w:link w:val="Heading8"/>
+    <w:uiPriority w:val="9"/>
+    <w:semiHidden/>
+    <w:qFormat/>
+    <w:rsid w:val="0046671C"/>
+    <w:rPr>
+      <w:rFonts w:eastAsiaTheme="majorEastAsia" w:cstheme="majorBidi"/>
+      <w:i/>
+      <w:iCs/>
+      <w:color w:val="272727" w:themeColor="text1" w:themeTint="D8"/>
+    </w:rPr>
+  </w:style>
+  <w:style w:type="character" w:customStyle="1" w:styleId="Heading9Char">
+    <w:name w:val="Heading 9 Char"/>
+    <w:basedOn w:val="DefaultParagraphFont"/>
+    <w:link w:val="Heading9"/>
+    <w:uiPriority w:val="9"/>
+    <w:semiHidden/>
+    <w:qFormat/>
+    <w:rsid w:val="0046671C"/>
+    <w:rPr>
+      <w:rFonts w:eastAsiaTheme="majorEastAsia" w:cstheme="majorBidi"/>
+      <w:color w:val="272727" w:themeColor="text1" w:themeTint="D8"/>
+    </w:rPr>
+  </w:style>
+  <w:style w:type="character" w:customStyle="1" w:styleId="TitleChar">
+    <w:name w:val="Title Char"/>
+    <w:basedOn w:val="DefaultParagraphFont"/>
+    <w:link w:val="Title"/>
+    <w:uiPriority w:val="10"/>
+    <w:qFormat/>
+    <w:rsid w:val="0046671C"/>
+    <w:rPr>
+      <w:rFonts w:asciiTheme="majorHAnsi" w:eastAsiaTheme="majorEastAsia" w:hAnsiTheme="majorHAnsi" w:cstheme="majorBidi"/>
+      <w:spacing w:val="-10"/>
+      <w:kern w:val="2"/>
+      <w:sz w:val="56"/>
+      <w:szCs w:val="56"/>
+    </w:rPr>
+  </w:style>
+  <w:style w:type="character" w:customStyle="1" w:styleId="SubtitleChar">
+    <w:name w:val="Subtitle Char"/>
+    <w:basedOn w:val="DefaultParagraphFont"/>
+    <w:link w:val="Subtitle"/>
+    <w:uiPriority w:val="11"/>
+    <w:qFormat/>
+    <w:rsid w:val="0046671C"/>
+    <w:rPr>
+      <w:rFonts w:eastAsiaTheme="majorEastAsia" w:cstheme="majorBidi"/>
+      <w:color w:val="595959" w:themeColor="text1" w:themeTint="A6"/>
+      <w:spacing w:val="15"/>
+      <w:sz w:val="28"/>
+      <w:szCs w:val="28"/>
+    </w:rPr>
+  </w:style>
+  <w:style w:type="character" w:customStyle="1" w:styleId="QuoteChar">
+    <w:name w:val="Quote Char"/>
+    <w:basedOn w:val="DefaultParagraphFont"/>
+    <w:link w:val="Quote"/>
+    <w:uiPriority w:val="29"/>
+    <w:qFormat/>
+    <w:rsid w:val="0046671C"/>
+    <w:rPr>
+      <w:i/>
+      <w:iCs/>
+      <w:color w:val="404040" w:themeColor="text1" w:themeTint="BF"/>
+    </w:rPr>
+  </w:style>
+  <w:style w:type="character" w:styleId="IntenseEmphasis">
+    <w:name w:val="Intense Emphasis"/>
+    <w:basedOn w:val="DefaultParagraphFont"/>
+    <w:uiPriority w:val="21"/>
+    <w:qFormat/>
+    <w:rsid w:val="0046671C"/>
+    <w:rPr>
+      <w:i/>
+      <w:iCs/>
+      <w:color w:val="0F4761" w:themeColor="accent1" w:themeShade="BF"/>
+    </w:rPr>
+  </w:style>
+  <w:style w:type="character" w:customStyle="1" w:styleId="IntenseQuoteChar">
+    <w:name w:val="Intense Quote Char"/>
+    <w:basedOn w:val="DefaultParagraphFont"/>
+    <w:link w:val="IntenseQuote"/>
+    <w:uiPriority w:val="30"/>
+    <w:qFormat/>
+    <w:rsid w:val="0046671C"/>
+    <w:rPr>
+      <w:i/>
+      <w:iCs/>
+      <w:color w:val="0F4761" w:themeColor="accent1" w:themeShade="BF"/>
+    </w:rPr>
+  </w:style>
+  <w:style w:type="character" w:styleId="IntenseReference">
+    <w:name w:val="Intense Reference"/>
+    <w:basedOn w:val="DefaultParagraphFont"/>
+    <w:uiPriority w:val="32"/>
+    <w:qFormat/>
+    <w:rsid w:val="0046671C"/>
+    <w:rPr>
+      <w:b/>
+      <w:bCs/>
+      <w:smallCaps/>
+      <w:color w:val="0F4761" w:themeColor="accent1" w:themeShade="BF"/>
+      <w:spacing w:val="5"/>
+    </w:rPr>
+  </w:style>
+  <w:style w:type="character" w:customStyle="1" w:styleId="Bulletsuser">
+    <w:name w:val="Bullets (user)"/>
+    <w:qFormat/>
+    <w:rPr>
+      <w:rFonts w:ascii="OpenSymbol" w:eastAsia="OpenSymbol" w:hAnsi="OpenSymbol" w:cs="OpenSymbol"/>
+    </w:rPr>
+  </w:style>
+  <w:style w:type="character" w:styleId="Hyperlink">
+    <w:name w:val="Hyperlink"/>
+    <w:basedOn w:val="DefaultParagraphFont"/>
+    <w:uiPriority w:val="99"/>
+    <w:unhideWhenUsed/>
+    <w:rsid w:val="00052255"/>
+    <w:rPr>
+      <w:color w:val="467886" w:themeColor="hyperlink"/>
+      <w:u w:val="single"/>
+    </w:rPr>
+  </w:style>
+  <w:style w:type="character" w:styleId="UnresolvedMention">
+    <w:name w:val="Unresolved Mention"/>
+    <w:basedOn w:val="DefaultParagraphFont"/>
+    <w:uiPriority w:val="99"/>
+    <w:semiHidden/>
+    <w:unhideWhenUsed/>
+    <w:qFormat/>
+    <w:rsid w:val="00052255"/>
+    <w:rPr>
+      <w:color w:val="605E5C"/>
+      <w:shd w:val="clear" w:color="auto" w:fill="E1DFDD"/>
+    </w:rPr>
+  </w:style>
+  <w:style w:type="paragraph" w:customStyle="1" w:styleId="Heading">
+    <w:name w:val="Heading"/>
+    <w:basedOn w:val="Normal"/>
+    <w:next w:val="BodyText"/>
+    <w:qFormat/>
+    <w:pPr>
+      <w:keepNext/>
+      <w:spacing w:before="240" w:after="120"/>
+    </w:pPr>
+    <w:rPr>
+      <w:rFonts w:ascii="Liberation Sans" w:eastAsia="Noto Sans CJK SC" w:hAnsi="Liberation Sans" w:cs="Noto Sans Devanagari"/>
+      <w:sz w:val="28"/>
+      <w:szCs w:val="28"/>
+    </w:rPr>
+  </w:style>
+  <w:style w:type="paragraph" w:styleId="BodyText">
+    <w:name w:val="Body Text"/>
+    <w:basedOn w:val="Normal"/>
+    <w:pPr>
+      <w:spacing w:after="140" w:line="276" w:lineRule="auto"/>
+    </w:pPr>
+  </w:style>
+  <w:style w:type="paragraph" w:styleId="List">
+    <w:name w:val="List"/>
+    <w:basedOn w:val="BodyText"/>
+    <w:rPr>
+      <w:rFonts w:cs="Noto Sans Devanagari"/>
+    </w:rPr>
+  </w:style>
+  <w:style w:type="paragraph" w:styleId="Caption">
+    <w:name w:val="caption"/>
+    <w:basedOn w:val="Normal"/>
+    <w:qFormat/>
+    <w:pPr>
+      <w:suppressLineNumbers/>
+      <w:spacing w:before="120" w:after="120"/>
+    </w:pPr>
+    <w:rPr>
+      <w:rFonts w:cs="Noto Sans Devanagari"/>
+      <w:i/>
+      <w:iCs/>
+    </w:rPr>
+  </w:style>
+  <w:style w:type="paragraph" w:customStyle="1" w:styleId="Index">
+    <w:name w:val="Index"/>
+    <w:basedOn w:val="Normal"/>
+    <w:qFormat/>
+    <w:pPr>
+      <w:suppressLineNumbers/>
+    </w:pPr>
+    <w:rPr>
+      <w:rFonts w:cs="Noto Sans Devanagari"/>
+    </w:rPr>
+  </w:style>
+  <w:style w:type="paragraph" w:styleId="Title">
+    <w:name w:val="Title"/>
+    <w:basedOn w:val="Normal"/>
+    <w:next w:val="Normal"/>
+    <w:link w:val="TitleChar"/>
+    <w:uiPriority w:val="10"/>
+    <w:qFormat/>
+    <w:rsid w:val="0046671C"/>
+    <w:pPr>
+      <w:spacing w:after="80" w:line="240" w:lineRule="auto"/>
+      <w:contextualSpacing/>
+    </w:pPr>
+    <w:rPr>
+      <w:rFonts w:asciiTheme="majorHAnsi" w:eastAsiaTheme="majorEastAsia" w:hAnsiTheme="majorHAnsi" w:cstheme="majorBidi"/>
+      <w:spacing w:val="-10"/>
+      <w:sz w:val="56"/>
+      <w:szCs w:val="56"/>
+    </w:rPr>
+  </w:style>
+  <w:style w:type="paragraph" w:styleId="Subtitle">
+    <w:name w:val="Subtitle"/>
+    <w:basedOn w:val="Normal"/>
+    <w:next w:val="Normal"/>
+    <w:link w:val="SubtitleChar"/>
+    <w:uiPriority w:val="11"/>
+    <w:qFormat/>
+    <w:rsid w:val="0046671C"/>
+    <w:rPr>
+      <w:rFonts w:eastAsiaTheme="majorEastAsia" w:cstheme="majorBidi"/>
+      <w:color w:val="595959" w:themeColor="text1" w:themeTint="A6"/>
+      <w:spacing w:val="15"/>
+      <w:sz w:val="28"/>
+      <w:szCs w:val="28"/>
+    </w:rPr>
+  </w:style>
+  <w:style w:type="paragraph" w:styleId="Quote">
+    <w:name w:val="Quote"/>
+    <w:basedOn w:val="Normal"/>
+    <w:next w:val="Normal"/>
+    <w:link w:val="QuoteChar"/>
+    <w:uiPriority w:val="29"/>
+    <w:qFormat/>
+    <w:rsid w:val="0046671C"/>
+    <w:pPr>
+      <w:spacing w:before="160"/>
+      <w:jc w:val="center"/>
+    </w:pPr>
+    <w:rPr>
+      <w:i/>
+      <w:iCs/>
+      <w:color w:val="404040" w:themeColor="text1" w:themeTint="BF"/>
+    </w:rPr>
+  </w:style>
+  <w:style w:type="paragraph" w:styleId="ListParagraph">
+    <w:name w:val="List Paragraph"/>
+    <w:basedOn w:val="Normal"/>
+    <w:uiPriority w:val="34"/>
+    <w:qFormat/>
+    <w:rsid w:val="0046671C"/>
+    <w:pPr>
+      <w:ind w:left="720"/>
+      <w:contextualSpacing/>
+    </w:pPr>
+  </w:style>
+  <w:style w:type="paragraph" w:styleId="IntenseQuote">
+    <w:name w:val="Intense Quote"/>
+    <w:basedOn w:val="Normal"/>
+    <w:next w:val="Normal"/>
+    <w:link w:val="IntenseQuoteChar"/>
+    <w:uiPriority w:val="30"/>
+    <w:qFormat/>
+    <w:rsid w:val="0046671C"/>
+    <w:pPr>
+      <w:pBdr>
+        <w:top w:val="single" w:sz="4" w:space="10" w:color="0F4761" w:themeColor="accent1" w:themeShade="BF"/>
+        <w:bottom w:val="single" w:sz="4" w:space="10" w:color="0F4761" w:themeColor="accent1" w:themeShade="BF"/>
+      </w:pBdr>
+      <w:spacing w:before="360" w:after="360"/>
+      <w:ind w:left="864" w:right="864"/>
+      <w:jc w:val="center"/>
+    </w:pPr>
+    <w:rPr>
+      <w:i/>
+      <w:iCs/>
+      <w:color w:val="0F4761" w:themeColor="accent1" w:themeShade="BF"/>
+    </w:rPr>
+  </w:style>
 </w:styles>
 </file>
 
 <file path=word/theme/theme1.xml><?xml version="1.0" encoding="utf-8"?>
-<a:theme xmlns:a="http://schemas.openxmlformats.org/drawingml/2006/main" xmlns:r="http://schemas.openxmlformats.org/officeDocument/2006/relationships" name="Office Theme">
+<a:theme xmlns:a="http://schemas.openxmlformats.org/drawingml/2006/main" name="Office Theme">
   <a:themeElements>
     <a:clrScheme name="Office">
       <a:dk1>
@@ -3427,12 +3139,12 @@
     </a:clrScheme>
     <a:fontScheme name="Office">
       <a:majorFont>
-        <a:latin typeface="Aptos Display" panose="02110004020202020204" pitchFamily="0" charset="1"/>
+        <a:latin typeface="Aptos Display" panose="02110004020202020204"/>
         <a:ea typeface=""/>
         <a:cs typeface=""/>
       </a:majorFont>
       <a:minorFont>
-        <a:latin typeface="Aptos" panose="02110004020202020204" pitchFamily="0" charset="1"/>
+        <a:latin typeface="Aptos" panose="02110004020202020204"/>
         <a:ea typeface=""/>
         <a:cs typeface=""/>
       </a:minorFont>
@@ -3464,7 +3176,7 @@
             </a:gs>
           </a:gsLst>
           <a:lin ang="5400000" scaled="0"/>
-          <a:tileRect l="0" t="0" r="0" b="0"/>
+          <a:tileRect/>
         </a:gradFill>
         <a:gradFill>
           <a:gsLst>
@@ -3488,7 +3200,7 @@
             </a:gs>
           </a:gsLst>
           <a:lin ang="5400000" scaled="0"/>
-          <a:tileRect l="0" t="0" r="0" b="0"/>
+          <a:tileRect/>
         </a:gradFill>
       </a:fillStyleLst>
       <a:lnStyleLst>
@@ -3548,10 +3260,12 @@
             </a:gs>
           </a:gsLst>
           <a:lin ang="5400000" scaled="0"/>
-          <a:tileRect l="0" t="0" r="0" b="0"/>
+          <a:tileRect/>
         </a:gradFill>
       </a:bgFillStyleLst>
     </a:fmtScheme>
   </a:themeElements>
+  <a:objectDefaults/>
+  <a:extraClrSchemeLst/>
 </a:theme>
 </file>
</xml_diff>

<commit_message>
Updated pdf | Added Swimlane diagram
</commit_message>
<xml_diff>
--- a/docs/Practical4.docx
+++ b/docs/Practical4.docx
@@ -1,21 +1,25 @@
 
 <file path=word/document.xml><?xml version="1.0" encoding="utf-8"?>
-<w:document xmlns:wpc="http://schemas.microsoft.com/office/word/2010/wordprocessingCanvas" xmlns:cx="http://schemas.microsoft.com/office/drawing/2014/chartex" xmlns:cx1="http://schemas.microsoft.com/office/drawing/2015/9/8/chartex" xmlns:cx2="http://schemas.microsoft.com/office/drawing/2015/10/21/chartex" xmlns:cx3="http://schemas.microsoft.com/office/drawing/2016/5/9/chartex" xmlns:cx4="http://schemas.microsoft.com/office/drawing/2016/5/10/chartex" xmlns:cx5="http://schemas.microsoft.com/office/drawing/2016/5/11/chartex" xmlns:cx6="http://schemas.microsoft.com/office/drawing/2016/5/12/chartex" xmlns:cx7="http://schemas.microsoft.com/office/drawing/2016/5/13/chartex" xmlns:cx8="http://schemas.microsoft.com/office/drawing/2016/5/14/chartex" xmlns:mc="http://schemas.openxmlformats.org/markup-compatibility/2006" xmlns:aink="http://schemas.microsoft.com/office/drawing/2016/ink" xmlns:am3d="http://schemas.microsoft.com/office/drawing/2017/model3d" xmlns:o="urn:schemas-microsoft-com:office:office" xmlns:oel="http://schemas.microsoft.com/office/2019/extlst" xmlns:r="http://schemas.openxmlformats.org/officeDocument/2006/relationships" xmlns:m="http://schemas.openxmlformats.org/officeDocument/2006/math" xmlns:v="urn:schemas-microsoft-com:vml" xmlns:wp14="http://schemas.microsoft.com/office/word/2010/wordprocessingDrawing" xmlns:wp="http://schemas.openxmlformats.org/drawingml/2006/wordprocessingDrawing" xmlns:w10="urn:schemas-microsoft-com:office:word" xmlns:w="http://schemas.openxmlformats.org/wordprocessingml/2006/main" xmlns:w14="http://schemas.microsoft.com/office/word/2010/wordml" xmlns:w15="http://schemas.microsoft.com/office/word/2012/wordml" xmlns:w16cex="http://schemas.microsoft.com/office/word/2018/wordml/cex" xmlns:w16cid="http://schemas.microsoft.com/office/word/2016/wordml/cid" xmlns:w16="http://schemas.microsoft.com/office/word/2018/wordml" xmlns:w16du="http://schemas.microsoft.com/office/word/2023/wordml/word16du" xmlns:w16sdtdh="http://schemas.microsoft.com/office/word/2020/wordml/sdtdatahash" xmlns:w16sdtfl="http://schemas.microsoft.com/office/word/2024/wordml/sdtformatlock" xmlns:w16se="http://schemas.microsoft.com/office/word/2015/wordml/symex" xmlns:wpg="http://schemas.microsoft.com/office/word/2010/wordprocessingGroup" xmlns:wpi="http://schemas.microsoft.com/office/word/2010/wordprocessingInk" xmlns:wne="http://schemas.microsoft.com/office/word/2006/wordml" xmlns:wps="http://schemas.microsoft.com/office/word/2010/wordprocessingShape" mc:Ignorable="w14 w15 w16se w16cid w16 w16cex w16sdtdh w16sdtfl w16du wp14">
+<w:document xmlns:o="urn:schemas-microsoft-com:office:office" xmlns:r="http://schemas.openxmlformats.org/officeDocument/2006/relationships" xmlns:v="urn:schemas-microsoft-com:vml" xmlns:w="http://schemas.openxmlformats.org/wordprocessingml/2006/main" xmlns:w10="urn:schemas-microsoft-com:office:word" xmlns:wp="http://schemas.openxmlformats.org/drawingml/2006/wordprocessingDrawing" xmlns:pic="http://schemas.openxmlformats.org/drawingml/2006/picture" xmlns:wps="http://schemas.microsoft.com/office/word/2010/wordprocessingShape" xmlns:wpg="http://schemas.microsoft.com/office/word/2010/wordprocessingGroup" xmlns:mc="http://schemas.openxmlformats.org/markup-compatibility/2006" xmlns:wp14="http://schemas.microsoft.com/office/word/2010/wordprocessingDrawing" xmlns:w14="http://schemas.microsoft.com/office/word/2010/wordml" xmlns:w15="http://schemas.microsoft.com/office/word/2012/wordml" mc:Ignorable="w14 wp14 w15">
   <w:body>
     <w:p>
       <w:pPr>
         <w:pStyle w:val="Title"/>
         <w:jc w:val="center"/>
-      </w:pPr>
-      <w:r>
+        <w:rPr/>
+      </w:pPr>
+      <w:r>
+        <w:rPr/>
         <w:t>COS214 Practical 4</w:t>
       </w:r>
     </w:p>
     <w:p>
       <w:pPr>
         <w:pStyle w:val="Heading1"/>
-      </w:pPr>
-      <w:r>
+        <w:rPr/>
+      </w:pPr>
+      <w:r>
+        <w:rPr/>
         <w:t>Team:</w:t>
       </w:r>
     </w:p>
@@ -26,19 +30,28 @@
           <w:ilvl w:val="0"/>
           <w:numId w:val="1"/>
         </w:numPr>
-      </w:pPr>
-      <w:r>
-        <w:t>U24876489 – Katlego Sentsho</w:t>
-      </w:r>
-    </w:p>
-    <w:p>
-      <w:pPr>
+        <w:rPr/>
+      </w:pPr>
+      <w:r>
+        <w:rPr/>
+        <w:t>u</w:t>
+      </w:r>
+      <w:r>
+        <w:rPr/>
+        <w:t>24876489 – Katlego Sentsho</w:t>
+      </w:r>
+    </w:p>
+    <w:p>
+      <w:pPr>
+        <w:pStyle w:val="Normal"/>
         <w:numPr>
           <w:ilvl w:val="0"/>
           <w:numId w:val="1"/>
         </w:numPr>
-      </w:pPr>
-      <w:r>
+        <w:rPr/>
+      </w:pPr>
+      <w:r>
+        <w:rPr/>
         <w:t>u23545756 – Kyle Pillay</w:t>
       </w:r>
     </w:p>
@@ -49,44 +62,62 @@
           <w:ilvl w:val="0"/>
           <w:numId w:val="1"/>
         </w:numPr>
-      </w:pPr>
-      <w:r>
+        <w:rPr/>
+      </w:pPr>
+      <w:r>
+        <w:rPr/>
         <w:t xml:space="preserve">u25108582 – Jonathan Witter </w:t>
       </w:r>
     </w:p>
     <w:p>
       <w:pPr>
         <w:pStyle w:val="Heading1"/>
-      </w:pPr>
-      <w:r>
+        <w:rPr/>
+      </w:pPr>
+      <w:r>
+        <w:rPr/>
         <w:t>System Description</w:t>
       </w:r>
     </w:p>
     <w:p>
-      <w:r>
+      <w:pPr>
+        <w:pStyle w:val="Normal"/>
+        <w:rPr/>
+      </w:pPr>
+      <w:r>
+        <w:rPr/>
         <w:t>We decided on film production for the domain. This design allows for Studios to group their films (produced or in progress of being made) into their type of film (Movie, Tv Series, Animated, ...)</w:t>
       </w:r>
     </w:p>
     <w:p>
-      <w:r>
+      <w:pPr>
+        <w:pStyle w:val="Normal"/>
+        <w:rPr/>
+      </w:pPr>
+      <w:r>
+        <w:rPr/>
         <w:t>Films will have states. They are either in planning/filming/editing phase or they have been released. Films are decorated with how they are accessed (viewed) by the public (such as online platforms for streaming or theaters).</w:t>
       </w:r>
     </w:p>
     <w:p>
       <w:pPr>
         <w:pStyle w:val="Heading1"/>
-      </w:pPr>
-      <w:r>
+        <w:rPr/>
+      </w:pPr>
+      <w:r>
+        <w:rPr/>
         <w:t>UML Diagram</w:t>
       </w:r>
     </w:p>
     <w:p>
-      <w:r>
-        <w:rPr>
-          <w:noProof/>
-        </w:rPr>
+      <w:pPr>
+        <w:pStyle w:val="Normal"/>
+        <w:rPr/>
+      </w:pPr>
+      <w:r>
+        <w:rPr/>
         <w:drawing>
-          <wp:inline distT="0" distB="0" distL="0" distR="0" wp14:anchorId="73763045" wp14:editId="73763046">
+          <wp:inline distT="0" distB="0" distL="0" distR="0">
             <wp:extent cx="5731510" cy="2769870"/>
             <wp:effectExtent l="0" t="0" r="0" b="0"/>
             <wp:docPr id="1" name="Picture 1"/>
@@ -103,7 +134,7 @@
                     </pic:cNvPicPr>
                   </pic:nvPicPr>
                   <pic:blipFill>
-                    <a:blip r:embed="rId5"/>
+                    <a:blip r:embed="rId2"/>
                     <a:stretch>
                       <a:fillRect/>
                     </a:stretch>
@@ -128,270 +159,408 @@
     <w:p>
       <w:pPr>
         <w:pStyle w:val="Heading1"/>
-      </w:pPr>
-      <w:r>
+        <w:rPr/>
+      </w:pPr>
+      <w:r>
+        <w:rPr/>
         <w:t>GoF Participants</w:t>
       </w:r>
     </w:p>
     <w:p>
-      <w:r>
+      <w:pPr>
+        <w:pStyle w:val="Normal"/>
+        <w:rPr/>
+      </w:pPr>
+      <w:r>
+        <w:rPr/>
         <w:t>Composite Design Pattern:</w:t>
       </w:r>
     </w:p>
     <w:p>
       <w:pPr>
+        <w:pStyle w:val="Normal"/>
         <w:numPr>
           <w:ilvl w:val="0"/>
           <w:numId w:val="3"/>
         </w:numPr>
-      </w:pPr>
-      <w:r>
+        <w:rPr/>
+      </w:pPr>
+      <w:r>
+        <w:rPr/>
         <w:t xml:space="preserve">Component – ProductionComponent </w:t>
       </w:r>
     </w:p>
     <w:p>
       <w:pPr>
+        <w:pStyle w:val="Normal"/>
         <w:numPr>
           <w:ilvl w:val="0"/>
           <w:numId w:val="2"/>
         </w:numPr>
-      </w:pPr>
-      <w:r>
-        <w:lastRenderedPageBreak/>
+        <w:rPr/>
+      </w:pPr>
+      <w:r>
+        <w:rPr/>
         <w:t xml:space="preserve">Composite – ProductionGroup </w:t>
       </w:r>
     </w:p>
     <w:p>
       <w:pPr>
+        <w:pStyle w:val="Normal"/>
         <w:numPr>
           <w:ilvl w:val="0"/>
           <w:numId w:val="2"/>
         </w:numPr>
-      </w:pPr>
-      <w:r>
+        <w:rPr/>
+      </w:pPr>
+      <w:r>
+        <w:rPr/>
         <w:t>Leaf – Production</w:t>
       </w:r>
     </w:p>
-    <w:p/>
-    <w:p>
-      <w:r>
+    <w:p>
+      <w:pPr>
+        <w:pStyle w:val="Normal"/>
+        <w:rPr/>
+      </w:pPr>
+      <w:r>
+        <w:rPr/>
+      </w:r>
+    </w:p>
+    <w:p>
+      <w:pPr>
+        <w:pStyle w:val="Normal"/>
+        <w:rPr/>
+      </w:pPr>
+      <w:r>
+        <w:rPr/>
         <w:t>State Design Pattern:</w:t>
       </w:r>
     </w:p>
     <w:p>
       <w:pPr>
+        <w:pStyle w:val="Normal"/>
         <w:numPr>
           <w:ilvl w:val="0"/>
           <w:numId w:val="3"/>
         </w:numPr>
-      </w:pPr>
-      <w:r>
+        <w:rPr/>
+      </w:pPr>
+      <w:r>
+        <w:rPr/>
         <w:t xml:space="preserve">Context – Production </w:t>
       </w:r>
     </w:p>
     <w:p>
       <w:pPr>
+        <w:pStyle w:val="Normal"/>
         <w:numPr>
           <w:ilvl w:val="0"/>
           <w:numId w:val="4"/>
         </w:numPr>
-      </w:pPr>
-      <w:r>
+        <w:rPr/>
+      </w:pPr>
+      <w:r>
+        <w:rPr/>
         <w:t xml:space="preserve">State – ProductionState </w:t>
       </w:r>
     </w:p>
     <w:p>
       <w:pPr>
+        <w:pStyle w:val="Normal"/>
         <w:numPr>
           <w:ilvl w:val="0"/>
           <w:numId w:val="4"/>
         </w:numPr>
-      </w:pPr>
-      <w:r>
+        <w:rPr/>
+      </w:pPr>
+      <w:r>
+        <w:rPr/>
         <w:t>Concrete States – Planning, Filming, Editing, Released</w:t>
       </w:r>
     </w:p>
-    <w:p/>
-    <w:p>
-      <w:r>
+    <w:p>
+      <w:pPr>
+        <w:pStyle w:val="Normal"/>
+        <w:rPr/>
+      </w:pPr>
+      <w:r>
+        <w:rPr/>
+      </w:r>
+    </w:p>
+    <w:p>
+      <w:pPr>
+        <w:pStyle w:val="Normal"/>
+        <w:rPr/>
+      </w:pPr>
+      <w:r>
+        <w:rPr/>
         <w:t>Decorator Design Pattern:</w:t>
       </w:r>
     </w:p>
     <w:p>
       <w:pPr>
+        <w:pStyle w:val="Normal"/>
         <w:numPr>
           <w:ilvl w:val="0"/>
           <w:numId w:val="3"/>
         </w:numPr>
-      </w:pPr>
-      <w:r>
+        <w:rPr/>
+      </w:pPr>
+      <w:r>
+        <w:rPr/>
         <w:t>Component –  ProductionComponent</w:t>
       </w:r>
     </w:p>
     <w:p>
       <w:pPr>
+        <w:pStyle w:val="Normal"/>
         <w:numPr>
           <w:ilvl w:val="0"/>
           <w:numId w:val="3"/>
         </w:numPr>
-      </w:pPr>
-      <w:r>
+        <w:rPr/>
+      </w:pPr>
+      <w:r>
+        <w:rPr/>
         <w:t>Concrete Component – Production</w:t>
       </w:r>
     </w:p>
     <w:p>
       <w:pPr>
+        <w:pStyle w:val="Normal"/>
         <w:numPr>
           <w:ilvl w:val="0"/>
           <w:numId w:val="5"/>
         </w:numPr>
-      </w:pPr>
-      <w:r>
+        <w:rPr/>
+      </w:pPr>
+      <w:r>
+        <w:rPr/>
         <w:t>Decorator –  AvailableDecorator</w:t>
       </w:r>
     </w:p>
     <w:p>
       <w:pPr>
+        <w:pStyle w:val="Normal"/>
         <w:numPr>
           <w:ilvl w:val="0"/>
           <w:numId w:val="5"/>
         </w:numPr>
-      </w:pPr>
-      <w:r>
+        <w:rPr/>
+      </w:pPr>
+      <w:r>
+        <w:rPr/>
         <w:t>Concrete Decorators – TheatricalDecorator, PlatformDecorator</w:t>
       </w:r>
     </w:p>
-    <w:p/>
-    <w:p>
-      <w:r>
+    <w:p>
+      <w:pPr>
+        <w:pStyle w:val="Normal"/>
+        <w:rPr/>
+      </w:pPr>
+      <w:r>
+        <w:rPr/>
+      </w:r>
+    </w:p>
+    <w:p>
+      <w:pPr>
+        <w:pStyle w:val="Normal"/>
+        <w:rPr/>
+      </w:pPr>
+      <w:r>
+        <w:rPr/>
         <w:t>Iterator Design Pattern:</w:t>
       </w:r>
     </w:p>
     <w:p>
       <w:pPr>
+        <w:pStyle w:val="Normal"/>
         <w:numPr>
           <w:ilvl w:val="0"/>
           <w:numId w:val="3"/>
         </w:numPr>
-      </w:pPr>
-      <w:r>
+        <w:rPr/>
+      </w:pPr>
+      <w:r>
+        <w:rPr/>
         <w:t>Iterator – Iterator</w:t>
       </w:r>
     </w:p>
     <w:p>
       <w:pPr>
+        <w:pStyle w:val="Normal"/>
         <w:numPr>
           <w:ilvl w:val="0"/>
           <w:numId w:val="3"/>
         </w:numPr>
-      </w:pPr>
-      <w:r>
+        <w:rPr/>
+      </w:pPr>
+      <w:r>
+        <w:rPr/>
         <w:t>Concrete Iterators – FullTraversalIterator, StateIterator</w:t>
       </w:r>
     </w:p>
     <w:p>
       <w:pPr>
+        <w:pStyle w:val="Normal"/>
         <w:numPr>
           <w:ilvl w:val="0"/>
           <w:numId w:val="3"/>
         </w:numPr>
-      </w:pPr>
-      <w:r>
+        <w:rPr/>
+      </w:pPr>
+      <w:r>
+        <w:rPr/>
         <w:t>Aggregate –  ProductionComponent</w:t>
       </w:r>
     </w:p>
     <w:p>
       <w:pPr>
+        <w:pStyle w:val="Normal"/>
         <w:numPr>
           <w:ilvl w:val="0"/>
           <w:numId w:val="6"/>
         </w:numPr>
-      </w:pPr>
-      <w:r>
+        <w:rPr/>
+      </w:pPr>
+      <w:r>
+        <w:rPr/>
         <w:t>Concrete Aggregates –  ProductionGroup</w:t>
       </w:r>
     </w:p>
-    <w:p/>
+    <w:p>
+      <w:pPr>
+        <w:pStyle w:val="Normal"/>
+        <w:rPr/>
+      </w:pPr>
+      <w:r>
+        <w:rPr/>
+      </w:r>
+    </w:p>
     <w:p>
       <w:pPr>
         <w:pStyle w:val="Heading1"/>
-      </w:pPr>
-      <w:r>
+        <w:rPr/>
+      </w:pPr>
+      <w:r>
+        <w:rPr/>
         <w:t>Design and Ownership Rationale:</w:t>
-      </w:r>
-      <w:r>
         <w:br/>
       </w:r>
     </w:p>
     <w:p>
-      <w:r>
-        <w:t xml:space="preserve">ProductionGroup owns its children by raw pointer in a std::vector&lt;ProductionComponent*&gt; and deletes each one in its destructor, so destroying a group cleanly cascades through its whole subtree. removeChild() deliberately hands ownership back to the caller rather than deleting internally, which is what lets main.cpp relocate or delete a node explicitly, satisfying the requirement for a meaningful structural change at runtime. Both Production (leaf) and ProductionGroup (composite) inherit from ProductionComponent, which declares </w:t>
-      </w:r>
-      <w:r>
-        <w:lastRenderedPageBreak/>
-        <w:t>getDevelopmentCost(), display(), getProgress(), and createIterator() as shared behaviour, so client code and decorators can treat a single production and an entire group identically without ever checking which one they're holding.</w:t>
-      </w:r>
-    </w:p>
-    <w:p>
-      <w:r>
+      <w:pPr>
+        <w:pStyle w:val="Normal"/>
+        <w:rPr/>
+      </w:pPr>
+      <w:r>
+        <w:rPr/>
+        <w:t>ProductionGroup owns its children by raw pointer in a std::vector&lt;ProductionComponent*&gt; and deletes each one in its destructor, so destroying a group cleanly cascades through its whole subtree. removeChild() deliberately hands ownership back to the caller rather than deleting internally, which is what lets main.cpp relocate or delete a node explicitly, satisfying the requirement for a meaningful structural change at runtime. Both Production (leaf) and ProductionGroup (composite) inherit from ProductionComponent, which declares getDevelopmentCost(), display(), getProgress(), and createIterator() as shared behaviour, so client code and decorators can treat a single production and an entire group identically without ever checking which one they're holding.</w:t>
+      </w:r>
+    </w:p>
+    <w:p>
+      <w:pPr>
+        <w:pStyle w:val="Normal"/>
+        <w:rPr/>
+      </w:pPr>
+      <w:r>
+        <w:rPr/>
         <w:t>AvailableDecorator also owns what it wraps, holding a ProductionComponent* and deleting it in its own destructor. This means a whole chain of stacked decorators, such as two PlatformDecorators wrapped around one Production, is destroyed correctly just by deleting the outermost layer, and a fully decorated object can be dropped straight into a group's children vector with no special handling needed for cleanup.</w:t>
       </w:r>
     </w:p>
     <w:p>
-      <w:r>
+      <w:pPr>
+        <w:pStyle w:val="Normal"/>
+        <w:rPr/>
+      </w:pPr>
+      <w:r>
+        <w:rPr/>
         <w:t>Production owns a single ProductionState*, replacing it through setState(), which deletes the old state before assigning the new one. States are stateless data-wise, encoding only behaviour, so a fresh object is created on each transition rather than reusing shared instances, a simpler choice for a system this size.</w:t>
       </w:r>
     </w:p>
     <w:p>
-      <w:r>
+      <w:pPr>
+        <w:pStyle w:val="Normal"/>
+        <w:rPr/>
+      </w:pPr>
+      <w:r>
+        <w:rPr/>
         <w:t>FullTraversalIterator and StateIterator both implement the same Iterator interface but serve different purposes, one lists the entire hierarchy and the other filters leaves by lifecycle state. Both are snapshot iterators, collecting their results once at construction through a private collect() method, and both are declared friends of ProductionGroup so they can walk its private children vector directly without that vector ever being exposed to client code.</w:t>
       </w:r>
     </w:p>
     <w:p>
-      <w:r>
+      <w:pPr>
+        <w:pStyle w:val="Normal"/>
+        <w:rPr/>
+      </w:pPr>
+      <w:r>
+        <w:rPr/>
         <w:t>The main design challenge was making these four patterns cooperate rather than function as separate demos. Since a Production can be wrapped in decorators while sitting inside a composite tree, AvailableDecorator delegates every ProductionComponent method to the component it wraps, so decorated and undecorated productions remain fully interchangeable, and traversal, state, and cost calculations all keep working correctly no matter how many decorator layers are present.</w:t>
       </w:r>
     </w:p>
     <w:p>
       <w:pPr>
-        <w:spacing w:after="0" w:line="240" w:lineRule="auto"/>
+        <w:pStyle w:val="Normal"/>
+        <w:spacing w:lineRule="auto" w:line="240" w:before="0" w:after="0"/>
         <w:rPr>
-          <w:rFonts w:asciiTheme="majorHAnsi" w:eastAsiaTheme="majorEastAsia" w:hAnsiTheme="majorHAnsi" w:cstheme="majorBidi"/>
-          <w:color w:val="0F4761" w:themeColor="accent1" w:themeShade="BF"/>
+          <w:rFonts w:ascii="Aptos Display" w:hAnsi="Aptos Display" w:eastAsia="" w:cs="" w:asciiTheme="majorHAnsi" w:cstheme="majorBidi" w:eastAsiaTheme="majorEastAsia" w:hAnsiTheme="majorHAnsi"/>
+          <w:color w:themeColor="accent1" w:themeShade="bf" w:val="0F4761"/>
           <w:sz w:val="40"/>
           <w:szCs w:val="40"/>
         </w:rPr>
       </w:pPr>
       <w:r>
+        <w:rPr>
+          <w:rFonts w:eastAsia="" w:cs="" w:cstheme="majorBidi" w:eastAsiaTheme="majorEastAsia" w:ascii="Aptos Display" w:hAnsi="Aptos Display"/>
+          <w:color w:themeColor="accent1" w:themeShade="bf" w:val="0F4761"/>
+          <w:sz w:val="40"/>
+          <w:szCs w:val="40"/>
+        </w:rPr>
+      </w:r>
+      <w:r>
         <w:br w:type="page"/>
       </w:r>
     </w:p>
     <w:p>
       <w:pPr>
         <w:pStyle w:val="Heading1"/>
-        <w:spacing w:before="0"/>
-      </w:pPr>
-      <w:r>
-        <w:lastRenderedPageBreak/>
+        <w:spacing w:before="0" w:after="80"/>
+        <w:rPr/>
+      </w:pPr>
+      <w:r>
+        <w:rPr/>
         <w:t>Diagrams</w:t>
       </w:r>
     </w:p>
-    <w:p/>
+    <w:p>
+      <w:pPr>
+        <w:pStyle w:val="Normal"/>
+        <w:rPr/>
+      </w:pPr>
+      <w:r>
+        <w:rPr/>
+      </w:r>
+    </w:p>
     <w:p>
       <w:pPr>
         <w:pStyle w:val="Heading2"/>
-      </w:pPr>
-      <w:r>
+        <w:rPr/>
+      </w:pPr>
+      <w:r>
+        <w:rPr/>
         <w:t>Object Diagram:</w:t>
       </w:r>
     </w:p>
     <w:p>
-      <w:r>
-        <w:rPr>
-          <w:noProof/>
-        </w:rPr>
+      <w:pPr>
+        <w:pStyle w:val="Normal"/>
+        <w:rPr/>
+      </w:pPr>
+      <w:r>
+        <w:rPr/>
         <w:drawing>
-          <wp:inline distT="0" distB="0" distL="0" distR="0" wp14:anchorId="73763047" wp14:editId="73763048">
+          <wp:inline distT="0" distB="0" distL="0" distR="0">
             <wp:extent cx="5731510" cy="2792095"/>
             <wp:effectExtent l="0" t="0" r="0" b="0"/>
             <wp:docPr id="2" name="Image2"/>
@@ -408,7 +577,7 @@
                     </pic:cNvPicPr>
                   </pic:nvPicPr>
                   <pic:blipFill>
-                    <a:blip r:embed="rId6"/>
+                    <a:blip r:embed="rId3"/>
                     <a:stretch>
                       <a:fillRect/>
                     </a:stretch>
@@ -430,22 +599,25 @@
         </w:drawing>
       </w:r>
     </w:p>
-    <w:p/>
     <w:p>
       <w:pPr>
         <w:pStyle w:val="Heading2"/>
-      </w:pPr>
-      <w:r>
+        <w:rPr/>
+      </w:pPr>
+      <w:r>
+        <w:rPr/>
         <w:t xml:space="preserve">State Diagram: </w:t>
       </w:r>
     </w:p>
     <w:p>
-      <w:r>
-        <w:rPr>
-          <w:noProof/>
-        </w:rPr>
+      <w:pPr>
+        <w:pStyle w:val="Normal"/>
+        <w:rPr/>
+      </w:pPr>
+      <w:r>
+        <w:rPr/>
         <w:drawing>
-          <wp:inline distT="0" distB="0" distL="0" distR="0" wp14:anchorId="73763049" wp14:editId="7376304A">
+          <wp:inline distT="0" distB="0" distL="0" distR="0">
             <wp:extent cx="4076700" cy="4216400"/>
             <wp:effectExtent l="0" t="0" r="0" b="0"/>
             <wp:docPr id="3" name="Image3"/>
@@ -462,7 +634,7 @@
                     </pic:cNvPicPr>
                   </pic:nvPicPr>
                   <pic:blipFill>
-                    <a:blip r:embed="rId7"/>
+                    <a:blip r:embed="rId4"/>
                     <a:stretch>
                       <a:fillRect/>
                     </a:stretch>
@@ -487,31 +659,29 @@
     <w:p>
       <w:pPr>
         <w:pStyle w:val="Heading2"/>
-      </w:pPr>
-      <w:r>
-        <w:lastRenderedPageBreak/>
+        <w:rPr/>
+      </w:pPr>
+      <w:r>
+        <w:rPr/>
         <w:br/>
       </w:r>
     </w:p>
     <w:p>
+      <w:pPr>
+        <w:pStyle w:val="Normal"/>
+        <w:rPr/>
+      </w:pPr>
       <w:r>
         <w:rPr>
           <w:rStyle w:val="Heading2Char"/>
         </w:rPr>
         <w:t>Traversal Activity Diagram:</w:t>
-      </w:r>
-      <w:r>
-        <w:rPr>
-          <w:rStyle w:val="Heading2Char"/>
-        </w:rPr>
         <w:br/>
       </w:r>
       <w:r>
-        <w:rPr>
-          <w:noProof/>
-        </w:rPr>
+        <w:rPr/>
         <w:drawing>
-          <wp:inline distT="0" distB="0" distL="0" distR="0" wp14:anchorId="7376304B" wp14:editId="7376304C">
+          <wp:inline distT="0" distB="0" distL="0" distR="0">
             <wp:extent cx="5731510" cy="6742430"/>
             <wp:effectExtent l="0" t="0" r="0" b="0"/>
             <wp:docPr id="4" name="Image4"/>
@@ -528,7 +698,7 @@
                     </pic:cNvPicPr>
                   </pic:nvPicPr>
                   <pic:blipFill>
-                    <a:blip r:embed="rId8"/>
+                    <a:blip r:embed="rId5"/>
                     <a:stretch>
                       <a:fillRect/>
                     </a:stretch>
@@ -550,18 +720,38 @@
         </w:drawing>
       </w:r>
       <w:r>
+        <w:rPr/>
         <w:br/>
       </w:r>
     </w:p>
     <w:p>
       <w:pPr>
+        <w:pStyle w:val="Normal"/>
         <w:rPr>
           <w:rStyle w:val="Heading2Char"/>
         </w:rPr>
       </w:pPr>
-    </w:p>
-    <w:p>
-      <w:pPr>
+      <w:r>
+        <w:rPr/>
+      </w:r>
+    </w:p>
+    <w:p>
+      <w:pPr>
+        <w:pStyle w:val="Normal"/>
+        <w:rPr>
+          <w:rStyle w:val="Heading2Char"/>
+        </w:rPr>
+      </w:pPr>
+      <w:r>
+        <w:rPr/>
+      </w:r>
+      <w:r>
+        <w:br w:type="page"/>
+      </w:r>
+    </w:p>
+    <w:p>
+      <w:pPr>
+        <w:pStyle w:val="Normal"/>
         <w:rPr>
           <w:rStyle w:val="Heading2Char"/>
         </w:rPr>
@@ -575,20 +765,18 @@
     </w:p>
     <w:p>
       <w:pPr>
+        <w:pStyle w:val="Normal"/>
         <w:rPr>
           <w:rStyle w:val="Heading2Char"/>
         </w:rPr>
       </w:pPr>
       <w:r>
-        <w:rPr>
-          <w:rStyle w:val="Heading2Char"/>
-        </w:rPr>
-        <w:lastRenderedPageBreak/>
+        <w:rPr/>
         <w:drawing>
-          <wp:inline distT="0" distB="0" distL="0" distR="0" wp14:anchorId="68A00D88" wp14:editId="5F340F38">
-            <wp:extent cx="4591286" cy="4292821"/>
+          <wp:inline distT="0" distB="0" distL="0" distR="0">
+            <wp:extent cx="4591685" cy="4293235"/>
             <wp:effectExtent l="0" t="0" r="0" b="0"/>
-            <wp:docPr id="2018024990" name="Picture 1"/>
+            <wp:docPr id="5" name="Image5"/>
             <wp:cNvGraphicFramePr>
               <a:graphicFrameLocks xmlns:a="http://schemas.openxmlformats.org/drawingml/2006/main" noChangeAspect="1"/>
             </wp:cNvGraphicFramePr>
@@ -596,23 +784,26 @@
               <a:graphicData uri="http://schemas.openxmlformats.org/drawingml/2006/picture">
                 <pic:pic xmlns:pic="http://schemas.openxmlformats.org/drawingml/2006/picture">
                   <pic:nvPicPr>
-                    <pic:cNvPr id="2018024990" name=""/>
-                    <pic:cNvPicPr/>
+                    <pic:cNvPr id="5" name="Image5"/>
+                    <pic:cNvPicPr>
+                      <a:picLocks noChangeAspect="1" noChangeArrowheads="1"/>
+                    </pic:cNvPicPr>
                   </pic:nvPicPr>
                   <pic:blipFill>
-                    <a:blip r:embed="rId9"/>
+                    <a:blip r:embed="rId6"/>
                     <a:stretch>
                       <a:fillRect/>
                     </a:stretch>
                   </pic:blipFill>
-                  <pic:spPr>
+                  <pic:spPr bwMode="auto">
                     <a:xfrm>
                       <a:off x="0" y="0"/>
-                      <a:ext cx="4591286" cy="4292821"/>
+                      <a:ext cx="4591685" cy="4293235"/>
                     </a:xfrm>
                     <a:prstGeom prst="rect">
                       <a:avLst/>
                     </a:prstGeom>
+                    <a:noFill/>
                   </pic:spPr>
                 </pic:pic>
               </a:graphicData>
@@ -621,54 +812,42 @@
         </w:drawing>
       </w:r>
     </w:p>
-    <w:p/>
-    <w:p>
-      <w:pPr>
-        <w:pStyle w:val="Heading1"/>
-      </w:pPr>
-      <w:r>
-        <w:t>Traversal Modification Policy</w:t>
-      </w:r>
-    </w:p>
-    <w:p>
-      <w:r>
-        <w:t>Our iterators use a snapshot approach rather than a live one. When FullTraversalIterator or StateIterator is created, its collect() method walks the entire composite tree once, right at construction, and copies pointers to the relevant components into its own internal vector. From that point on, first(), next(), isDone(), and currentItem() only ever look at this internal copy, never the live tree again.</w:t>
-      </w:r>
-    </w:p>
-    <w:p>
-      <w:r>
-        <w:t>This means once an iterator exists, it's frozen in time. If you add a child with addChild() or remove one with removeChild() after the iterator was created, that change simply won't show up in the iterator's results, it'll keep returning whatever it originally collected.</w:t>
-      </w:r>
-    </w:p>
-    <w:p>
-      <w:r>
-        <w:t>We chose this deliberately over a live traversal. A live traversal that kept reading directly from ProductionGroup's children vector would be vulnerable to the classic problem of modifying a container while iterating over it, especially risky in our case since main.cpp deletes removed nodes immediately after calling removeChild(). Snapshotting sidesteps that risk entirely, since the iterator's own vector is separate from the live tree, so deleting a node from the tree can't invalidate an iterator that's already finished collecting.</w:t>
-      </w:r>
-    </w:p>
-    <w:p>
-      <w:r>
-        <w:lastRenderedPageBreak/>
-        <w:t>This approach also lets two independent traversals run over the same hierarchy at once without stepping on each other. In main.cpp, we create a full traversal and a state-filtered traversal one after another from the same root, and each one works from its own private snapshot, so neither interferes with the other or with the underlying tree.</w:t>
-      </w:r>
-    </w:p>
-    <w:p>
-      <w:pPr>
-        <w:pStyle w:val="Heading1"/>
-      </w:pPr>
-      <w:r>
-        <w:t>GDB and Valgrind</w:t>
-      </w:r>
-    </w:p>
-    <w:p>
-      <w:r>
+    <w:p>
+      <w:pPr>
+        <w:pStyle w:val="Normal"/>
         <w:rPr>
-          <w:noProof/>
+          <w:rStyle w:val="Heading2Char"/>
         </w:rPr>
+      </w:pPr>
+      <w:r>
+        <w:rPr>
+          <w:rStyle w:val="Heading2Char"/>
+        </w:rPr>
+        <w:t>Remove Production Activity Diagram:</w:t>
+      </w:r>
+    </w:p>
+    <w:p>
+      <w:pPr>
+        <w:pStyle w:val="Normal"/>
+        <w:rPr>
+          <w:rStyle w:val="Heading2Char"/>
+        </w:rPr>
+      </w:pPr>
+      <w:r>
+        <w:rPr/>
         <w:drawing>
-          <wp:inline distT="0" distB="0" distL="0" distR="0" wp14:anchorId="7376304F" wp14:editId="73763050">
-            <wp:extent cx="5724525" cy="1514475"/>
+          <wp:anchor distT="0" distB="0" distL="0" distR="0" simplePos="0" relativeHeight="14" behindDoc="0" locked="0" layoutInCell="0" allowOverlap="1">
+            <wp:simplePos x="0" y="0"/>
+            <wp:positionH relativeFrom="column">
+              <wp:align>center</wp:align>
+            </wp:positionH>
+            <wp:positionV relativeFrom="paragraph">
+              <wp:posOffset>635</wp:posOffset>
+            </wp:positionV>
+            <wp:extent cx="5731510" cy="1932305"/>
             <wp:effectExtent l="0" t="0" r="0" b="0"/>
-            <wp:docPr id="6" name="Image5"/>
+            <wp:wrapSquare wrapText="largest"/>
+            <wp:docPr id="6" name="Image11"/>
             <wp:cNvGraphicFramePr>
               <a:graphicFrameLocks xmlns:a="http://schemas.openxmlformats.org/drawingml/2006/main" noChangeAspect="1"/>
             </wp:cNvGraphicFramePr>
@@ -676,13 +855,132 @@
               <a:graphicData uri="http://schemas.openxmlformats.org/drawingml/2006/picture">
                 <pic:pic xmlns:pic="http://schemas.openxmlformats.org/drawingml/2006/picture">
                   <pic:nvPicPr>
-                    <pic:cNvPr id="6" name="Image5"/>
+                    <pic:cNvPr id="6" name="Image11"/>
                     <pic:cNvPicPr>
                       <a:picLocks noChangeAspect="1" noChangeArrowheads="1"/>
                     </pic:cNvPicPr>
                   </pic:nvPicPr>
                   <pic:blipFill>
-                    <a:blip r:embed="rId10"/>
+                    <a:blip r:embed="rId7"/>
+                    <a:stretch>
+                      <a:fillRect/>
+                    </a:stretch>
+                  </pic:blipFill>
+                  <pic:spPr bwMode="auto">
+                    <a:xfrm>
+                      <a:off x="0" y="0"/>
+                      <a:ext cx="5731510" cy="1932305"/>
+                    </a:xfrm>
+                    <a:prstGeom prst="rect">
+                      <a:avLst/>
+                    </a:prstGeom>
+                    <a:noFill/>
+                  </pic:spPr>
+                </pic:pic>
+              </a:graphicData>
+            </a:graphic>
+          </wp:anchor>
+        </w:drawing>
+      </w:r>
+    </w:p>
+    <w:p>
+      <w:pPr>
+        <w:pStyle w:val="Heading1"/>
+        <w:rPr/>
+      </w:pPr>
+      <w:r>
+        <w:rPr/>
+      </w:r>
+      <w:r>
+        <w:br w:type="page"/>
+      </w:r>
+    </w:p>
+    <w:p>
+      <w:pPr>
+        <w:pStyle w:val="Heading1"/>
+        <w:rPr/>
+      </w:pPr>
+      <w:r>
+        <w:rPr/>
+        <w:t>Traversal Modification Policy</w:t>
+      </w:r>
+    </w:p>
+    <w:p>
+      <w:pPr>
+        <w:pStyle w:val="Normal"/>
+        <w:rPr/>
+      </w:pPr>
+      <w:r>
+        <w:rPr/>
+        <w:t>Our iterators use a snapshot approach rather than a live one. When FullTraversalIterator or StateIterator is created, its collect() method walks the entire composite tree once, right at construction, and copies pointers to the relevant components into its own internal vector. From that point on, first(), next(), isDone(), and currentItem() only ever look at this internal copy, never the live tree again.</w:t>
+      </w:r>
+    </w:p>
+    <w:p>
+      <w:pPr>
+        <w:pStyle w:val="Normal"/>
+        <w:rPr/>
+      </w:pPr>
+      <w:r>
+        <w:rPr/>
+        <w:t>This means once an iterator exists, it's frozen in time. If you add a child with addChild() or remove one with removeChild() after the iterator was created, that change simply won't show up in the iterator's results, it'll keep returning whatever it originally collected.</w:t>
+      </w:r>
+    </w:p>
+    <w:p>
+      <w:pPr>
+        <w:pStyle w:val="Normal"/>
+        <w:rPr/>
+      </w:pPr>
+      <w:r>
+        <w:rPr/>
+        <w:t>We chose this deliberately over a live traversal. A live traversal that kept reading directly from ProductionGroup's children vector would be vulnerable to the classic problem of modifying a container while iterating over it, especially risky in our case since main.cpp deletes removed nodes immediately after calling removeChild(). Snapshotting sidesteps that risk entirely, since the iterator's own vector is separate from the live tree, so deleting a node from the tree can't invalidate an iterator that's already finished collecting.</w:t>
+      </w:r>
+    </w:p>
+    <w:p>
+      <w:pPr>
+        <w:pStyle w:val="Normal"/>
+        <w:rPr/>
+      </w:pPr>
+      <w:r>
+        <w:rPr/>
+        <w:t>This approach also lets two independent traversals run over the same hierarchy at once without stepping on each other. In main.cpp, we create a full traversal and a state-filtered traversal one after another from the same root, and each one works from its own private snapshot, so neither interferes with the other or with the underlying tree.</w:t>
+      </w:r>
+    </w:p>
+    <w:p>
+      <w:pPr>
+        <w:pStyle w:val="Heading1"/>
+        <w:rPr/>
+      </w:pPr>
+      <w:r>
+        <w:rPr/>
+        <w:t>GDB and Valgrind</w:t>
+      </w:r>
+    </w:p>
+    <w:p>
+      <w:pPr>
+        <w:pStyle w:val="Normal"/>
+        <w:rPr/>
+      </w:pPr>
+      <w:r>
+        <w:rPr/>
+        <w:drawing>
+          <wp:inline distT="0" distB="0" distL="0" distR="0">
+            <wp:extent cx="5724525" cy="1514475"/>
+            <wp:effectExtent l="0" t="0" r="0" b="0"/>
+            <wp:docPr id="7" name="Image6"/>
+            <wp:cNvGraphicFramePr>
+              <a:graphicFrameLocks xmlns:a="http://schemas.openxmlformats.org/drawingml/2006/main" noChangeAspect="1"/>
+            </wp:cNvGraphicFramePr>
+            <a:graphic xmlns:a="http://schemas.openxmlformats.org/drawingml/2006/main">
+              <a:graphicData uri="http://schemas.openxmlformats.org/drawingml/2006/picture">
+                <pic:pic xmlns:pic="http://schemas.openxmlformats.org/drawingml/2006/picture">
+                  <pic:nvPicPr>
+                    <pic:cNvPr id="7" name="Image6"/>
+                    <pic:cNvPicPr>
+                      <a:picLocks noChangeAspect="1" noChangeArrowheads="1"/>
+                    </pic:cNvPicPr>
+                  </pic:nvPicPr>
+                  <pic:blipFill>
+                    <a:blip r:embed="rId8"/>
                     <a:stretch>
                       <a:fillRect/>
                     </a:stretch>
@@ -705,15 +1003,17 @@
       </w:r>
     </w:p>
     <w:p>
-      <w:r>
-        <w:rPr>
-          <w:noProof/>
-        </w:rPr>
+      <w:pPr>
+        <w:pStyle w:val="Normal"/>
+        <w:rPr/>
+      </w:pPr>
+      <w:r>
+        <w:rPr/>
         <w:drawing>
-          <wp:inline distT="0" distB="0" distL="0" distR="0" wp14:anchorId="73763051" wp14:editId="73763052">
+          <wp:inline distT="0" distB="0" distL="0" distR="0">
             <wp:extent cx="5724525" cy="2571750"/>
             <wp:effectExtent l="0" t="0" r="0" b="0"/>
-            <wp:docPr id="7" name="Picture 2"/>
+            <wp:docPr id="8" name="Picture 2"/>
             <wp:cNvGraphicFramePr>
               <a:graphicFrameLocks xmlns:a="http://schemas.openxmlformats.org/drawingml/2006/main" noChangeAspect="1"/>
             </wp:cNvGraphicFramePr>
@@ -721,13 +1021,13 @@
               <a:graphicData uri="http://schemas.openxmlformats.org/drawingml/2006/picture">
                 <pic:pic xmlns:pic="http://schemas.openxmlformats.org/drawingml/2006/picture">
                   <pic:nvPicPr>
-                    <pic:cNvPr id="7" name="Picture 2"/>
+                    <pic:cNvPr id="8" name="Picture 2"/>
                     <pic:cNvPicPr>
                       <a:picLocks noChangeAspect="1" noChangeArrowheads="1"/>
                     </pic:cNvPicPr>
                   </pic:nvPicPr>
                   <pic:blipFill>
-                    <a:blip r:embed="rId11"/>
+                    <a:blip r:embed="rId9"/>
                     <a:stretch>
                       <a:fillRect/>
                     </a:stretch>
@@ -749,28 +1049,48 @@
         </w:drawing>
       </w:r>
       <w:r>
+        <w:rPr/>
         <w:t>Problem: the program crashes with a segmentation fault shortly after removing "The Force Awakens" from the movies group, specifically when trying to print the removed production's name.</w:t>
       </w:r>
     </w:p>
     <w:p>
-      <w:r>
+      <w:pPr>
+        <w:pStyle w:val="Normal"/>
+        <w:rPr/>
+      </w:pPr>
+      <w:r>
+        <w:rPr/>
         <w:t>Cause: ProductionGroup::removeChild() both erased the child from the children vector and called delete removedChild; on it, before returning the same now-dangling pointer to the caller. main.cpp then used that returned pointer, first reading removed-&gt;getName(), and intended to delete removed; afterwards, unaware the object had already been destroyed inside removeChild(). This violated the intended ownership contract, removeChild() was meant to only detach the child and transfer ownership to the caller, never destroy it itself.</w:t>
       </w:r>
     </w:p>
-    <w:p/>
-    <w:p>
-      <w:r>
+    <w:p>
+      <w:pPr>
+        <w:pStyle w:val="Normal"/>
+        <w:rPr/>
+      </w:pPr>
+      <w:r>
+        <w:rPr/>
+      </w:r>
+    </w:p>
+    <w:p>
+      <w:pPr>
+        <w:pStyle w:val="Normal"/>
+        <w:rPr/>
+      </w:pPr>
+      <w:r>
+        <w:rPr/>
         <w:t>Final Valgrind evidence:</w:t>
       </w:r>
     </w:p>
     <w:p>
-      <w:r>
-        <w:rPr>
-          <w:noProof/>
-        </w:rPr>
-        <w:lastRenderedPageBreak/>
+      <w:pPr>
+        <w:pStyle w:val="Normal"/>
+        <w:rPr/>
+      </w:pPr>
+      <w:r>
+        <w:rPr/>
         <w:drawing>
-          <wp:anchor distT="0" distB="0" distL="0" distR="0" simplePos="0" relativeHeight="13" behindDoc="0" locked="0" layoutInCell="0" allowOverlap="1" wp14:anchorId="73763053" wp14:editId="73763054">
+          <wp:anchor distT="0" distB="0" distL="0" distR="0" simplePos="0" relativeHeight="13" behindDoc="0" locked="0" layoutInCell="0" allowOverlap="1">
             <wp:simplePos x="0" y="0"/>
             <wp:positionH relativeFrom="column">
               <wp:align>center</wp:align>
@@ -781,7 +1101,7 @@
             <wp:extent cx="5731510" cy="1675765"/>
             <wp:effectExtent l="0" t="0" r="0" b="0"/>
             <wp:wrapSquare wrapText="largest"/>
-            <wp:docPr id="8" name="Image1"/>
+            <wp:docPr id="9" name="Image1"/>
             <wp:cNvGraphicFramePr>
               <a:graphicFrameLocks xmlns:a="http://schemas.openxmlformats.org/drawingml/2006/main" noChangeAspect="1"/>
             </wp:cNvGraphicFramePr>
@@ -789,13 +1109,13 @@
               <a:graphicData uri="http://schemas.openxmlformats.org/drawingml/2006/picture">
                 <pic:pic xmlns:pic="http://schemas.openxmlformats.org/drawingml/2006/picture">
                   <pic:nvPicPr>
-                    <pic:cNvPr id="8" name="Image1"/>
+                    <pic:cNvPr id="9" name="Image1"/>
                     <pic:cNvPicPr>
                       <a:picLocks noChangeAspect="1" noChangeArrowheads="1"/>
                     </pic:cNvPicPr>
                   </pic:nvPicPr>
                   <pic:blipFill>
-                    <a:blip r:embed="rId12"/>
+                    <a:blip r:embed="rId10"/>
                     <a:stretch>
                       <a:fillRect/>
                     </a:stretch>
@@ -820,13 +1140,19 @@
     <w:p>
       <w:pPr>
         <w:pStyle w:val="Heading1"/>
-      </w:pPr>
-      <w:r>
+        <w:rPr/>
+      </w:pPr>
+      <w:r>
+        <w:rPr/>
         <w:t>GitHub</w:t>
       </w:r>
     </w:p>
     <w:p>
-      <w:hyperlink r:id="rId13">
+      <w:pPr>
+        <w:pStyle w:val="Normal"/>
+        <w:rPr/>
+      </w:pPr>
+      <w:hyperlink r:id="rId11">
         <w:r>
           <w:rPr>
             <w:rStyle w:val="Hyperlink"/>
@@ -838,27 +1164,52 @@
     <w:p>
       <w:pPr>
         <w:pStyle w:val="Heading1"/>
-      </w:pPr>
-      <w:r>
+        <w:rPr/>
+      </w:pPr>
+      <w:r>
+        <w:rPr/>
         <w:t>Contributions</w:t>
       </w:r>
     </w:p>
     <w:p>
-      <w:r>
+      <w:pPr>
+        <w:pStyle w:val="Normal"/>
+        <w:rPr/>
+      </w:pPr>
+      <w:r>
+        <w:rPr/>
         <w:t>Each team member participated in group meeting to discuss the practical and overall design.</w:t>
       </w:r>
     </w:p>
     <w:p>
-      <w:r>
+      <w:pPr>
+        <w:pStyle w:val="Normal"/>
+        <w:rPr/>
+      </w:pPr>
+      <w:r>
+        <w:rPr/>
         <w:t>Each member contributed at least one of the key classes (composite, iterator, decorator, etc) and fully implemented them.</w:t>
       </w:r>
     </w:p>
     <w:p>
-      <w:r>
+      <w:pPr>
+        <w:pStyle w:val="Normal"/>
+        <w:rPr/>
+      </w:pPr>
+      <w:r>
+        <w:rPr/>
         <w:t>Each member also completed at least 2 of the 6 diagrams required.</w:t>
       </w:r>
     </w:p>
-    <w:p/>
+    <w:p>
+      <w:pPr>
+        <w:pStyle w:val="Normal"/>
+        <w:rPr/>
+      </w:pPr>
+      <w:r>
+        <w:rPr/>
+      </w:r>
+    </w:p>
     <w:p>
       <w:pPr>
         <w:pStyle w:val="ListParagraph"/>
@@ -866,19 +1217,24 @@
           <w:ilvl w:val="0"/>
           <w:numId w:val="1"/>
         </w:numPr>
-      </w:pPr>
-      <w:r>
+        <w:rPr/>
+      </w:pPr>
+      <w:r>
+        <w:rPr/>
         <w:t>Katlego Sentsho: Composite, State Diagram, Activity Diagram, PDF work</w:t>
       </w:r>
     </w:p>
     <w:p>
       <w:pPr>
+        <w:pStyle w:val="Normal"/>
         <w:numPr>
           <w:ilvl w:val="0"/>
           <w:numId w:val="1"/>
         </w:numPr>
-      </w:pPr>
-      <w:r>
+        <w:rPr/>
+      </w:pPr>
+      <w:r>
+        <w:rPr/>
         <w:t>Kyle Pillay: Iterator, Object Diagram, State Diagram, PDF work</w:t>
       </w:r>
     </w:p>
@@ -889,30 +1245,35 @@
           <w:ilvl w:val="0"/>
           <w:numId w:val="1"/>
         </w:numPr>
-      </w:pPr>
-      <w:r>
+        <w:rPr/>
+      </w:pPr>
+      <w:r>
+        <w:rPr/>
         <w:t>Jonathan Witter: State, Decorator, UML Diagram, Activity Diagram, Docker, PDF work</w:t>
       </w:r>
     </w:p>
     <w:p>
       <w:pPr>
         <w:pStyle w:val="Heading1"/>
-      </w:pPr>
-      <w:r>
-        <w:lastRenderedPageBreak/>
+        <w:rPr/>
+      </w:pPr>
+      <w:r>
+        <w:rPr/>
         <w:t>Evidence:</w:t>
       </w:r>
     </w:p>
     <w:p>
-      <w:r>
-        <w:rPr>
-          <w:noProof/>
-        </w:rPr>
+      <w:pPr>
+        <w:pStyle w:val="Normal"/>
+        <w:rPr/>
+      </w:pPr>
+      <w:r>
+        <w:rPr/>
         <w:drawing>
-          <wp:inline distT="0" distB="0" distL="0" distR="0" wp14:anchorId="73763055" wp14:editId="73763056">
+          <wp:inline distT="0" distB="0" distL="0" distR="0">
             <wp:extent cx="5731510" cy="4781550"/>
             <wp:effectExtent l="0" t="0" r="0" b="0"/>
-            <wp:docPr id="9" name="Image6"/>
+            <wp:docPr id="10" name="Image8"/>
             <wp:cNvGraphicFramePr>
               <a:graphicFrameLocks xmlns:a="http://schemas.openxmlformats.org/drawingml/2006/main" noChangeAspect="1"/>
             </wp:cNvGraphicFramePr>
@@ -920,13 +1281,13 @@
               <a:graphicData uri="http://schemas.openxmlformats.org/drawingml/2006/picture">
                 <pic:pic xmlns:pic="http://schemas.openxmlformats.org/drawingml/2006/picture">
                   <pic:nvPicPr>
-                    <pic:cNvPr id="9" name="Image6"/>
+                    <pic:cNvPr id="10" name="Image8"/>
                     <pic:cNvPicPr>
                       <a:picLocks noChangeAspect="1" noChangeArrowheads="1"/>
                     </pic:cNvPicPr>
                   </pic:nvPicPr>
                   <pic:blipFill>
-                    <a:blip r:embed="rId14"/>
+                    <a:blip r:embed="rId12"/>
                     <a:stretch>
                       <a:fillRect/>
                     </a:stretch>
@@ -949,15 +1310,17 @@
       </w:r>
     </w:p>
     <w:p>
-      <w:r>
-        <w:rPr>
-          <w:noProof/>
-        </w:rPr>
+      <w:pPr>
+        <w:pStyle w:val="Normal"/>
+        <w:rPr/>
+      </w:pPr>
+      <w:r>
+        <w:rPr/>
         <w:drawing>
-          <wp:inline distT="0" distB="0" distL="0" distR="0" wp14:anchorId="73763057" wp14:editId="73763058">
+          <wp:inline distT="0" distB="0" distL="0" distR="0">
             <wp:extent cx="5731510" cy="1842135"/>
             <wp:effectExtent l="0" t="0" r="0" b="0"/>
-            <wp:docPr id="10" name="Image7"/>
+            <wp:docPr id="11" name="Image7"/>
             <wp:cNvGraphicFramePr>
               <a:graphicFrameLocks xmlns:a="http://schemas.openxmlformats.org/drawingml/2006/main" noChangeAspect="1"/>
             </wp:cNvGraphicFramePr>
@@ -965,13 +1328,13 @@
               <a:graphicData uri="http://schemas.openxmlformats.org/drawingml/2006/picture">
                 <pic:pic xmlns:pic="http://schemas.openxmlformats.org/drawingml/2006/picture">
                   <pic:nvPicPr>
-                    <pic:cNvPr id="10" name="Image7"/>
+                    <pic:cNvPr id="11" name="Image7"/>
                     <pic:cNvPicPr>
                       <a:picLocks noChangeAspect="1" noChangeArrowheads="1"/>
                     </pic:cNvPicPr>
                   </pic:nvPicPr>
                   <pic:blipFill>
-                    <a:blip r:embed="rId15"/>
+                    <a:blip r:embed="rId13"/>
                     <a:stretch>
                       <a:fillRect/>
                     </a:stretch>
@@ -994,16 +1357,17 @@
       </w:r>
     </w:p>
     <w:p>
-      <w:r>
-        <w:rPr>
-          <w:noProof/>
-        </w:rPr>
-        <w:lastRenderedPageBreak/>
+      <w:pPr>
+        <w:pStyle w:val="Normal"/>
+        <w:rPr/>
+      </w:pPr>
+      <w:r>
+        <w:rPr/>
         <w:drawing>
-          <wp:inline distT="0" distB="0" distL="0" distR="0" wp14:anchorId="73763059" wp14:editId="7376305A">
+          <wp:inline distT="0" distB="0" distL="0" distR="0">
             <wp:extent cx="5731510" cy="1568450"/>
             <wp:effectExtent l="0" t="0" r="0" b="0"/>
-            <wp:docPr id="11" name="Image8"/>
+            <wp:docPr id="12" name="Image10"/>
             <wp:cNvGraphicFramePr>
               <a:graphicFrameLocks xmlns:a="http://schemas.openxmlformats.org/drawingml/2006/main" noChangeAspect="1"/>
             </wp:cNvGraphicFramePr>
@@ -1011,13 +1375,13 @@
               <a:graphicData uri="http://schemas.openxmlformats.org/drawingml/2006/picture">
                 <pic:pic xmlns:pic="http://schemas.openxmlformats.org/drawingml/2006/picture">
                   <pic:nvPicPr>
-                    <pic:cNvPr id="11" name="Image8"/>
+                    <pic:cNvPr id="12" name="Image10"/>
                     <pic:cNvPicPr>
                       <a:picLocks noChangeAspect="1" noChangeArrowheads="1"/>
                     </pic:cNvPicPr>
                   </pic:nvPicPr>
                   <pic:blipFill>
-                    <a:blip r:embed="rId16"/>
+                    <a:blip r:embed="rId14"/>
                     <a:stretch>
                       <a:fillRect/>
                     </a:stretch>
@@ -1040,15 +1404,22 @@
       </w:r>
     </w:p>
     <w:p>
-      <w:r>
-        <w:rPr>
-          <w:noProof/>
-        </w:rPr>
+      <w:pPr>
+        <w:pStyle w:val="Normal"/>
+        <w:widowControl/>
+        <w:suppressAutoHyphens w:val="true"/>
+        <w:bidi w:val="0"/>
+        <w:spacing w:lineRule="auto" w:line="278" w:before="0" w:after="160"/>
+        <w:jc w:val="start"/>
+        <w:rPr/>
+      </w:pPr>
+      <w:r>
+        <w:rPr/>
         <w:drawing>
-          <wp:inline distT="0" distB="0" distL="0" distR="0" wp14:anchorId="7376305B" wp14:editId="7376305C">
+          <wp:inline distT="0" distB="0" distL="0" distR="0">
             <wp:extent cx="3077210" cy="3991610"/>
             <wp:effectExtent l="0" t="0" r="0" b="0"/>
-            <wp:docPr id="12" name="Image9"/>
+            <wp:docPr id="13" name="Image9"/>
             <wp:cNvGraphicFramePr>
               <a:graphicFrameLocks xmlns:a="http://schemas.openxmlformats.org/drawingml/2006/main" noChangeAspect="1"/>
             </wp:cNvGraphicFramePr>
@@ -1056,13 +1427,13 @@
               <a:graphicData uri="http://schemas.openxmlformats.org/drawingml/2006/picture">
                 <pic:pic xmlns:pic="http://schemas.openxmlformats.org/drawingml/2006/picture">
                   <pic:nvPicPr>
-                    <pic:cNvPr id="12" name="Image9"/>
+                    <pic:cNvPr id="13" name="Image9"/>
                     <pic:cNvPicPr>
                       <a:picLocks noChangeAspect="1" noChangeArrowheads="1"/>
                     </pic:cNvPicPr>
                   </pic:nvPicPr>
                   <pic:blipFill>
-                    <a:blip r:embed="rId17"/>
+                    <a:blip r:embed="rId15"/>
                     <a:stretch>
                       <a:fillRect/>
                     </a:stretch>
@@ -1085,32 +1456,168 @@
       </w:r>
     </w:p>
     <w:sectPr>
+      <w:type w:val="nextPage"/>
       <w:pgSz w:w="11906" w:h="16838"/>
-      <w:pgMar w:top="1440" w:right="1440" w:bottom="1440" w:left="1440" w:header="0" w:footer="0" w:gutter="0"/>
-      <w:cols w:space="720"/>
-      <w:formProt w:val="0"/>
-      <w:docGrid w:linePitch="360"/>
+      <w:pgMar w:left="1440" w:right="1440" w:gutter="0" w:header="0" w:top="1440" w:footer="0" w:bottom="1440"/>
+      <w:pgNumType w:fmt="decimal"/>
+      <w:formProt w:val="false"/>
+      <w:textDirection w:val="lrTb"/>
+      <w:docGrid w:type="default" w:linePitch="360" w:charSpace="0"/>
     </w:sectPr>
   </w:body>
 </w:document>
 </file>
 
 <file path=word/numbering.xml><?xml version="1.0" encoding="utf-8"?>
-<w:numbering xmlns:wpc="http://schemas.microsoft.com/office/word/2010/wordprocessingCanvas" xmlns:cx="http://schemas.microsoft.com/office/drawing/2014/chartex" xmlns:cx1="http://schemas.microsoft.com/office/drawing/2015/9/8/chartex" xmlns:cx2="http://schemas.microsoft.com/office/drawing/2015/10/21/chartex" xmlns:cx3="http://schemas.microsoft.com/office/drawing/2016/5/9/chartex" xmlns:cx4="http://schemas.microsoft.com/office/drawing/2016/5/10/chartex" xmlns:cx5="http://schemas.microsoft.com/office/drawing/2016/5/11/chartex" xmlns:cx6="http://schemas.microsoft.com/office/drawing/2016/5/12/chartex" xmlns:cx7="http://schemas.microsoft.com/office/drawing/2016/5/13/chartex" xmlns:cx8="http://schemas.microsoft.com/office/drawing/2016/5/14/chartex" xmlns:mc="http://schemas.openxmlformats.org/markup-compatibility/2006" xmlns:aink="http://schemas.microsoft.com/office/drawing/2016/ink" xmlns:am3d="http://schemas.microsoft.com/office/drawing/2017/model3d" xmlns:o="urn:schemas-microsoft-com:office:office" xmlns:oel="http://schemas.microsoft.com/office/2019/extlst" xmlns:r="http://schemas.openxmlformats.org/officeDocument/2006/relationships" xmlns:m="http://schemas.openxmlformats.org/officeDocument/2006/math" xmlns:v="urn:schemas-microsoft-com:vml" xmlns:wp14="http://schemas.microsoft.com/office/word/2010/wordprocessingDrawing" xmlns:wp="http://schemas.openxmlformats.org/drawingml/2006/wordprocessingDrawing" xmlns:w10="urn:schemas-microsoft-com:office:word" xmlns:w="http://schemas.openxmlformats.org/wordprocessingml/2006/main" xmlns:w14="http://schemas.microsoft.com/office/word/2010/wordml" xmlns:w15="http://schemas.microsoft.com/office/word/2012/wordml" xmlns:w16cex="http://schemas.microsoft.com/office/word/2018/wordml/cex" xmlns:w16cid="http://schemas.microsoft.com/office/word/2016/wordml/cid" xmlns:w16="http://schemas.microsoft.com/office/word/2018/wordml" xmlns:w16du="http://schemas.microsoft.com/office/word/2023/wordml/word16du" xmlns:w16sdtdh="http://schemas.microsoft.com/office/word/2020/wordml/sdtdatahash" xmlns:w16sdtfl="http://schemas.microsoft.com/office/word/2024/wordml/sdtformatlock" xmlns:w16se="http://schemas.microsoft.com/office/word/2015/wordml/symex" xmlns:wpg="http://schemas.microsoft.com/office/word/2010/wordprocessingGroup" xmlns:wpi="http://schemas.microsoft.com/office/word/2010/wordprocessingInk" xmlns:wne="http://schemas.microsoft.com/office/word/2006/wordml" xmlns:wps="http://schemas.microsoft.com/office/word/2010/wordprocessingShape" mc:Ignorable="w14 w15 w16se w16cid w16 w16cex w16sdtdh w16sdtfl w16du wp14">
-  <w:abstractNum w:abstractNumId="0" w15:restartNumberingAfterBreak="0">
-    <w:nsid w:val="0B7A08B7"/>
-    <w:multiLevelType w:val="multilevel"/>
-    <w:tmpl w:val="E5662154"/>
+<w:numbering xmlns:w="http://schemas.openxmlformats.org/wordprocessingml/2006/main" xmlns:o="urn:schemas-microsoft-com:office:office" xmlns:r="http://schemas.openxmlformats.org/officeDocument/2006/relationships" xmlns:v="urn:schemas-microsoft-com:vml" xmlns:mc="http://schemas.openxmlformats.org/markup-compatibility/2006" xmlns:w14="http://schemas.microsoft.com/office/word/2010/wordml" mc:Ignorable="w14">
+  <w:abstractNum w:abstractNumId="1">
     <w:lvl w:ilvl="0">
       <w:start w:val="1"/>
       <w:numFmt w:val="bullet"/>
       <w:lvlText w:val=""/>
-      <w:lvlJc w:val="left"/>
+      <w:lvlJc w:val="start"/>
+      <w:pPr>
+        <w:tabs>
+          <w:tab w:val="num" w:pos="0"/>
+        </w:tabs>
+        <w:ind w:start="720" w:hanging="360"/>
+      </w:pPr>
+      <w:rPr>
+        <w:rFonts w:ascii="Symbol" w:hAnsi="Symbol" w:cs="Symbol" w:hint="default"/>
+      </w:rPr>
+    </w:lvl>
+    <w:lvl w:ilvl="1">
+      <w:start w:val="1"/>
+      <w:numFmt w:val="bullet"/>
+      <w:lvlText w:val="o"/>
+      <w:lvlJc w:val="start"/>
+      <w:pPr>
+        <w:tabs>
+          <w:tab w:val="num" w:pos="0"/>
+        </w:tabs>
+        <w:ind w:start="1440" w:hanging="360"/>
+      </w:pPr>
+      <w:rPr>
+        <w:rFonts w:ascii="Courier New" w:hAnsi="Courier New" w:cs="Courier New" w:hint="default"/>
+      </w:rPr>
+    </w:lvl>
+    <w:lvl w:ilvl="2">
+      <w:start w:val="1"/>
+      <w:numFmt w:val="bullet"/>
+      <w:lvlText w:val=""/>
+      <w:lvlJc w:val="start"/>
+      <w:pPr>
+        <w:tabs>
+          <w:tab w:val="num" w:pos="0"/>
+        </w:tabs>
+        <w:ind w:start="2160" w:hanging="360"/>
+      </w:pPr>
+      <w:rPr>
+        <w:rFonts w:ascii="Wingdings" w:hAnsi="Wingdings" w:cs="Wingdings" w:hint="default"/>
+      </w:rPr>
+    </w:lvl>
+    <w:lvl w:ilvl="3">
+      <w:start w:val="1"/>
+      <w:numFmt w:val="bullet"/>
+      <w:lvlText w:val=""/>
+      <w:lvlJc w:val="start"/>
+      <w:pPr>
+        <w:tabs>
+          <w:tab w:val="num" w:pos="0"/>
+        </w:tabs>
+        <w:ind w:start="2880" w:hanging="360"/>
+      </w:pPr>
+      <w:rPr>
+        <w:rFonts w:ascii="Symbol" w:hAnsi="Symbol" w:cs="Symbol" w:hint="default"/>
+      </w:rPr>
+    </w:lvl>
+    <w:lvl w:ilvl="4">
+      <w:start w:val="1"/>
+      <w:numFmt w:val="bullet"/>
+      <w:lvlText w:val="o"/>
+      <w:lvlJc w:val="start"/>
+      <w:pPr>
+        <w:tabs>
+          <w:tab w:val="num" w:pos="0"/>
+        </w:tabs>
+        <w:ind w:start="3600" w:hanging="360"/>
+      </w:pPr>
+      <w:rPr>
+        <w:rFonts w:ascii="Courier New" w:hAnsi="Courier New" w:cs="Courier New" w:hint="default"/>
+      </w:rPr>
+    </w:lvl>
+    <w:lvl w:ilvl="5">
+      <w:start w:val="1"/>
+      <w:numFmt w:val="bullet"/>
+      <w:lvlText w:val=""/>
+      <w:lvlJc w:val="start"/>
+      <w:pPr>
+        <w:tabs>
+          <w:tab w:val="num" w:pos="0"/>
+        </w:tabs>
+        <w:ind w:start="4320" w:hanging="360"/>
+      </w:pPr>
+      <w:rPr>
+        <w:rFonts w:ascii="Wingdings" w:hAnsi="Wingdings" w:cs="Wingdings" w:hint="default"/>
+      </w:rPr>
+    </w:lvl>
+    <w:lvl w:ilvl="6">
+      <w:start w:val="1"/>
+      <w:numFmt w:val="bullet"/>
+      <w:lvlText w:val=""/>
+      <w:lvlJc w:val="start"/>
+      <w:pPr>
+        <w:tabs>
+          <w:tab w:val="num" w:pos="0"/>
+        </w:tabs>
+        <w:ind w:start="5040" w:hanging="360"/>
+      </w:pPr>
+      <w:rPr>
+        <w:rFonts w:ascii="Symbol" w:hAnsi="Symbol" w:cs="Symbol" w:hint="default"/>
+      </w:rPr>
+    </w:lvl>
+    <w:lvl w:ilvl="7">
+      <w:start w:val="1"/>
+      <w:numFmt w:val="bullet"/>
+      <w:lvlText w:val="o"/>
+      <w:lvlJc w:val="start"/>
+      <w:pPr>
+        <w:tabs>
+          <w:tab w:val="num" w:pos="0"/>
+        </w:tabs>
+        <w:ind w:start="5760" w:hanging="360"/>
+      </w:pPr>
+      <w:rPr>
+        <w:rFonts w:ascii="Courier New" w:hAnsi="Courier New" w:cs="Courier New" w:hint="default"/>
+      </w:rPr>
+    </w:lvl>
+    <w:lvl w:ilvl="8">
+      <w:start w:val="1"/>
+      <w:numFmt w:val="bullet"/>
+      <w:lvlText w:val=""/>
+      <w:lvlJc w:val="start"/>
+      <w:pPr>
+        <w:tabs>
+          <w:tab w:val="num" w:pos="0"/>
+        </w:tabs>
+        <w:ind w:start="6480" w:hanging="360"/>
+      </w:pPr>
+      <w:rPr>
+        <w:rFonts w:ascii="Wingdings" w:hAnsi="Wingdings" w:cs="Wingdings" w:hint="default"/>
+      </w:rPr>
+    </w:lvl>
+  </w:abstractNum>
+  <w:abstractNum w:abstractNumId="2">
+    <w:lvl w:ilvl="0">
+      <w:start w:val="1"/>
+      <w:numFmt w:val="bullet"/>
+      <w:lvlText w:val=""/>
+      <w:lvlJc w:val="start"/>
       <w:pPr>
         <w:tabs>
           <w:tab w:val="num" w:pos="720"/>
         </w:tabs>
-        <w:ind w:left="720" w:hanging="360"/>
+        <w:ind w:start="720" w:hanging="360"/>
       </w:pPr>
       <w:rPr>
         <w:rFonts w:ascii="Symbol" w:hAnsi="Symbol" w:cs="Symbol" w:hint="default"/>
@@ -1120,12 +1627,12 @@
       <w:start w:val="1"/>
       <w:numFmt w:val="bullet"/>
       <w:lvlText w:val="◦"/>
-      <w:lvlJc w:val="left"/>
+      <w:lvlJc w:val="start"/>
       <w:pPr>
         <w:tabs>
           <w:tab w:val="num" w:pos="1080"/>
         </w:tabs>
-        <w:ind w:left="1080" w:hanging="360"/>
+        <w:ind w:start="1080" w:hanging="360"/>
       </w:pPr>
       <w:rPr>
         <w:rFonts w:ascii="OpenSymbol" w:hAnsi="OpenSymbol" w:cs="OpenSymbol" w:hint="default"/>
@@ -1135,12 +1642,12 @@
       <w:start w:val="1"/>
       <w:numFmt w:val="bullet"/>
       <w:lvlText w:val="▪"/>
-      <w:lvlJc w:val="left"/>
+      <w:lvlJc w:val="start"/>
       <w:pPr>
         <w:tabs>
           <w:tab w:val="num" w:pos="1440"/>
         </w:tabs>
-        <w:ind w:left="1440" w:hanging="360"/>
+        <w:ind w:start="1440" w:hanging="360"/>
       </w:pPr>
       <w:rPr>
         <w:rFonts w:ascii="OpenSymbol" w:hAnsi="OpenSymbol" w:cs="OpenSymbol" w:hint="default"/>
@@ -1150,12 +1657,12 @@
       <w:start w:val="1"/>
       <w:numFmt w:val="bullet"/>
       <w:lvlText w:val=""/>
-      <w:lvlJc w:val="left"/>
+      <w:lvlJc w:val="start"/>
       <w:pPr>
         <w:tabs>
           <w:tab w:val="num" w:pos="1800"/>
         </w:tabs>
-        <w:ind w:left="1800" w:hanging="360"/>
+        <w:ind w:start="1800" w:hanging="360"/>
       </w:pPr>
       <w:rPr>
         <w:rFonts w:ascii="Symbol" w:hAnsi="Symbol" w:cs="Symbol" w:hint="default"/>
@@ -1165,12 +1672,12 @@
       <w:start w:val="1"/>
       <w:numFmt w:val="bullet"/>
       <w:lvlText w:val="◦"/>
-      <w:lvlJc w:val="left"/>
+      <w:lvlJc w:val="start"/>
       <w:pPr>
         <w:tabs>
           <w:tab w:val="num" w:pos="2160"/>
         </w:tabs>
-        <w:ind w:left="2160" w:hanging="360"/>
+        <w:ind w:start="2160" w:hanging="360"/>
       </w:pPr>
       <w:rPr>
         <w:rFonts w:ascii="OpenSymbol" w:hAnsi="OpenSymbol" w:cs="OpenSymbol" w:hint="default"/>
@@ -1180,12 +1687,12 @@
       <w:start w:val="1"/>
       <w:numFmt w:val="bullet"/>
       <w:lvlText w:val="▪"/>
-      <w:lvlJc w:val="left"/>
+      <w:lvlJc w:val="start"/>
       <w:pPr>
         <w:tabs>
           <w:tab w:val="num" w:pos="2520"/>
         </w:tabs>
-        <w:ind w:left="2520" w:hanging="360"/>
+        <w:ind w:start="2520" w:hanging="360"/>
       </w:pPr>
       <w:rPr>
         <w:rFonts w:ascii="OpenSymbol" w:hAnsi="OpenSymbol" w:cs="OpenSymbol" w:hint="default"/>
@@ -1195,12 +1702,12 @@
       <w:start w:val="1"/>
       <w:numFmt w:val="bullet"/>
       <w:lvlText w:val=""/>
-      <w:lvlJc w:val="left"/>
+      <w:lvlJc w:val="start"/>
       <w:pPr>
         <w:tabs>
           <w:tab w:val="num" w:pos="2880"/>
         </w:tabs>
-        <w:ind w:left="2880" w:hanging="360"/>
+        <w:ind w:start="2880" w:hanging="360"/>
       </w:pPr>
       <w:rPr>
         <w:rFonts w:ascii="Symbol" w:hAnsi="Symbol" w:cs="Symbol" w:hint="default"/>
@@ -1210,12 +1717,12 @@
       <w:start w:val="1"/>
       <w:numFmt w:val="bullet"/>
       <w:lvlText w:val="◦"/>
-      <w:lvlJc w:val="left"/>
+      <w:lvlJc w:val="start"/>
       <w:pPr>
         <w:tabs>
           <w:tab w:val="num" w:pos="3240"/>
         </w:tabs>
-        <w:ind w:left="3240" w:hanging="360"/>
+        <w:ind w:start="3240" w:hanging="360"/>
       </w:pPr>
       <w:rPr>
         <w:rFonts w:ascii="OpenSymbol" w:hAnsi="OpenSymbol" w:cs="OpenSymbol" w:hint="default"/>
@@ -1225,32 +1732,29 @@
       <w:start w:val="1"/>
       <w:numFmt w:val="bullet"/>
       <w:lvlText w:val="▪"/>
-      <w:lvlJc w:val="left"/>
+      <w:lvlJc w:val="start"/>
       <w:pPr>
         <w:tabs>
           <w:tab w:val="num" w:pos="3600"/>
         </w:tabs>
-        <w:ind w:left="3600" w:hanging="360"/>
+        <w:ind w:start="3600" w:hanging="360"/>
       </w:pPr>
       <w:rPr>
         <w:rFonts w:ascii="OpenSymbol" w:hAnsi="OpenSymbol" w:cs="OpenSymbol" w:hint="default"/>
       </w:rPr>
     </w:lvl>
   </w:abstractNum>
-  <w:abstractNum w:abstractNumId="1" w15:restartNumberingAfterBreak="0">
-    <w:nsid w:val="1094281C"/>
-    <w:multiLevelType w:val="multilevel"/>
-    <w:tmpl w:val="E96EE116"/>
+  <w:abstractNum w:abstractNumId="3">
     <w:lvl w:ilvl="0">
       <w:start w:val="1"/>
       <w:numFmt w:val="bullet"/>
       <w:lvlText w:val=""/>
-      <w:lvlJc w:val="left"/>
+      <w:lvlJc w:val="start"/>
       <w:pPr>
         <w:tabs>
           <w:tab w:val="num" w:pos="720"/>
         </w:tabs>
-        <w:ind w:left="720" w:hanging="360"/>
+        <w:ind w:start="720" w:hanging="360"/>
       </w:pPr>
       <w:rPr>
         <w:rFonts w:ascii="Symbol" w:hAnsi="Symbol" w:cs="Symbol" w:hint="default"/>
@@ -1260,12 +1764,12 @@
       <w:start w:val="1"/>
       <w:numFmt w:val="bullet"/>
       <w:lvlText w:val="◦"/>
-      <w:lvlJc w:val="left"/>
+      <w:lvlJc w:val="start"/>
       <w:pPr>
         <w:tabs>
           <w:tab w:val="num" w:pos="1080"/>
         </w:tabs>
-        <w:ind w:left="1080" w:hanging="360"/>
+        <w:ind w:start="1080" w:hanging="360"/>
       </w:pPr>
       <w:rPr>
         <w:rFonts w:ascii="OpenSymbol" w:hAnsi="OpenSymbol" w:cs="OpenSymbol" w:hint="default"/>
@@ -1275,12 +1779,12 @@
       <w:start w:val="1"/>
       <w:numFmt w:val="bullet"/>
       <w:lvlText w:val="▪"/>
-      <w:lvlJc w:val="left"/>
+      <w:lvlJc w:val="start"/>
       <w:pPr>
         <w:tabs>
           <w:tab w:val="num" w:pos="1440"/>
         </w:tabs>
-        <w:ind w:left="1440" w:hanging="360"/>
+        <w:ind w:start="1440" w:hanging="360"/>
       </w:pPr>
       <w:rPr>
         <w:rFonts w:ascii="OpenSymbol" w:hAnsi="OpenSymbol" w:cs="OpenSymbol" w:hint="default"/>
@@ -1290,12 +1794,12 @@
       <w:start w:val="1"/>
       <w:numFmt w:val="bullet"/>
       <w:lvlText w:val=""/>
-      <w:lvlJc w:val="left"/>
+      <w:lvlJc w:val="start"/>
       <w:pPr>
         <w:tabs>
           <w:tab w:val="num" w:pos="1800"/>
         </w:tabs>
-        <w:ind w:left="1800" w:hanging="360"/>
+        <w:ind w:start="1800" w:hanging="360"/>
       </w:pPr>
       <w:rPr>
         <w:rFonts w:ascii="Symbol" w:hAnsi="Symbol" w:cs="Symbol" w:hint="default"/>
@@ -1305,12 +1809,12 @@
       <w:start w:val="1"/>
       <w:numFmt w:val="bullet"/>
       <w:lvlText w:val="◦"/>
-      <w:lvlJc w:val="left"/>
+      <w:lvlJc w:val="start"/>
       <w:pPr>
         <w:tabs>
           <w:tab w:val="num" w:pos="2160"/>
         </w:tabs>
-        <w:ind w:left="2160" w:hanging="360"/>
+        <w:ind w:start="2160" w:hanging="360"/>
       </w:pPr>
       <w:rPr>
         <w:rFonts w:ascii="OpenSymbol" w:hAnsi="OpenSymbol" w:cs="OpenSymbol" w:hint="default"/>
@@ -1320,12 +1824,12 @@
       <w:start w:val="1"/>
       <w:numFmt w:val="bullet"/>
       <w:lvlText w:val="▪"/>
-      <w:lvlJc w:val="left"/>
+      <w:lvlJc w:val="start"/>
       <w:pPr>
         <w:tabs>
           <w:tab w:val="num" w:pos="2520"/>
         </w:tabs>
-        <w:ind w:left="2520" w:hanging="360"/>
+        <w:ind w:start="2520" w:hanging="360"/>
       </w:pPr>
       <w:rPr>
         <w:rFonts w:ascii="OpenSymbol" w:hAnsi="OpenSymbol" w:cs="OpenSymbol" w:hint="default"/>
@@ -1335,12 +1839,12 @@
       <w:start w:val="1"/>
       <w:numFmt w:val="bullet"/>
       <w:lvlText w:val=""/>
-      <w:lvlJc w:val="left"/>
+      <w:lvlJc w:val="start"/>
       <w:pPr>
         <w:tabs>
           <w:tab w:val="num" w:pos="2880"/>
         </w:tabs>
-        <w:ind w:left="2880" w:hanging="360"/>
+        <w:ind w:start="2880" w:hanging="360"/>
       </w:pPr>
       <w:rPr>
         <w:rFonts w:ascii="Symbol" w:hAnsi="Symbol" w:cs="Symbol" w:hint="default"/>
@@ -1350,12 +1854,12 @@
       <w:start w:val="1"/>
       <w:numFmt w:val="bullet"/>
       <w:lvlText w:val="◦"/>
-      <w:lvlJc w:val="left"/>
+      <w:lvlJc w:val="start"/>
       <w:pPr>
         <w:tabs>
           <w:tab w:val="num" w:pos="3240"/>
         </w:tabs>
-        <w:ind w:left="3240" w:hanging="360"/>
+        <w:ind w:start="3240" w:hanging="360"/>
       </w:pPr>
       <w:rPr>
         <w:rFonts w:ascii="OpenSymbol" w:hAnsi="OpenSymbol" w:cs="OpenSymbol" w:hint="default"/>
@@ -1365,32 +1869,29 @@
       <w:start w:val="1"/>
       <w:numFmt w:val="bullet"/>
       <w:lvlText w:val="▪"/>
-      <w:lvlJc w:val="left"/>
+      <w:lvlJc w:val="start"/>
       <w:pPr>
         <w:tabs>
           <w:tab w:val="num" w:pos="3600"/>
         </w:tabs>
-        <w:ind w:left="3600" w:hanging="360"/>
+        <w:ind w:start="3600" w:hanging="360"/>
       </w:pPr>
       <w:rPr>
         <w:rFonts w:ascii="OpenSymbol" w:hAnsi="OpenSymbol" w:cs="OpenSymbol" w:hint="default"/>
       </w:rPr>
     </w:lvl>
   </w:abstractNum>
-  <w:abstractNum w:abstractNumId="2" w15:restartNumberingAfterBreak="0">
-    <w:nsid w:val="181A570A"/>
-    <w:multiLevelType w:val="multilevel"/>
-    <w:tmpl w:val="E0E43CEC"/>
+  <w:abstractNum w:abstractNumId="4">
     <w:lvl w:ilvl="0">
       <w:start w:val="1"/>
       <w:numFmt w:val="bullet"/>
       <w:lvlText w:val=""/>
-      <w:lvlJc w:val="left"/>
-      <w:pPr>
-        <w:tabs>
-          <w:tab w:val="num" w:pos="0"/>
-        </w:tabs>
-        <w:ind w:left="720" w:hanging="360"/>
+      <w:lvlJc w:val="start"/>
+      <w:pPr>
+        <w:tabs>
+          <w:tab w:val="num" w:pos="720"/>
+        </w:tabs>
+        <w:ind w:start="720" w:hanging="360"/>
       </w:pPr>
       <w:rPr>
         <w:rFonts w:ascii="Symbol" w:hAnsi="Symbol" w:cs="Symbol" w:hint="default"/>
@@ -1399,43 +1900,43 @@
     <w:lvl w:ilvl="1">
       <w:start w:val="1"/>
       <w:numFmt w:val="bullet"/>
-      <w:lvlText w:val="o"/>
-      <w:lvlJc w:val="left"/>
-      <w:pPr>
-        <w:tabs>
-          <w:tab w:val="num" w:pos="0"/>
-        </w:tabs>
-        <w:ind w:left="1440" w:hanging="360"/>
-      </w:pPr>
-      <w:rPr>
-        <w:rFonts w:ascii="Courier New" w:hAnsi="Courier New" w:cs="Courier New" w:hint="default"/>
+      <w:lvlText w:val="◦"/>
+      <w:lvlJc w:val="start"/>
+      <w:pPr>
+        <w:tabs>
+          <w:tab w:val="num" w:pos="1080"/>
+        </w:tabs>
+        <w:ind w:start="1080" w:hanging="360"/>
+      </w:pPr>
+      <w:rPr>
+        <w:rFonts w:ascii="OpenSymbol" w:hAnsi="OpenSymbol" w:cs="OpenSymbol" w:hint="default"/>
       </w:rPr>
     </w:lvl>
     <w:lvl w:ilvl="2">
       <w:start w:val="1"/>
       <w:numFmt w:val="bullet"/>
-      <w:lvlText w:val=""/>
-      <w:lvlJc w:val="left"/>
-      <w:pPr>
-        <w:tabs>
-          <w:tab w:val="num" w:pos="0"/>
-        </w:tabs>
-        <w:ind w:left="2160" w:hanging="360"/>
-      </w:pPr>
-      <w:rPr>
-        <w:rFonts w:ascii="Wingdings" w:hAnsi="Wingdings" w:cs="Wingdings" w:hint="default"/>
+      <w:lvlText w:val="▪"/>
+      <w:lvlJc w:val="start"/>
+      <w:pPr>
+        <w:tabs>
+          <w:tab w:val="num" w:pos="1440"/>
+        </w:tabs>
+        <w:ind w:start="1440" w:hanging="360"/>
+      </w:pPr>
+      <w:rPr>
+        <w:rFonts w:ascii="OpenSymbol" w:hAnsi="OpenSymbol" w:cs="OpenSymbol" w:hint="default"/>
       </w:rPr>
     </w:lvl>
     <w:lvl w:ilvl="3">
       <w:start w:val="1"/>
       <w:numFmt w:val="bullet"/>
       <w:lvlText w:val=""/>
-      <w:lvlJc w:val="left"/>
-      <w:pPr>
-        <w:tabs>
-          <w:tab w:val="num" w:pos="0"/>
-        </w:tabs>
-        <w:ind w:left="2880" w:hanging="360"/>
+      <w:lvlJc w:val="start"/>
+      <w:pPr>
+        <w:tabs>
+          <w:tab w:val="num" w:pos="1800"/>
+        </w:tabs>
+        <w:ind w:start="1800" w:hanging="360"/>
       </w:pPr>
       <w:rPr>
         <w:rFonts w:ascii="Symbol" w:hAnsi="Symbol" w:cs="Symbol" w:hint="default"/>
@@ -1444,43 +1945,43 @@
     <w:lvl w:ilvl="4">
       <w:start w:val="1"/>
       <w:numFmt w:val="bullet"/>
-      <w:lvlText w:val="o"/>
-      <w:lvlJc w:val="left"/>
-      <w:pPr>
-        <w:tabs>
-          <w:tab w:val="num" w:pos="0"/>
-        </w:tabs>
-        <w:ind w:left="3600" w:hanging="360"/>
-      </w:pPr>
-      <w:rPr>
-        <w:rFonts w:ascii="Courier New" w:hAnsi="Courier New" w:cs="Courier New" w:hint="default"/>
+      <w:lvlText w:val="◦"/>
+      <w:lvlJc w:val="start"/>
+      <w:pPr>
+        <w:tabs>
+          <w:tab w:val="num" w:pos="2160"/>
+        </w:tabs>
+        <w:ind w:start="2160" w:hanging="360"/>
+      </w:pPr>
+      <w:rPr>
+        <w:rFonts w:ascii="OpenSymbol" w:hAnsi="OpenSymbol" w:cs="OpenSymbol" w:hint="default"/>
       </w:rPr>
     </w:lvl>
     <w:lvl w:ilvl="5">
       <w:start w:val="1"/>
       <w:numFmt w:val="bullet"/>
-      <w:lvlText w:val=""/>
-      <w:lvlJc w:val="left"/>
-      <w:pPr>
-        <w:tabs>
-          <w:tab w:val="num" w:pos="0"/>
-        </w:tabs>
-        <w:ind w:left="4320" w:hanging="360"/>
-      </w:pPr>
-      <w:rPr>
-        <w:rFonts w:ascii="Wingdings" w:hAnsi="Wingdings" w:cs="Wingdings" w:hint="default"/>
+      <w:lvlText w:val="▪"/>
+      <w:lvlJc w:val="start"/>
+      <w:pPr>
+        <w:tabs>
+          <w:tab w:val="num" w:pos="2520"/>
+        </w:tabs>
+        <w:ind w:start="2520" w:hanging="360"/>
+      </w:pPr>
+      <w:rPr>
+        <w:rFonts w:ascii="OpenSymbol" w:hAnsi="OpenSymbol" w:cs="OpenSymbol" w:hint="default"/>
       </w:rPr>
     </w:lvl>
     <w:lvl w:ilvl="6">
       <w:start w:val="1"/>
       <w:numFmt w:val="bullet"/>
       <w:lvlText w:val=""/>
-      <w:lvlJc w:val="left"/>
-      <w:pPr>
-        <w:tabs>
-          <w:tab w:val="num" w:pos="0"/>
-        </w:tabs>
-        <w:ind w:left="5040" w:hanging="360"/>
+      <w:lvlJc w:val="start"/>
+      <w:pPr>
+        <w:tabs>
+          <w:tab w:val="num" w:pos="2880"/>
+        </w:tabs>
+        <w:ind w:start="2880" w:hanging="360"/>
       </w:pPr>
       <w:rPr>
         <w:rFonts w:ascii="Symbol" w:hAnsi="Symbol" w:cs="Symbol" w:hint="default"/>
@@ -1489,48 +1990,45 @@
     <w:lvl w:ilvl="7">
       <w:start w:val="1"/>
       <w:numFmt w:val="bullet"/>
-      <w:lvlText w:val="o"/>
-      <w:lvlJc w:val="left"/>
-      <w:pPr>
-        <w:tabs>
-          <w:tab w:val="num" w:pos="0"/>
-        </w:tabs>
-        <w:ind w:left="5760" w:hanging="360"/>
-      </w:pPr>
-      <w:rPr>
-        <w:rFonts w:ascii="Courier New" w:hAnsi="Courier New" w:cs="Courier New" w:hint="default"/>
+      <w:lvlText w:val="◦"/>
+      <w:lvlJc w:val="start"/>
+      <w:pPr>
+        <w:tabs>
+          <w:tab w:val="num" w:pos="3240"/>
+        </w:tabs>
+        <w:ind w:start="3240" w:hanging="360"/>
+      </w:pPr>
+      <w:rPr>
+        <w:rFonts w:ascii="OpenSymbol" w:hAnsi="OpenSymbol" w:cs="OpenSymbol" w:hint="default"/>
       </w:rPr>
     </w:lvl>
     <w:lvl w:ilvl="8">
       <w:start w:val="1"/>
       <w:numFmt w:val="bullet"/>
-      <w:lvlText w:val=""/>
-      <w:lvlJc w:val="left"/>
-      <w:pPr>
-        <w:tabs>
-          <w:tab w:val="num" w:pos="0"/>
-        </w:tabs>
-        <w:ind w:left="6480" w:hanging="360"/>
-      </w:pPr>
-      <w:rPr>
-        <w:rFonts w:ascii="Wingdings" w:hAnsi="Wingdings" w:cs="Wingdings" w:hint="default"/>
+      <w:lvlText w:val="▪"/>
+      <w:lvlJc w:val="start"/>
+      <w:pPr>
+        <w:tabs>
+          <w:tab w:val="num" w:pos="3600"/>
+        </w:tabs>
+        <w:ind w:start="3600" w:hanging="360"/>
+      </w:pPr>
+      <w:rPr>
+        <w:rFonts w:ascii="OpenSymbol" w:hAnsi="OpenSymbol" w:cs="OpenSymbol" w:hint="default"/>
       </w:rPr>
     </w:lvl>
   </w:abstractNum>
-  <w:abstractNum w:abstractNumId="3" w15:restartNumberingAfterBreak="0">
-    <w:nsid w:val="1E4C78B3"/>
-    <w:multiLevelType w:val="multilevel"/>
-    <w:tmpl w:val="65306590"/>
+  <w:abstractNum w:abstractNumId="5">
     <w:lvl w:ilvl="0">
       <w:start w:val="1"/>
       <w:numFmt w:val="bullet"/>
       <w:lvlText w:val=""/>
-      <w:lvlJc w:val="left"/>
+      <w:lvlJc w:val="start"/>
       <w:pPr>
         <w:tabs>
           <w:tab w:val="num" w:pos="720"/>
         </w:tabs>
-        <w:ind w:left="720" w:hanging="360"/>
+        <w:ind w:start="720" w:hanging="360"/>
       </w:pPr>
       <w:rPr>
         <w:rFonts w:ascii="Symbol" w:hAnsi="Symbol" w:cs="Symbol" w:hint="default"/>
@@ -1540,12 +2038,12 @@
       <w:start w:val="1"/>
       <w:numFmt w:val="bullet"/>
       <w:lvlText w:val="◦"/>
-      <w:lvlJc w:val="left"/>
+      <w:lvlJc w:val="start"/>
       <w:pPr>
         <w:tabs>
           <w:tab w:val="num" w:pos="1080"/>
         </w:tabs>
-        <w:ind w:left="1080" w:hanging="360"/>
+        <w:ind w:start="1080" w:hanging="360"/>
       </w:pPr>
       <w:rPr>
         <w:rFonts w:ascii="OpenSymbol" w:hAnsi="OpenSymbol" w:cs="OpenSymbol" w:hint="default"/>
@@ -1555,12 +2053,12 @@
       <w:start w:val="1"/>
       <w:numFmt w:val="bullet"/>
       <w:lvlText w:val="▪"/>
-      <w:lvlJc w:val="left"/>
+      <w:lvlJc w:val="start"/>
       <w:pPr>
         <w:tabs>
           <w:tab w:val="num" w:pos="1440"/>
         </w:tabs>
-        <w:ind w:left="1440" w:hanging="360"/>
+        <w:ind w:start="1440" w:hanging="360"/>
       </w:pPr>
       <w:rPr>
         <w:rFonts w:ascii="OpenSymbol" w:hAnsi="OpenSymbol" w:cs="OpenSymbol" w:hint="default"/>
@@ -1570,12 +2068,12 @@
       <w:start w:val="1"/>
       <w:numFmt w:val="bullet"/>
       <w:lvlText w:val=""/>
-      <w:lvlJc w:val="left"/>
+      <w:lvlJc w:val="start"/>
       <w:pPr>
         <w:tabs>
           <w:tab w:val="num" w:pos="1800"/>
         </w:tabs>
-        <w:ind w:left="1800" w:hanging="360"/>
+        <w:ind w:start="1800" w:hanging="360"/>
       </w:pPr>
       <w:rPr>
         <w:rFonts w:ascii="Symbol" w:hAnsi="Symbol" w:cs="Symbol" w:hint="default"/>
@@ -1585,12 +2083,12 @@
       <w:start w:val="1"/>
       <w:numFmt w:val="bullet"/>
       <w:lvlText w:val="◦"/>
-      <w:lvlJc w:val="left"/>
+      <w:lvlJc w:val="start"/>
       <w:pPr>
         <w:tabs>
           <w:tab w:val="num" w:pos="2160"/>
         </w:tabs>
-        <w:ind w:left="2160" w:hanging="360"/>
+        <w:ind w:start="2160" w:hanging="360"/>
       </w:pPr>
       <w:rPr>
         <w:rFonts w:ascii="OpenSymbol" w:hAnsi="OpenSymbol" w:cs="OpenSymbol" w:hint="default"/>
@@ -1600,12 +2098,12 @@
       <w:start w:val="1"/>
       <w:numFmt w:val="bullet"/>
       <w:lvlText w:val="▪"/>
-      <w:lvlJc w:val="left"/>
+      <w:lvlJc w:val="start"/>
       <w:pPr>
         <w:tabs>
           <w:tab w:val="num" w:pos="2520"/>
         </w:tabs>
-        <w:ind w:left="2520" w:hanging="360"/>
+        <w:ind w:start="2520" w:hanging="360"/>
       </w:pPr>
       <w:rPr>
         <w:rFonts w:ascii="OpenSymbol" w:hAnsi="OpenSymbol" w:cs="OpenSymbol" w:hint="default"/>
@@ -1615,12 +2113,12 @@
       <w:start w:val="1"/>
       <w:numFmt w:val="bullet"/>
       <w:lvlText w:val=""/>
-      <w:lvlJc w:val="left"/>
+      <w:lvlJc w:val="start"/>
       <w:pPr>
         <w:tabs>
           <w:tab w:val="num" w:pos="2880"/>
         </w:tabs>
-        <w:ind w:left="2880" w:hanging="360"/>
+        <w:ind w:start="2880" w:hanging="360"/>
       </w:pPr>
       <w:rPr>
         <w:rFonts w:ascii="Symbol" w:hAnsi="Symbol" w:cs="Symbol" w:hint="default"/>
@@ -1630,12 +2128,12 @@
       <w:start w:val="1"/>
       <w:numFmt w:val="bullet"/>
       <w:lvlText w:val="◦"/>
-      <w:lvlJc w:val="left"/>
+      <w:lvlJc w:val="start"/>
       <w:pPr>
         <w:tabs>
           <w:tab w:val="num" w:pos="3240"/>
         </w:tabs>
-        <w:ind w:left="3240" w:hanging="360"/>
+        <w:ind w:start="3240" w:hanging="360"/>
       </w:pPr>
       <w:rPr>
         <w:rFonts w:ascii="OpenSymbol" w:hAnsi="OpenSymbol" w:cs="OpenSymbol" w:hint="default"/>
@@ -1645,32 +2143,29 @@
       <w:start w:val="1"/>
       <w:numFmt w:val="bullet"/>
       <w:lvlText w:val="▪"/>
-      <w:lvlJc w:val="left"/>
+      <w:lvlJc w:val="start"/>
       <w:pPr>
         <w:tabs>
           <w:tab w:val="num" w:pos="3600"/>
         </w:tabs>
-        <w:ind w:left="3600" w:hanging="360"/>
+        <w:ind w:start="3600" w:hanging="360"/>
       </w:pPr>
       <w:rPr>
         <w:rFonts w:ascii="OpenSymbol" w:hAnsi="OpenSymbol" w:cs="OpenSymbol" w:hint="default"/>
       </w:rPr>
     </w:lvl>
   </w:abstractNum>
-  <w:abstractNum w:abstractNumId="4" w15:restartNumberingAfterBreak="0">
-    <w:nsid w:val="275934F5"/>
-    <w:multiLevelType w:val="multilevel"/>
-    <w:tmpl w:val="9C784088"/>
+  <w:abstractNum w:abstractNumId="6">
     <w:lvl w:ilvl="0">
       <w:start w:val="1"/>
       <w:numFmt w:val="bullet"/>
       <w:lvlText w:val=""/>
-      <w:lvlJc w:val="left"/>
+      <w:lvlJc w:val="start"/>
       <w:pPr>
         <w:tabs>
           <w:tab w:val="num" w:pos="720"/>
         </w:tabs>
-        <w:ind w:left="720" w:hanging="360"/>
+        <w:ind w:start="720" w:hanging="360"/>
       </w:pPr>
       <w:rPr>
         <w:rFonts w:ascii="Symbol" w:hAnsi="Symbol" w:cs="Symbol" w:hint="default"/>
@@ -1680,12 +2175,12 @@
       <w:start w:val="1"/>
       <w:numFmt w:val="bullet"/>
       <w:lvlText w:val="◦"/>
-      <w:lvlJc w:val="left"/>
+      <w:lvlJc w:val="start"/>
       <w:pPr>
         <w:tabs>
           <w:tab w:val="num" w:pos="1080"/>
         </w:tabs>
-        <w:ind w:left="1080" w:hanging="360"/>
+        <w:ind w:start="1080" w:hanging="360"/>
       </w:pPr>
       <w:rPr>
         <w:rFonts w:ascii="OpenSymbol" w:hAnsi="OpenSymbol" w:cs="OpenSymbol" w:hint="default"/>
@@ -1695,12 +2190,12 @@
       <w:start w:val="1"/>
       <w:numFmt w:val="bullet"/>
       <w:lvlText w:val="▪"/>
-      <w:lvlJc w:val="left"/>
+      <w:lvlJc w:val="start"/>
       <w:pPr>
         <w:tabs>
           <w:tab w:val="num" w:pos="1440"/>
         </w:tabs>
-        <w:ind w:left="1440" w:hanging="360"/>
+        <w:ind w:start="1440" w:hanging="360"/>
       </w:pPr>
       <w:rPr>
         <w:rFonts w:ascii="OpenSymbol" w:hAnsi="OpenSymbol" w:cs="OpenSymbol" w:hint="default"/>
@@ -1710,12 +2205,12 @@
       <w:start w:val="1"/>
       <w:numFmt w:val="bullet"/>
       <w:lvlText w:val=""/>
-      <w:lvlJc w:val="left"/>
+      <w:lvlJc w:val="start"/>
       <w:pPr>
         <w:tabs>
           <w:tab w:val="num" w:pos="1800"/>
         </w:tabs>
-        <w:ind w:left="1800" w:hanging="360"/>
+        <w:ind w:start="1800" w:hanging="360"/>
       </w:pPr>
       <w:rPr>
         <w:rFonts w:ascii="Symbol" w:hAnsi="Symbol" w:cs="Symbol" w:hint="default"/>
@@ -1725,12 +2220,12 @@
       <w:start w:val="1"/>
       <w:numFmt w:val="bullet"/>
       <w:lvlText w:val="◦"/>
-      <w:lvlJc w:val="left"/>
+      <w:lvlJc w:val="start"/>
       <w:pPr>
         <w:tabs>
           <w:tab w:val="num" w:pos="2160"/>
         </w:tabs>
-        <w:ind w:left="2160" w:hanging="360"/>
+        <w:ind w:start="2160" w:hanging="360"/>
       </w:pPr>
       <w:rPr>
         <w:rFonts w:ascii="OpenSymbol" w:hAnsi="OpenSymbol" w:cs="OpenSymbol" w:hint="default"/>
@@ -1740,12 +2235,12 @@
       <w:start w:val="1"/>
       <w:numFmt w:val="bullet"/>
       <w:lvlText w:val="▪"/>
-      <w:lvlJc w:val="left"/>
+      <w:lvlJc w:val="start"/>
       <w:pPr>
         <w:tabs>
           <w:tab w:val="num" w:pos="2520"/>
         </w:tabs>
-        <w:ind w:left="2520" w:hanging="360"/>
+        <w:ind w:start="2520" w:hanging="360"/>
       </w:pPr>
       <w:rPr>
         <w:rFonts w:ascii="OpenSymbol" w:hAnsi="OpenSymbol" w:cs="OpenSymbol" w:hint="default"/>
@@ -1755,12 +2250,12 @@
       <w:start w:val="1"/>
       <w:numFmt w:val="bullet"/>
       <w:lvlText w:val=""/>
-      <w:lvlJc w:val="left"/>
+      <w:lvlJc w:val="start"/>
       <w:pPr>
         <w:tabs>
           <w:tab w:val="num" w:pos="2880"/>
         </w:tabs>
-        <w:ind w:left="2880" w:hanging="360"/>
+        <w:ind w:start="2880" w:hanging="360"/>
       </w:pPr>
       <w:rPr>
         <w:rFonts w:ascii="Symbol" w:hAnsi="Symbol" w:cs="Symbol" w:hint="default"/>
@@ -1770,12 +2265,12 @@
       <w:start w:val="1"/>
       <w:numFmt w:val="bullet"/>
       <w:lvlText w:val="◦"/>
-      <w:lvlJc w:val="left"/>
+      <w:lvlJc w:val="start"/>
       <w:pPr>
         <w:tabs>
           <w:tab w:val="num" w:pos="3240"/>
         </w:tabs>
-        <w:ind w:left="3240" w:hanging="360"/>
+        <w:ind w:start="3240" w:hanging="360"/>
       </w:pPr>
       <w:rPr>
         <w:rFonts w:ascii="OpenSymbol" w:hAnsi="OpenSymbol" w:cs="OpenSymbol" w:hint="default"/>
@@ -1785,173 +2280,30 @@
       <w:start w:val="1"/>
       <w:numFmt w:val="bullet"/>
       <w:lvlText w:val="▪"/>
-      <w:lvlJc w:val="left"/>
+      <w:lvlJc w:val="start"/>
       <w:pPr>
         <w:tabs>
           <w:tab w:val="num" w:pos="3600"/>
         </w:tabs>
-        <w:ind w:left="3600" w:hanging="360"/>
+        <w:ind w:start="3600" w:hanging="360"/>
       </w:pPr>
       <w:rPr>
         <w:rFonts w:ascii="OpenSymbol" w:hAnsi="OpenSymbol" w:cs="OpenSymbol" w:hint="default"/>
       </w:rPr>
     </w:lvl>
   </w:abstractNum>
-  <w:abstractNum w:abstractNumId="5" w15:restartNumberingAfterBreak="0">
-    <w:nsid w:val="5B727E70"/>
-    <w:multiLevelType w:val="multilevel"/>
-    <w:tmpl w:val="AD38B29E"/>
-    <w:lvl w:ilvl="0">
-      <w:start w:val="1"/>
-      <w:numFmt w:val="bullet"/>
-      <w:lvlText w:val=""/>
-      <w:lvlJc w:val="left"/>
-      <w:pPr>
-        <w:tabs>
-          <w:tab w:val="num" w:pos="720"/>
-        </w:tabs>
-        <w:ind w:left="720" w:hanging="360"/>
-      </w:pPr>
-      <w:rPr>
-        <w:rFonts w:ascii="Symbol" w:hAnsi="Symbol" w:cs="Symbol" w:hint="default"/>
-      </w:rPr>
-    </w:lvl>
-    <w:lvl w:ilvl="1">
-      <w:start w:val="1"/>
-      <w:numFmt w:val="bullet"/>
-      <w:lvlText w:val="◦"/>
-      <w:lvlJc w:val="left"/>
-      <w:pPr>
-        <w:tabs>
-          <w:tab w:val="num" w:pos="1080"/>
-        </w:tabs>
-        <w:ind w:left="1080" w:hanging="360"/>
-      </w:pPr>
-      <w:rPr>
-        <w:rFonts w:ascii="OpenSymbol" w:hAnsi="OpenSymbol" w:cs="OpenSymbol" w:hint="default"/>
-      </w:rPr>
-    </w:lvl>
-    <w:lvl w:ilvl="2">
-      <w:start w:val="1"/>
-      <w:numFmt w:val="bullet"/>
-      <w:lvlText w:val="▪"/>
-      <w:lvlJc w:val="left"/>
-      <w:pPr>
-        <w:tabs>
-          <w:tab w:val="num" w:pos="1440"/>
-        </w:tabs>
-        <w:ind w:left="1440" w:hanging="360"/>
-      </w:pPr>
-      <w:rPr>
-        <w:rFonts w:ascii="OpenSymbol" w:hAnsi="OpenSymbol" w:cs="OpenSymbol" w:hint="default"/>
-      </w:rPr>
-    </w:lvl>
-    <w:lvl w:ilvl="3">
-      <w:start w:val="1"/>
-      <w:numFmt w:val="bullet"/>
-      <w:lvlText w:val=""/>
-      <w:lvlJc w:val="left"/>
-      <w:pPr>
-        <w:tabs>
-          <w:tab w:val="num" w:pos="1800"/>
-        </w:tabs>
-        <w:ind w:left="1800" w:hanging="360"/>
-      </w:pPr>
-      <w:rPr>
-        <w:rFonts w:ascii="Symbol" w:hAnsi="Symbol" w:cs="Symbol" w:hint="default"/>
-      </w:rPr>
-    </w:lvl>
-    <w:lvl w:ilvl="4">
-      <w:start w:val="1"/>
-      <w:numFmt w:val="bullet"/>
-      <w:lvlText w:val="◦"/>
-      <w:lvlJc w:val="left"/>
-      <w:pPr>
-        <w:tabs>
-          <w:tab w:val="num" w:pos="2160"/>
-        </w:tabs>
-        <w:ind w:left="2160" w:hanging="360"/>
-      </w:pPr>
-      <w:rPr>
-        <w:rFonts w:ascii="OpenSymbol" w:hAnsi="OpenSymbol" w:cs="OpenSymbol" w:hint="default"/>
-      </w:rPr>
-    </w:lvl>
-    <w:lvl w:ilvl="5">
-      <w:start w:val="1"/>
-      <w:numFmt w:val="bullet"/>
-      <w:lvlText w:val="▪"/>
-      <w:lvlJc w:val="left"/>
-      <w:pPr>
-        <w:tabs>
-          <w:tab w:val="num" w:pos="2520"/>
-        </w:tabs>
-        <w:ind w:left="2520" w:hanging="360"/>
-      </w:pPr>
-      <w:rPr>
-        <w:rFonts w:ascii="OpenSymbol" w:hAnsi="OpenSymbol" w:cs="OpenSymbol" w:hint="default"/>
-      </w:rPr>
-    </w:lvl>
-    <w:lvl w:ilvl="6">
-      <w:start w:val="1"/>
-      <w:numFmt w:val="bullet"/>
-      <w:lvlText w:val=""/>
-      <w:lvlJc w:val="left"/>
-      <w:pPr>
-        <w:tabs>
-          <w:tab w:val="num" w:pos="2880"/>
-        </w:tabs>
-        <w:ind w:left="2880" w:hanging="360"/>
-      </w:pPr>
-      <w:rPr>
-        <w:rFonts w:ascii="Symbol" w:hAnsi="Symbol" w:cs="Symbol" w:hint="default"/>
-      </w:rPr>
-    </w:lvl>
-    <w:lvl w:ilvl="7">
-      <w:start w:val="1"/>
-      <w:numFmt w:val="bullet"/>
-      <w:lvlText w:val="◦"/>
-      <w:lvlJc w:val="left"/>
-      <w:pPr>
-        <w:tabs>
-          <w:tab w:val="num" w:pos="3240"/>
-        </w:tabs>
-        <w:ind w:left="3240" w:hanging="360"/>
-      </w:pPr>
-      <w:rPr>
-        <w:rFonts w:ascii="OpenSymbol" w:hAnsi="OpenSymbol" w:cs="OpenSymbol" w:hint="default"/>
-      </w:rPr>
-    </w:lvl>
-    <w:lvl w:ilvl="8">
-      <w:start w:val="1"/>
-      <w:numFmt w:val="bullet"/>
-      <w:lvlText w:val="▪"/>
-      <w:lvlJc w:val="left"/>
-      <w:pPr>
-        <w:tabs>
-          <w:tab w:val="num" w:pos="3600"/>
-        </w:tabs>
-        <w:ind w:left="3600" w:hanging="360"/>
-      </w:pPr>
-      <w:rPr>
-        <w:rFonts w:ascii="OpenSymbol" w:hAnsi="OpenSymbol" w:cs="OpenSymbol" w:hint="default"/>
-      </w:rPr>
-    </w:lvl>
-  </w:abstractNum>
-  <w:abstractNum w:abstractNumId="6" w15:restartNumberingAfterBreak="0">
-    <w:nsid w:val="73316D80"/>
-    <w:multiLevelType w:val="multilevel"/>
-    <w:tmpl w:val="073006FA"/>
+  <w:abstractNum w:abstractNumId="7">
     <w:lvl w:ilvl="0">
       <w:start w:val="1"/>
       <w:numFmt w:val="none"/>
       <w:suff w:val="nothing"/>
       <w:lvlText w:val=""/>
-      <w:lvlJc w:val="left"/>
+      <w:lvlJc w:val="start"/>
       <w:pPr>
         <w:tabs>
           <w:tab w:val="num" w:pos="0"/>
         </w:tabs>
-        <w:ind w:left="0" w:firstLine="0"/>
+        <w:ind w:start="0" w:hanging="0"/>
       </w:pPr>
     </w:lvl>
     <w:lvl w:ilvl="1">
@@ -1959,12 +2311,12 @@
       <w:numFmt w:val="none"/>
       <w:suff w:val="nothing"/>
       <w:lvlText w:val=""/>
-      <w:lvlJc w:val="left"/>
+      <w:lvlJc w:val="start"/>
       <w:pPr>
         <w:tabs>
           <w:tab w:val="num" w:pos="0"/>
         </w:tabs>
-        <w:ind w:left="0" w:firstLine="0"/>
+        <w:ind w:start="0" w:hanging="0"/>
       </w:pPr>
     </w:lvl>
     <w:lvl w:ilvl="2">
@@ -1972,12 +2324,12 @@
       <w:numFmt w:val="none"/>
       <w:suff w:val="nothing"/>
       <w:lvlText w:val=""/>
-      <w:lvlJc w:val="left"/>
+      <w:lvlJc w:val="start"/>
       <w:pPr>
         <w:tabs>
           <w:tab w:val="num" w:pos="0"/>
         </w:tabs>
-        <w:ind w:left="0" w:firstLine="0"/>
+        <w:ind w:start="0" w:hanging="0"/>
       </w:pPr>
     </w:lvl>
     <w:lvl w:ilvl="3">
@@ -1985,12 +2337,12 @@
       <w:numFmt w:val="none"/>
       <w:suff w:val="nothing"/>
       <w:lvlText w:val=""/>
-      <w:lvlJc w:val="left"/>
+      <w:lvlJc w:val="start"/>
       <w:pPr>
         <w:tabs>
           <w:tab w:val="num" w:pos="0"/>
         </w:tabs>
-        <w:ind w:left="0" w:firstLine="0"/>
+        <w:ind w:start="0" w:hanging="0"/>
       </w:pPr>
     </w:lvl>
     <w:lvl w:ilvl="4">
@@ -1998,12 +2350,12 @@
       <w:numFmt w:val="none"/>
       <w:suff w:val="nothing"/>
       <w:lvlText w:val=""/>
-      <w:lvlJc w:val="left"/>
+      <w:lvlJc w:val="start"/>
       <w:pPr>
         <w:tabs>
           <w:tab w:val="num" w:pos="0"/>
         </w:tabs>
-        <w:ind w:left="0" w:firstLine="0"/>
+        <w:ind w:start="0" w:hanging="0"/>
       </w:pPr>
     </w:lvl>
     <w:lvl w:ilvl="5">
@@ -2011,12 +2363,12 @@
       <w:numFmt w:val="none"/>
       <w:suff w:val="nothing"/>
       <w:lvlText w:val=""/>
-      <w:lvlJc w:val="left"/>
+      <w:lvlJc w:val="start"/>
       <w:pPr>
         <w:tabs>
           <w:tab w:val="num" w:pos="0"/>
         </w:tabs>
-        <w:ind w:left="0" w:firstLine="0"/>
+        <w:ind w:start="0" w:hanging="0"/>
       </w:pPr>
     </w:lvl>
     <w:lvl w:ilvl="6">
@@ -2024,12 +2376,12 @@
       <w:numFmt w:val="none"/>
       <w:suff w:val="nothing"/>
       <w:lvlText w:val=""/>
-      <w:lvlJc w:val="left"/>
+      <w:lvlJc w:val="start"/>
       <w:pPr>
         <w:tabs>
           <w:tab w:val="num" w:pos="0"/>
         </w:tabs>
-        <w:ind w:left="0" w:firstLine="0"/>
+        <w:ind w:start="0" w:hanging="0"/>
       </w:pPr>
     </w:lvl>
     <w:lvl w:ilvl="7">
@@ -2037,12 +2389,12 @@
       <w:numFmt w:val="none"/>
       <w:suff w:val="nothing"/>
       <w:lvlText w:val=""/>
-      <w:lvlJc w:val="left"/>
+      <w:lvlJc w:val="start"/>
       <w:pPr>
         <w:tabs>
           <w:tab w:val="num" w:pos="0"/>
         </w:tabs>
-        <w:ind w:left="0" w:firstLine="0"/>
+        <w:ind w:start="0" w:hanging="0"/>
       </w:pPr>
     </w:lvl>
     <w:lvl w:ilvl="8">
@@ -2050,45 +2402,45 @@
       <w:numFmt w:val="none"/>
       <w:suff w:val="nothing"/>
       <w:lvlText w:val=""/>
-      <w:lvlJc w:val="left"/>
+      <w:lvlJc w:val="start"/>
       <w:pPr>
         <w:tabs>
           <w:tab w:val="num" w:pos="0"/>
         </w:tabs>
-        <w:ind w:left="0" w:firstLine="0"/>
+        <w:ind w:start="0" w:hanging="0"/>
       </w:pPr>
     </w:lvl>
   </w:abstractNum>
-  <w:num w:numId="1" w16cid:durableId="773747469">
+  <w:num w:numId="1">
+    <w:abstractNumId w:val="1"/>
+  </w:num>
+  <w:num w:numId="2">
     <w:abstractNumId w:val="2"/>
   </w:num>
-  <w:num w:numId="2" w16cid:durableId="535310847">
-    <w:abstractNumId w:val="1"/>
-  </w:num>
-  <w:num w:numId="3" w16cid:durableId="1143304445">
+  <w:num w:numId="3">
     <w:abstractNumId w:val="3"/>
   </w:num>
-  <w:num w:numId="4" w16cid:durableId="1770202458">
+  <w:num w:numId="4">
+    <w:abstractNumId w:val="4"/>
+  </w:num>
+  <w:num w:numId="5">
     <w:abstractNumId w:val="5"/>
   </w:num>
-  <w:num w:numId="5" w16cid:durableId="514612448">
-    <w:abstractNumId w:val="0"/>
+  <w:num w:numId="6">
+    <w:abstractNumId w:val="6"/>
   </w:num>
-  <w:num w:numId="6" w16cid:durableId="120080238">
-    <w:abstractNumId w:val="4"/>
-  </w:num>
-  <w:num w:numId="7" w16cid:durableId="670067487">
-    <w:abstractNumId w:val="6"/>
+  <w:num w:numId="7">
+    <w:abstractNumId w:val="7"/>
   </w:num>
 </w:numbering>
 </file>
 
 <file path=word/styles.xml><?xml version="1.0" encoding="utf-8"?>
-<w:styles xmlns:mc="http://schemas.openxmlformats.org/markup-compatibility/2006" xmlns:r="http://schemas.openxmlformats.org/officeDocument/2006/relationships" xmlns:w="http://schemas.openxmlformats.org/wordprocessingml/2006/main" xmlns:w14="http://schemas.microsoft.com/office/word/2010/wordml" xmlns:w15="http://schemas.microsoft.com/office/word/2012/wordml" xmlns:w16cex="http://schemas.microsoft.com/office/word/2018/wordml/cex" xmlns:w16cid="http://schemas.microsoft.com/office/word/2016/wordml/cid" xmlns:w16="http://schemas.microsoft.com/office/word/2018/wordml" xmlns:w16du="http://schemas.microsoft.com/office/word/2023/wordml/word16du" xmlns:w16sdtdh="http://schemas.microsoft.com/office/word/2020/wordml/sdtdatahash" xmlns:w16sdtfl="http://schemas.microsoft.com/office/word/2024/wordml/sdtformatlock" xmlns:w16se="http://schemas.microsoft.com/office/word/2015/wordml/symex" mc:Ignorable="w14 w15 w16se w16cid w16 w16cex w16sdtdh w16sdtfl w16du">
+<w:styles xmlns:w="http://schemas.openxmlformats.org/wordprocessingml/2006/main" xmlns:w14="http://schemas.microsoft.com/office/word/2010/wordml" xmlns:mc="http://schemas.openxmlformats.org/markup-compatibility/2006" mc:Ignorable="w14">
   <w:docDefaults>
     <w:rPrDefault>
       <w:rPr>
-        <w:rFonts w:asciiTheme="minorHAnsi" w:eastAsiaTheme="minorHAnsi" w:hAnsiTheme="minorHAnsi" w:cstheme="minorBidi"/>
+        <w:rFonts w:ascii="Aptos" w:hAnsi="Aptos" w:eastAsia="Aptos" w:cs="" w:asciiTheme="minorHAnsi" w:cstheme="minorBidi" w:eastAsiaTheme="minorHAnsi" w:hAnsiTheme="minorHAnsi"/>
         <w:kern w:val="2"/>
         <w:sz w:val="24"/>
         <w:szCs w:val="24"/>
@@ -2098,21 +2450,21 @@
     </w:rPrDefault>
     <w:pPrDefault>
       <w:pPr>
-        <w:suppressAutoHyphens/>
+        <w:suppressAutoHyphens w:val="true"/>
       </w:pPr>
     </w:pPrDefault>
   </w:docDefaults>
   <w:latentStyles w:defLockedState="0" w:defUIPriority="99" w:defSemiHidden="0" w:defUnhideWhenUsed="0" w:defQFormat="0" w:count="376">
     <w:lsdException w:name="Normal" w:uiPriority="0" w:qFormat="1"/>
     <w:lsdException w:name="heading 1" w:uiPriority="9" w:qFormat="1"/>
-    <w:lsdException w:name="heading 2" w:semiHidden="1" w:uiPriority="9" w:unhideWhenUsed="1" w:qFormat="1"/>
-    <w:lsdException w:name="heading 3" w:semiHidden="1" w:uiPriority="9" w:unhideWhenUsed="1" w:qFormat="1"/>
-    <w:lsdException w:name="heading 4" w:semiHidden="1" w:uiPriority="9" w:unhideWhenUsed="1" w:qFormat="1"/>
-    <w:lsdException w:name="heading 5" w:semiHidden="1" w:uiPriority="9" w:unhideWhenUsed="1" w:qFormat="1"/>
-    <w:lsdException w:name="heading 6" w:semiHidden="1" w:uiPriority="9" w:unhideWhenUsed="1" w:qFormat="1"/>
-    <w:lsdException w:name="heading 7" w:semiHidden="1" w:uiPriority="9" w:unhideWhenUsed="1" w:qFormat="1"/>
-    <w:lsdException w:name="heading 8" w:semiHidden="1" w:uiPriority="9" w:unhideWhenUsed="1" w:qFormat="1"/>
-    <w:lsdException w:name="heading 9" w:semiHidden="1" w:uiPriority="9" w:unhideWhenUsed="1" w:qFormat="1"/>
+    <w:lsdException w:name="heading 2" w:uiPriority="9" w:semiHidden="1" w:unhideWhenUsed="1" w:qFormat="1"/>
+    <w:lsdException w:name="heading 3" w:uiPriority="9" w:semiHidden="1" w:unhideWhenUsed="1" w:qFormat="1"/>
+    <w:lsdException w:name="heading 4" w:uiPriority="9" w:semiHidden="1" w:unhideWhenUsed="1" w:qFormat="1"/>
+    <w:lsdException w:name="heading 5" w:uiPriority="9" w:semiHidden="1" w:unhideWhenUsed="1" w:qFormat="1"/>
+    <w:lsdException w:name="heading 6" w:uiPriority="9" w:semiHidden="1" w:unhideWhenUsed="1" w:qFormat="1"/>
+    <w:lsdException w:name="heading 7" w:uiPriority="9" w:semiHidden="1" w:unhideWhenUsed="1" w:qFormat="1"/>
+    <w:lsdException w:name="heading 8" w:uiPriority="9" w:semiHidden="1" w:unhideWhenUsed="1" w:qFormat="1"/>
+    <w:lsdException w:name="heading 9" w:uiPriority="9" w:semiHidden="1" w:unhideWhenUsed="1" w:qFormat="1"/>
     <w:lsdException w:name="index 1" w:semiHidden="1" w:unhideWhenUsed="1"/>
     <w:lsdException w:name="index 2" w:semiHidden="1" w:unhideWhenUsed="1"/>
     <w:lsdException w:name="index 3" w:semiHidden="1" w:unhideWhenUsed="1"/>
@@ -2122,22 +2474,22 @@
     <w:lsdException w:name="index 7" w:semiHidden="1" w:unhideWhenUsed="1"/>
     <w:lsdException w:name="index 8" w:semiHidden="1" w:unhideWhenUsed="1"/>
     <w:lsdException w:name="index 9" w:semiHidden="1" w:unhideWhenUsed="1"/>
-    <w:lsdException w:name="toc 1" w:semiHidden="1" w:uiPriority="39" w:unhideWhenUsed="1"/>
-    <w:lsdException w:name="toc 2" w:semiHidden="1" w:uiPriority="39" w:unhideWhenUsed="1"/>
-    <w:lsdException w:name="toc 3" w:semiHidden="1" w:uiPriority="39" w:unhideWhenUsed="1"/>
-    <w:lsdException w:name="toc 4" w:semiHidden="1" w:uiPriority="39" w:unhideWhenUsed="1"/>
-    <w:lsdException w:name="toc 5" w:semiHidden="1" w:uiPriority="39" w:unhideWhenUsed="1"/>
-    <w:lsdException w:name="toc 6" w:semiHidden="1" w:uiPriority="39" w:unhideWhenUsed="1"/>
-    <w:lsdException w:name="toc 7" w:semiHidden="1" w:uiPriority="39" w:unhideWhenUsed="1"/>
-    <w:lsdException w:name="toc 8" w:semiHidden="1" w:uiPriority="39" w:unhideWhenUsed="1"/>
-    <w:lsdException w:name="toc 9" w:semiHidden="1" w:uiPriority="39" w:unhideWhenUsed="1"/>
+    <w:lsdException w:name="toc 1" w:uiPriority="39" w:semiHidden="1" w:unhideWhenUsed="1"/>
+    <w:lsdException w:name="toc 2" w:uiPriority="39" w:semiHidden="1" w:unhideWhenUsed="1"/>
+    <w:lsdException w:name="toc 3" w:uiPriority="39" w:semiHidden="1" w:unhideWhenUsed="1"/>
+    <w:lsdException w:name="toc 4" w:uiPriority="39" w:semiHidden="1" w:unhideWhenUsed="1"/>
+    <w:lsdException w:name="toc 5" w:uiPriority="39" w:semiHidden="1" w:unhideWhenUsed="1"/>
+    <w:lsdException w:name="toc 6" w:uiPriority="39" w:semiHidden="1" w:unhideWhenUsed="1"/>
+    <w:lsdException w:name="toc 7" w:uiPriority="39" w:semiHidden="1" w:unhideWhenUsed="1"/>
+    <w:lsdException w:name="toc 8" w:uiPriority="39" w:semiHidden="1" w:unhideWhenUsed="1"/>
+    <w:lsdException w:name="toc 9" w:uiPriority="39" w:semiHidden="1" w:unhideWhenUsed="1"/>
     <w:lsdException w:name="Normal Indent" w:semiHidden="1" w:unhideWhenUsed="1"/>
     <w:lsdException w:name="footnote text" w:semiHidden="1" w:unhideWhenUsed="1"/>
     <w:lsdException w:name="annotation text" w:semiHidden="1" w:unhideWhenUsed="1"/>
     <w:lsdException w:name="header" w:semiHidden="1" w:unhideWhenUsed="1"/>
     <w:lsdException w:name="footer" w:semiHidden="1" w:unhideWhenUsed="1"/>
     <w:lsdException w:name="index heading" w:semiHidden="1" w:unhideWhenUsed="1"/>
-    <w:lsdException w:name="caption" w:semiHidden="1" w:uiPriority="35" w:unhideWhenUsed="1" w:qFormat="1"/>
+    <w:lsdException w:name="caption" w:uiPriority="35" w:semiHidden="1" w:unhideWhenUsed="1" w:qFormat="1"/>
     <w:lsdException w:name="table of figures" w:semiHidden="1" w:unhideWhenUsed="1"/>
     <w:lsdException w:name="envelope address" w:semiHidden="1" w:unhideWhenUsed="1"/>
     <w:lsdException w:name="envelope return" w:semiHidden="1" w:unhideWhenUsed="1"/>
@@ -2168,7 +2520,7 @@
     <w:lsdException w:name="Title" w:uiPriority="10" w:qFormat="1"/>
     <w:lsdException w:name="Closing" w:semiHidden="1" w:unhideWhenUsed="1"/>
     <w:lsdException w:name="Signature" w:semiHidden="1" w:unhideWhenUsed="1"/>
-    <w:lsdException w:name="Default Paragraph Font" w:semiHidden="1" w:uiPriority="1" w:unhideWhenUsed="1"/>
+    <w:lsdException w:name="Default Paragraph Font" w:uiPriority="1" w:semiHidden="1" w:unhideWhenUsed="1"/>
     <w:lsdException w:name="Body Text" w:semiHidden="1" w:unhideWhenUsed="1"/>
     <w:lsdException w:name="Body Text Indent" w:semiHidden="1" w:unhideWhenUsed="1"/>
     <w:lsdException w:name="List Continue" w:semiHidden="1" w:unhideWhenUsed="1"/>
@@ -2368,8 +2720,8 @@
     <w:lsdException w:name="Subtle Reference" w:uiPriority="31" w:qFormat="1"/>
     <w:lsdException w:name="Intense Reference" w:uiPriority="32" w:qFormat="1"/>
     <w:lsdException w:name="Book Title" w:uiPriority="33" w:qFormat="1"/>
-    <w:lsdException w:name="Bibliography" w:semiHidden="1" w:uiPriority="37" w:unhideWhenUsed="1"/>
-    <w:lsdException w:name="TOC Heading" w:semiHidden="1" w:uiPriority="39" w:unhideWhenUsed="1" w:qFormat="1"/>
+    <w:lsdException w:name="Bibliography" w:uiPriority="37" w:semiHidden="1" w:unhideWhenUsed="1"/>
+    <w:lsdException w:name="TOC Heading" w:uiPriority="39" w:semiHidden="1" w:unhideWhenUsed="1" w:qFormat="1"/>
     <w:lsdException w:name="Plain Table 1" w:uiPriority="41"/>
     <w:lsdException w:name="Plain Table 2" w:uiPriority="42"/>
     <w:lsdException w:name="Plain Table 3" w:uiPriority="43"/>
@@ -2480,12 +2832,25 @@
     <w:lsdException w:name="Unresolved Mention" w:semiHidden="1" w:unhideWhenUsed="1"/>
     <w:lsdException w:name="Smart Link" w:semiHidden="1" w:unhideWhenUsed="1"/>
   </w:latentStyles>
-  <w:style w:type="paragraph" w:default="1" w:styleId="Normal">
+  <w:style w:type="paragraph" w:styleId="Normal" w:default="1">
     <w:name w:val="Normal"/>
     <w:qFormat/>
     <w:pPr>
-      <w:spacing w:after="160" w:line="278" w:lineRule="auto"/>
+      <w:widowControl/>
+      <w:suppressAutoHyphens w:val="true"/>
+      <w:bidi w:val="0"/>
+      <w:spacing w:lineRule="auto" w:line="278" w:before="0" w:after="160"/>
+      <w:jc w:val="start"/>
     </w:pPr>
+    <w:rPr>
+      <w:rFonts w:ascii="Aptos" w:hAnsi="Aptos" w:eastAsia="Aptos" w:cs="" w:asciiTheme="minorHAnsi" w:cstheme="minorBidi" w:eastAsiaTheme="minorHAnsi" w:hAnsiTheme="minorHAnsi"/>
+      <w:color w:val="auto"/>
+      <w:kern w:val="2"/>
+      <w:sz w:val="24"/>
+      <w:szCs w:val="24"/>
+      <w:lang w:val="en-ZA" w:eastAsia="en-US" w:bidi="ar-SA"/>
+      <w14:ligatures w14:val="standardContextual"/>
+    </w:rPr>
   </w:style>
   <w:style w:type="paragraph" w:styleId="Heading1">
     <w:name w:val="heading 1"/>
@@ -2494,16 +2859,16 @@
     <w:link w:val="Heading1Char"/>
     <w:uiPriority w:val="9"/>
     <w:qFormat/>
-    <w:rsid w:val="0046671C"/>
+    <w:rsid w:val="0046671c"/>
     <w:pPr>
-      <w:keepNext/>
+      <w:keepNext w:val="true"/>
       <w:keepLines/>
       <w:spacing w:before="360" w:after="80"/>
       <w:outlineLvl w:val="0"/>
     </w:pPr>
     <w:rPr>
-      <w:rFonts w:asciiTheme="majorHAnsi" w:eastAsiaTheme="majorEastAsia" w:hAnsiTheme="majorHAnsi" w:cstheme="majorBidi"/>
-      <w:color w:val="0F4761" w:themeColor="accent1" w:themeShade="BF"/>
+      <w:rFonts w:ascii="Aptos Display" w:hAnsi="Aptos Display" w:eastAsia="" w:cs="" w:asciiTheme="majorHAnsi" w:cstheme="majorBidi" w:eastAsiaTheme="majorEastAsia" w:hAnsiTheme="majorHAnsi"/>
+      <w:color w:themeColor="accent1" w:themeShade="bf" w:val="0F4761"/>
       <w:sz w:val="40"/>
       <w:szCs w:val="40"/>
     </w:rPr>
@@ -2516,16 +2881,16 @@
     <w:uiPriority w:val="9"/>
     <w:unhideWhenUsed/>
     <w:qFormat/>
-    <w:rsid w:val="0046671C"/>
+    <w:rsid w:val="0046671c"/>
     <w:pPr>
-      <w:keepNext/>
+      <w:keepNext w:val="true"/>
       <w:keepLines/>
       <w:spacing w:before="160" w:after="80"/>
       <w:outlineLvl w:val="1"/>
     </w:pPr>
     <w:rPr>
-      <w:rFonts w:asciiTheme="majorHAnsi" w:eastAsiaTheme="majorEastAsia" w:hAnsiTheme="majorHAnsi" w:cstheme="majorBidi"/>
-      <w:color w:val="0F4761" w:themeColor="accent1" w:themeShade="BF"/>
+      <w:rFonts w:ascii="Aptos Display" w:hAnsi="Aptos Display" w:eastAsia="" w:cs="" w:asciiTheme="majorHAnsi" w:cstheme="majorBidi" w:eastAsiaTheme="majorEastAsia" w:hAnsiTheme="majorHAnsi"/>
+      <w:color w:themeColor="accent1" w:themeShade="bf" w:val="0F4761"/>
       <w:sz w:val="32"/>
       <w:szCs w:val="32"/>
     </w:rPr>
@@ -2539,16 +2904,16 @@
     <w:semiHidden/>
     <w:unhideWhenUsed/>
     <w:qFormat/>
-    <w:rsid w:val="0046671C"/>
+    <w:rsid w:val="0046671c"/>
     <w:pPr>
-      <w:keepNext/>
+      <w:keepNext w:val="true"/>
       <w:keepLines/>
       <w:spacing w:before="160" w:after="80"/>
       <w:outlineLvl w:val="2"/>
     </w:pPr>
     <w:rPr>
-      <w:rFonts w:eastAsiaTheme="majorEastAsia" w:cstheme="majorBidi"/>
-      <w:color w:val="0F4761" w:themeColor="accent1" w:themeShade="BF"/>
+      <w:rFonts w:eastAsia="" w:cs="" w:cstheme="majorBidi" w:eastAsiaTheme="majorEastAsia"/>
+      <w:color w:themeColor="accent1" w:themeShade="bf" w:val="0F4761"/>
       <w:sz w:val="28"/>
       <w:szCs w:val="28"/>
     </w:rPr>
@@ -2562,18 +2927,18 @@
     <w:semiHidden/>
     <w:unhideWhenUsed/>
     <w:qFormat/>
-    <w:rsid w:val="0046671C"/>
+    <w:rsid w:val="0046671c"/>
     <w:pPr>
-      <w:keepNext/>
+      <w:keepNext w:val="true"/>
       <w:keepLines/>
       <w:spacing w:before="80" w:after="40"/>
       <w:outlineLvl w:val="3"/>
     </w:pPr>
     <w:rPr>
-      <w:rFonts w:eastAsiaTheme="majorEastAsia" w:cstheme="majorBidi"/>
+      <w:rFonts w:eastAsia="" w:cs="" w:cstheme="majorBidi" w:eastAsiaTheme="majorEastAsia"/>
       <w:i/>
       <w:iCs/>
-      <w:color w:val="0F4761" w:themeColor="accent1" w:themeShade="BF"/>
+      <w:color w:themeColor="accent1" w:themeShade="bf" w:val="0F4761"/>
     </w:rPr>
   </w:style>
   <w:style w:type="paragraph" w:styleId="Heading5">
@@ -2585,16 +2950,16 @@
     <w:semiHidden/>
     <w:unhideWhenUsed/>
     <w:qFormat/>
-    <w:rsid w:val="0046671C"/>
+    <w:rsid w:val="0046671c"/>
     <w:pPr>
-      <w:keepNext/>
+      <w:keepNext w:val="true"/>
       <w:keepLines/>
       <w:spacing w:before="80" w:after="40"/>
       <w:outlineLvl w:val="4"/>
     </w:pPr>
     <w:rPr>
-      <w:rFonts w:eastAsiaTheme="majorEastAsia" w:cstheme="majorBidi"/>
-      <w:color w:val="0F4761" w:themeColor="accent1" w:themeShade="BF"/>
+      <w:rFonts w:eastAsia="" w:cs="" w:cstheme="majorBidi" w:eastAsiaTheme="majorEastAsia"/>
+      <w:color w:themeColor="accent1" w:themeShade="bf" w:val="0F4761"/>
     </w:rPr>
   </w:style>
   <w:style w:type="paragraph" w:styleId="Heading6">
@@ -2606,18 +2971,18 @@
     <w:semiHidden/>
     <w:unhideWhenUsed/>
     <w:qFormat/>
-    <w:rsid w:val="0046671C"/>
+    <w:rsid w:val="0046671c"/>
     <w:pPr>
-      <w:keepNext/>
+      <w:keepNext w:val="true"/>
       <w:keepLines/>
       <w:spacing w:before="40" w:after="0"/>
       <w:outlineLvl w:val="5"/>
     </w:pPr>
     <w:rPr>
-      <w:rFonts w:eastAsiaTheme="majorEastAsia" w:cstheme="majorBidi"/>
+      <w:rFonts w:eastAsia="" w:cs="" w:cstheme="majorBidi" w:eastAsiaTheme="majorEastAsia"/>
       <w:i/>
       <w:iCs/>
-      <w:color w:val="595959" w:themeColor="text1" w:themeTint="A6"/>
+      <w:color w:themeColor="text1" w:themeTint="a6" w:val="595959"/>
     </w:rPr>
   </w:style>
   <w:style w:type="paragraph" w:styleId="Heading7">
@@ -2629,16 +2994,16 @@
     <w:semiHidden/>
     <w:unhideWhenUsed/>
     <w:qFormat/>
-    <w:rsid w:val="0046671C"/>
+    <w:rsid w:val="0046671c"/>
     <w:pPr>
-      <w:keepNext/>
+      <w:keepNext w:val="true"/>
       <w:keepLines/>
       <w:spacing w:before="40" w:after="0"/>
       <w:outlineLvl w:val="6"/>
     </w:pPr>
     <w:rPr>
-      <w:rFonts w:eastAsiaTheme="majorEastAsia" w:cstheme="majorBidi"/>
-      <w:color w:val="595959" w:themeColor="text1" w:themeTint="A6"/>
+      <w:rFonts w:eastAsia="" w:cs="" w:cstheme="majorBidi" w:eastAsiaTheme="majorEastAsia"/>
+      <w:color w:themeColor="text1" w:themeTint="a6" w:val="595959"/>
     </w:rPr>
   </w:style>
   <w:style w:type="paragraph" w:styleId="Heading8">
@@ -2650,18 +3015,18 @@
     <w:semiHidden/>
     <w:unhideWhenUsed/>
     <w:qFormat/>
-    <w:rsid w:val="0046671C"/>
+    <w:rsid w:val="0046671c"/>
     <w:pPr>
-      <w:keepNext/>
+      <w:keepNext w:val="true"/>
       <w:keepLines/>
-      <w:spacing w:after="0"/>
+      <w:spacing w:before="0" w:after="0"/>
       <w:outlineLvl w:val="7"/>
     </w:pPr>
     <w:rPr>
-      <w:rFonts w:eastAsiaTheme="majorEastAsia" w:cstheme="majorBidi"/>
+      <w:rFonts w:eastAsia="" w:cs="" w:cstheme="majorBidi" w:eastAsiaTheme="majorEastAsia"/>
       <w:i/>
       <w:iCs/>
-      <w:color w:val="272727" w:themeColor="text1" w:themeTint="D8"/>
+      <w:color w:themeColor="text1" w:themeTint="d8" w:val="272727"/>
     </w:rPr>
   </w:style>
   <w:style w:type="paragraph" w:styleId="Heading9">
@@ -2673,213 +3038,194 @@
     <w:semiHidden/>
     <w:unhideWhenUsed/>
     <w:qFormat/>
-    <w:rsid w:val="0046671C"/>
+    <w:rsid w:val="0046671c"/>
     <w:pPr>
-      <w:keepNext/>
+      <w:keepNext w:val="true"/>
       <w:keepLines/>
-      <w:spacing w:after="0"/>
+      <w:spacing w:before="0" w:after="0"/>
       <w:outlineLvl w:val="8"/>
     </w:pPr>
     <w:rPr>
-      <w:rFonts w:eastAsiaTheme="majorEastAsia" w:cstheme="majorBidi"/>
-      <w:color w:val="272727" w:themeColor="text1" w:themeTint="D8"/>
+      <w:rFonts w:eastAsia="" w:cs="" w:cstheme="majorBidi" w:eastAsiaTheme="majorEastAsia"/>
+      <w:color w:themeColor="text1" w:themeTint="d8" w:val="272727"/>
     </w:rPr>
   </w:style>
-  <w:style w:type="character" w:default="1" w:styleId="DefaultParagraphFont">
+  <w:style w:type="character" w:styleId="DefaultParagraphFont" w:default="1">
     <w:name w:val="Default Paragraph Font"/>
     <w:uiPriority w:val="1"/>
     <w:semiHidden/>
     <w:unhideWhenUsed/>
-  </w:style>
-  <w:style w:type="table" w:default="1" w:styleId="TableNormal">
-    <w:name w:val="Normal Table"/>
-    <w:uiPriority w:val="99"/>
-    <w:semiHidden/>
-    <w:unhideWhenUsed/>
-    <w:tblPr>
-      <w:tblInd w:w="0" w:type="dxa"/>
-      <w:tblCellMar>
-        <w:top w:w="0" w:type="dxa"/>
-        <w:left w:w="108" w:type="dxa"/>
-        <w:bottom w:w="0" w:type="dxa"/>
-        <w:right w:w="108" w:type="dxa"/>
-      </w:tblCellMar>
-    </w:tblPr>
-  </w:style>
-  <w:style w:type="numbering" w:default="1" w:styleId="NoList">
-    <w:name w:val="No List"/>
-    <w:uiPriority w:val="99"/>
-    <w:semiHidden/>
-    <w:unhideWhenUsed/>
-  </w:style>
-  <w:style w:type="character" w:customStyle="1" w:styleId="Heading1Char">
+    <w:qFormat/>
+    <w:rPr/>
+  </w:style>
+  <w:style w:type="character" w:styleId="Heading1Char" w:customStyle="1">
     <w:name w:val="Heading 1 Char"/>
     <w:basedOn w:val="DefaultParagraphFont"/>
     <w:link w:val="Heading1"/>
     <w:uiPriority w:val="9"/>
     <w:qFormat/>
-    <w:rsid w:val="0046671C"/>
+    <w:rsid w:val="0046671c"/>
     <w:rPr>
-      <w:rFonts w:asciiTheme="majorHAnsi" w:eastAsiaTheme="majorEastAsia" w:hAnsiTheme="majorHAnsi" w:cstheme="majorBidi"/>
-      <w:color w:val="0F4761" w:themeColor="accent1" w:themeShade="BF"/>
+      <w:rFonts w:ascii="Aptos Display" w:hAnsi="Aptos Display" w:eastAsia="" w:cs="" w:asciiTheme="majorHAnsi" w:cstheme="majorBidi" w:eastAsiaTheme="majorEastAsia" w:hAnsiTheme="majorHAnsi"/>
+      <w:color w:themeColor="accent1" w:themeShade="bf" w:val="0F4761"/>
       <w:sz w:val="40"/>
       <w:szCs w:val="40"/>
     </w:rPr>
   </w:style>
-  <w:style w:type="character" w:customStyle="1" w:styleId="Heading2Char">
+  <w:style w:type="character" w:styleId="Heading2Char" w:customStyle="1">
     <w:name w:val="Heading 2 Char"/>
     <w:basedOn w:val="DefaultParagraphFont"/>
     <w:link w:val="Heading2"/>
     <w:uiPriority w:val="9"/>
     <w:qFormat/>
-    <w:rsid w:val="0046671C"/>
+    <w:rsid w:val="0046671c"/>
     <w:rPr>
-      <w:rFonts w:asciiTheme="majorHAnsi" w:eastAsiaTheme="majorEastAsia" w:hAnsiTheme="majorHAnsi" w:cstheme="majorBidi"/>
-      <w:color w:val="0F4761" w:themeColor="accent1" w:themeShade="BF"/>
+      <w:rFonts w:ascii="Aptos Display" w:hAnsi="Aptos Display" w:eastAsia="" w:cs="" w:asciiTheme="majorHAnsi" w:cstheme="majorBidi" w:eastAsiaTheme="majorEastAsia" w:hAnsiTheme="majorHAnsi"/>
+      <w:color w:themeColor="accent1" w:themeShade="bf" w:val="0F4761"/>
       <w:sz w:val="32"/>
       <w:szCs w:val="32"/>
     </w:rPr>
   </w:style>
-  <w:style w:type="character" w:customStyle="1" w:styleId="Heading3Char">
+  <w:style w:type="character" w:styleId="Heading3Char" w:customStyle="1">
     <w:name w:val="Heading 3 Char"/>
     <w:basedOn w:val="DefaultParagraphFont"/>
     <w:link w:val="Heading3"/>
     <w:uiPriority w:val="9"/>
     <w:semiHidden/>
     <w:qFormat/>
-    <w:rsid w:val="0046671C"/>
+    <w:rsid w:val="0046671c"/>
     <w:rPr>
-      <w:rFonts w:eastAsiaTheme="majorEastAsia" w:cstheme="majorBidi"/>
-      <w:color w:val="0F4761" w:themeColor="accent1" w:themeShade="BF"/>
+      <w:rFonts w:eastAsia="" w:cs="" w:cstheme="majorBidi" w:eastAsiaTheme="majorEastAsia"/>
+      <w:color w:themeColor="accent1" w:themeShade="bf" w:val="0F4761"/>
       <w:sz w:val="28"/>
       <w:szCs w:val="28"/>
     </w:rPr>
   </w:style>
-  <w:style w:type="character" w:customStyle="1" w:styleId="Heading4Char">
+  <w:style w:type="character" w:styleId="Heading4Char" w:customStyle="1">
     <w:name w:val="Heading 4 Char"/>
     <w:basedOn w:val="DefaultParagraphFont"/>
     <w:link w:val="Heading4"/>
     <w:uiPriority w:val="9"/>
     <w:semiHidden/>
     <w:qFormat/>
-    <w:rsid w:val="0046671C"/>
+    <w:rsid w:val="0046671c"/>
     <w:rPr>
-      <w:rFonts w:eastAsiaTheme="majorEastAsia" w:cstheme="majorBidi"/>
+      <w:rFonts w:eastAsia="" w:cs="" w:cstheme="majorBidi" w:eastAsiaTheme="majorEastAsia"/>
       <w:i/>
       <w:iCs/>
-      <w:color w:val="0F4761" w:themeColor="accent1" w:themeShade="BF"/>
+      <w:color w:themeColor="accent1" w:themeShade="bf" w:val="0F4761"/>
     </w:rPr>
   </w:style>
-  <w:style w:type="character" w:customStyle="1" w:styleId="Heading5Char">
+  <w:style w:type="character" w:styleId="Heading5Char" w:customStyle="1">
     <w:name w:val="Heading 5 Char"/>
     <w:basedOn w:val="DefaultParagraphFont"/>
     <w:link w:val="Heading5"/>
     <w:uiPriority w:val="9"/>
     <w:semiHidden/>
     <w:qFormat/>
-    <w:rsid w:val="0046671C"/>
+    <w:rsid w:val="0046671c"/>
     <w:rPr>
-      <w:rFonts w:eastAsiaTheme="majorEastAsia" w:cstheme="majorBidi"/>
-      <w:color w:val="0F4761" w:themeColor="accent1" w:themeShade="BF"/>
+      <w:rFonts w:eastAsia="" w:cs="" w:cstheme="majorBidi" w:eastAsiaTheme="majorEastAsia"/>
+      <w:color w:themeColor="accent1" w:themeShade="bf" w:val="0F4761"/>
     </w:rPr>
   </w:style>
-  <w:style w:type="character" w:customStyle="1" w:styleId="Heading6Char">
+  <w:style w:type="character" w:styleId="Heading6Char" w:customStyle="1">
     <w:name w:val="Heading 6 Char"/>
     <w:basedOn w:val="DefaultParagraphFont"/>
     <w:link w:val="Heading6"/>
     <w:uiPriority w:val="9"/>
     <w:semiHidden/>
     <w:qFormat/>
-    <w:rsid w:val="0046671C"/>
+    <w:rsid w:val="0046671c"/>
     <w:rPr>
-      <w:rFonts w:eastAsiaTheme="majorEastAsia" w:cstheme="majorBidi"/>
+      <w:rFonts w:eastAsia="" w:cs="" w:cstheme="majorBidi" w:eastAsiaTheme="majorEastAsia"/>
       <w:i/>
       <w:iCs/>
-      <w:color w:val="595959" w:themeColor="text1" w:themeTint="A6"/>
+      <w:color w:themeColor="text1" w:themeTint="a6" w:val="595959"/>
     </w:rPr>
   </w:style>
-  <w:style w:type="character" w:customStyle="1" w:styleId="Heading7Char">
+  <w:style w:type="character" w:styleId="Heading7Char" w:customStyle="1">
     <w:name w:val="Heading 7 Char"/>
     <w:basedOn w:val="DefaultParagraphFont"/>
     <w:link w:val="Heading7"/>
     <w:uiPriority w:val="9"/>
     <w:semiHidden/>
     <w:qFormat/>
-    <w:rsid w:val="0046671C"/>
+    <w:rsid w:val="0046671c"/>
     <w:rPr>
-      <w:rFonts w:eastAsiaTheme="majorEastAsia" w:cstheme="majorBidi"/>
-      <w:color w:val="595959" w:themeColor="text1" w:themeTint="A6"/>
+      <w:rFonts w:eastAsia="" w:cs="" w:cstheme="majorBidi" w:eastAsiaTheme="majorEastAsia"/>
+      <w:color w:themeColor="text1" w:themeTint="a6" w:val="595959"/>
     </w:rPr>
   </w:style>
-  <w:style w:type="character" w:customStyle="1" w:styleId="Heading8Char">
+  <w:style w:type="character" w:styleId="Heading8Char" w:customStyle="1">
     <w:name w:val="Heading 8 Char"/>
     <w:basedOn w:val="DefaultParagraphFont"/>
     <w:link w:val="Heading8"/>
     <w:uiPriority w:val="9"/>
     <w:semiHidden/>
     <w:qFormat/>
-    <w:rsid w:val="0046671C"/>
+    <w:rsid w:val="0046671c"/>
     <w:rPr>
-      <w:rFonts w:eastAsiaTheme="majorEastAsia" w:cstheme="majorBidi"/>
+      <w:rFonts w:eastAsia="" w:cs="" w:cstheme="majorBidi" w:eastAsiaTheme="majorEastAsia"/>
       <w:i/>
       <w:iCs/>
-      <w:color w:val="272727" w:themeColor="text1" w:themeTint="D8"/>
+      <w:color w:themeColor="text1" w:themeTint="d8" w:val="272727"/>
     </w:rPr>
   </w:style>
-  <w:style w:type="character" w:customStyle="1" w:styleId="Heading9Char">
+  <w:style w:type="character" w:styleId="Heading9Char" w:customStyle="1">
     <w:name w:val="Heading 9 Char"/>
     <w:basedOn w:val="DefaultParagraphFont"/>
     <w:link w:val="Heading9"/>
     <w:uiPriority w:val="9"/>
     <w:semiHidden/>
     <w:qFormat/>
-    <w:rsid w:val="0046671C"/>
+    <w:rsid w:val="0046671c"/>
     <w:rPr>
-      <w:rFonts w:eastAsiaTheme="majorEastAsia" w:cstheme="majorBidi"/>
-      <w:color w:val="272727" w:themeColor="text1" w:themeTint="D8"/>
+      <w:rFonts w:eastAsia="" w:cs="" w:cstheme="majorBidi" w:eastAsiaTheme="majorEastAsia"/>
+      <w:color w:themeColor="text1" w:themeTint="d8" w:val="272727"/>
     </w:rPr>
   </w:style>
-  <w:style w:type="character" w:customStyle="1" w:styleId="TitleChar">
+  <w:style w:type="character" w:styleId="TitleChar" w:customStyle="1">
     <w:name w:val="Title Char"/>
     <w:basedOn w:val="DefaultParagraphFont"/>
     <w:link w:val="Title"/>
     <w:uiPriority w:val="10"/>
     <w:qFormat/>
-    <w:rsid w:val="0046671C"/>
+    <w:rsid w:val="0046671c"/>
     <w:rPr>
-      <w:rFonts w:asciiTheme="majorHAnsi" w:eastAsiaTheme="majorEastAsia" w:hAnsiTheme="majorHAnsi" w:cstheme="majorBidi"/>
+      <w:rFonts w:ascii="Aptos Display" w:hAnsi="Aptos Display" w:eastAsia="" w:cs="" w:asciiTheme="majorHAnsi" w:cstheme="majorBidi" w:eastAsiaTheme="majorEastAsia" w:hAnsiTheme="majorHAnsi"/>
       <w:spacing w:val="-10"/>
       <w:kern w:val="2"/>
       <w:sz w:val="56"/>
       <w:szCs w:val="56"/>
     </w:rPr>
   </w:style>
-  <w:style w:type="character" w:customStyle="1" w:styleId="SubtitleChar">
+  <w:style w:type="character" w:styleId="SubtitleChar" w:customStyle="1">
     <w:name w:val="Subtitle Char"/>
     <w:basedOn w:val="DefaultParagraphFont"/>
     <w:link w:val="Subtitle"/>
     <w:uiPriority w:val="11"/>
     <w:qFormat/>
-    <w:rsid w:val="0046671C"/>
+    <w:rsid w:val="0046671c"/>
     <w:rPr>
-      <w:rFonts w:eastAsiaTheme="majorEastAsia" w:cstheme="majorBidi"/>
-      <w:color w:val="595959" w:themeColor="text1" w:themeTint="A6"/>
+      <w:rFonts w:eastAsia="" w:cs="" w:cstheme="majorBidi" w:eastAsiaTheme="majorEastAsia"/>
+      <w:color w:themeColor="text1" w:themeTint="a6" w:val="595959"/>
       <w:spacing w:val="15"/>
       <w:sz w:val="28"/>
       <w:szCs w:val="28"/>
     </w:rPr>
   </w:style>
-  <w:style w:type="character" w:customStyle="1" w:styleId="QuoteChar">
+  <w:style w:type="character" w:styleId="QuoteChar" w:customStyle="1">
     <w:name w:val="Quote Char"/>
     <w:basedOn w:val="DefaultParagraphFont"/>
     <w:link w:val="Quote"/>
     <w:uiPriority w:val="29"/>
     <w:qFormat/>
-    <w:rsid w:val="0046671C"/>
+    <w:rsid w:val="0046671c"/>
     <w:rPr>
       <w:i/>
       <w:iCs/>
-      <w:color w:val="404040" w:themeColor="text1" w:themeTint="BF"/>
+      <w:color w:themeColor="text1" w:themeTint="bf" w:val="404040"/>
     </w:rPr>
   </w:style>
   <w:style w:type="character" w:styleId="IntenseEmphasis">
@@ -2887,24 +3233,24 @@
     <w:basedOn w:val="DefaultParagraphFont"/>
     <w:uiPriority w:val="21"/>
     <w:qFormat/>
-    <w:rsid w:val="0046671C"/>
+    <w:rsid w:val="0046671c"/>
     <w:rPr>
       <w:i/>
       <w:iCs/>
-      <w:color w:val="0F4761" w:themeColor="accent1" w:themeShade="BF"/>
+      <w:color w:themeColor="accent1" w:themeShade="bf" w:val="0F4761"/>
     </w:rPr>
   </w:style>
-  <w:style w:type="character" w:customStyle="1" w:styleId="IntenseQuoteChar">
+  <w:style w:type="character" w:styleId="IntenseQuoteChar" w:customStyle="1">
     <w:name w:val="Intense Quote Char"/>
     <w:basedOn w:val="DefaultParagraphFont"/>
     <w:link w:val="IntenseQuote"/>
     <w:uiPriority w:val="30"/>
     <w:qFormat/>
-    <w:rsid w:val="0046671C"/>
+    <w:rsid w:val="0046671c"/>
     <w:rPr>
       <w:i/>
       <w:iCs/>
-      <w:color w:val="0F4761" w:themeColor="accent1" w:themeShade="BF"/>
+      <w:color w:themeColor="accent1" w:themeShade="bf" w:val="0F4761"/>
     </w:rPr>
   </w:style>
   <w:style w:type="character" w:styleId="IntenseReference">
@@ -2912,20 +3258,20 @@
     <w:basedOn w:val="DefaultParagraphFont"/>
     <w:uiPriority w:val="32"/>
     <w:qFormat/>
-    <w:rsid w:val="0046671C"/>
+    <w:rsid w:val="0046671c"/>
     <w:rPr>
       <w:b/>
       <w:bCs/>
       <w:smallCaps/>
-      <w:color w:val="0F4761" w:themeColor="accent1" w:themeShade="BF"/>
+      <w:color w:themeColor="accent1" w:themeShade="bf" w:val="0F4761"/>
       <w:spacing w:val="5"/>
     </w:rPr>
   </w:style>
-  <w:style w:type="character" w:customStyle="1" w:styleId="Bulletsuser">
-    <w:name w:val="Bullets (user)"/>
+  <w:style w:type="character" w:styleId="Bullets" w:customStyle="1">
+    <w:name w:val="Bullets"/>
     <w:qFormat/>
     <w:rPr>
-      <w:rFonts w:ascii="OpenSymbol" w:eastAsia="OpenSymbol" w:hAnsi="OpenSymbol" w:cs="OpenSymbol"/>
+      <w:rFonts w:ascii="OpenSymbol" w:hAnsi="OpenSymbol" w:eastAsia="OpenSymbol" w:cs="OpenSymbol"/>
     </w:rPr>
   </w:style>
   <w:style w:type="character" w:styleId="Hyperlink">
@@ -2935,7 +3281,7 @@
     <w:unhideWhenUsed/>
     <w:rsid w:val="00052255"/>
     <w:rPr>
-      <w:color w:val="467886" w:themeColor="hyperlink"/>
+      <w:color w:themeColor="hyperlink" w:val="467886"/>
       <w:u w:val="single"/>
     </w:rPr>
   </w:style>
@@ -2949,20 +3295,20 @@
     <w:rsid w:val="00052255"/>
     <w:rPr>
       <w:color w:val="605E5C"/>
-      <w:shd w:val="clear" w:color="auto" w:fill="E1DFDD"/>
+      <w:shd w:fill="E1DFDD" w:val="clear"/>
     </w:rPr>
   </w:style>
-  <w:style w:type="paragraph" w:customStyle="1" w:styleId="Heading">
+  <w:style w:type="paragraph" w:styleId="Heading" w:customStyle="1">
     <w:name w:val="Heading"/>
     <w:basedOn w:val="Normal"/>
     <w:next w:val="BodyText"/>
     <w:qFormat/>
     <w:pPr>
-      <w:keepNext/>
+      <w:keepNext w:val="true"/>
       <w:spacing w:before="240" w:after="120"/>
     </w:pPr>
     <w:rPr>
-      <w:rFonts w:ascii="Liberation Sans" w:eastAsia="Noto Sans CJK SC" w:hAnsi="Liberation Sans" w:cs="Noto Sans Devanagari"/>
+      <w:rFonts w:ascii="Liberation Sans" w:hAnsi="Liberation Sans" w:eastAsia="Noto Sans CJK SC" w:cs="Noto Sans Devanagari"/>
       <w:sz w:val="28"/>
       <w:szCs w:val="28"/>
     </w:rPr>
@@ -2971,12 +3317,14 @@
     <w:name w:val="Body Text"/>
     <w:basedOn w:val="Normal"/>
     <w:pPr>
-      <w:spacing w:after="140" w:line="276" w:lineRule="auto"/>
+      <w:spacing w:lineRule="auto" w:line="276" w:before="0" w:after="140"/>
     </w:pPr>
+    <w:rPr/>
   </w:style>
   <w:style w:type="paragraph" w:styleId="List">
     <w:name w:val="List"/>
     <w:basedOn w:val="BodyText"/>
+    <w:pPr/>
     <w:rPr>
       <w:rFonts w:cs="Noto Sans Devanagari"/>
     </w:rPr>
@@ -2995,7 +3343,7 @@
       <w:iCs/>
     </w:rPr>
   </w:style>
-  <w:style w:type="paragraph" w:customStyle="1" w:styleId="Index">
+  <w:style w:type="paragraph" w:styleId="Index" w:customStyle="1">
     <w:name w:val="Index"/>
     <w:basedOn w:val="Normal"/>
     <w:qFormat/>
@@ -3013,13 +3361,13 @@
     <w:link w:val="TitleChar"/>
     <w:uiPriority w:val="10"/>
     <w:qFormat/>
-    <w:rsid w:val="0046671C"/>
+    <w:rsid w:val="0046671c"/>
     <w:pPr>
-      <w:spacing w:after="80" w:line="240" w:lineRule="auto"/>
+      <w:spacing w:lineRule="auto" w:line="240" w:before="0" w:after="80"/>
       <w:contextualSpacing/>
     </w:pPr>
     <w:rPr>
-      <w:rFonts w:asciiTheme="majorHAnsi" w:eastAsiaTheme="majorEastAsia" w:hAnsiTheme="majorHAnsi" w:cstheme="majorBidi"/>
+      <w:rFonts w:ascii="Aptos Display" w:hAnsi="Aptos Display" w:eastAsia="" w:cs="" w:asciiTheme="majorHAnsi" w:cstheme="majorBidi" w:eastAsiaTheme="majorEastAsia" w:hAnsiTheme="majorHAnsi"/>
       <w:spacing w:val="-10"/>
       <w:sz w:val="56"/>
       <w:szCs w:val="56"/>
@@ -3032,10 +3380,11 @@
     <w:link w:val="SubtitleChar"/>
     <w:uiPriority w:val="11"/>
     <w:qFormat/>
-    <w:rsid w:val="0046671C"/>
+    <w:rsid w:val="0046671c"/>
+    <w:pPr/>
     <w:rPr>
-      <w:rFonts w:eastAsiaTheme="majorEastAsia" w:cstheme="majorBidi"/>
-      <w:color w:val="595959" w:themeColor="text1" w:themeTint="A6"/>
+      <w:rFonts w:eastAsia="" w:cs="" w:cstheme="majorBidi" w:eastAsiaTheme="majorEastAsia"/>
+      <w:color w:themeColor="text1" w:themeTint="a6" w:val="595959"/>
       <w:spacing w:val="15"/>
       <w:sz w:val="28"/>
       <w:szCs w:val="28"/>
@@ -3048,15 +3397,15 @@
     <w:link w:val="QuoteChar"/>
     <w:uiPriority w:val="29"/>
     <w:qFormat/>
-    <w:rsid w:val="0046671C"/>
+    <w:rsid w:val="0046671c"/>
     <w:pPr>
-      <w:spacing w:before="160"/>
+      <w:spacing w:before="160" w:after="160"/>
       <w:jc w:val="center"/>
     </w:pPr>
     <w:rPr>
       <w:i/>
       <w:iCs/>
-      <w:color w:val="404040" w:themeColor="text1" w:themeTint="BF"/>
+      <w:color w:themeColor="text1" w:themeTint="bf" w:val="404040"/>
     </w:rPr>
   </w:style>
   <w:style w:type="paragraph" w:styleId="ListParagraph">
@@ -3064,11 +3413,13 @@
     <w:basedOn w:val="Normal"/>
     <w:uiPriority w:val="34"/>
     <w:qFormat/>
-    <w:rsid w:val="0046671C"/>
+    <w:rsid w:val="0046671c"/>
     <w:pPr>
-      <w:ind w:left="720"/>
+      <w:spacing w:before="0" w:after="160"/>
+      <w:ind w:start="720"/>
       <w:contextualSpacing/>
     </w:pPr>
+    <w:rPr/>
   </w:style>
   <w:style w:type="paragraph" w:styleId="IntenseQuote">
     <w:name w:val="Intense Quote"/>
@@ -3077,27 +3428,48 @@
     <w:link w:val="IntenseQuoteChar"/>
     <w:uiPriority w:val="30"/>
     <w:qFormat/>
-    <w:rsid w:val="0046671C"/>
+    <w:rsid w:val="0046671c"/>
     <w:pPr>
       <w:pBdr>
-        <w:top w:val="single" w:sz="4" w:space="10" w:color="0F4761" w:themeColor="accent1" w:themeShade="BF"/>
-        <w:bottom w:val="single" w:sz="4" w:space="10" w:color="0F4761" w:themeColor="accent1" w:themeShade="BF"/>
+        <w:top w:val="single" w:sz="4" w:space="10" w:color="0F4761" w:themeColor="accent1" w:themeShade="bf"/>
+        <w:bottom w:val="single" w:sz="4" w:space="10" w:color="0F4761" w:themeColor="accent1" w:themeShade="bf"/>
       </w:pBdr>
       <w:spacing w:before="360" w:after="360"/>
-      <w:ind w:left="864" w:right="864"/>
+      <w:ind w:start="864" w:end="864"/>
       <w:jc w:val="center"/>
     </w:pPr>
     <w:rPr>
       <w:i/>
       <w:iCs/>
-      <w:color w:val="0F4761" w:themeColor="accent1" w:themeShade="BF"/>
+      <w:color w:themeColor="accent1" w:themeShade="bf" w:val="0F4761"/>
     </w:rPr>
+  </w:style>
+  <w:style w:type="numbering" w:styleId="NoList" w:default="1">
+    <w:name w:val="No List"/>
+    <w:uiPriority w:val="99"/>
+    <w:semiHidden/>
+    <w:unhideWhenUsed/>
+    <w:qFormat/>
+  </w:style>
+  <w:style w:type="table" w:default="1" w:styleId="TableNormal">
+    <w:name w:val="Normal Table"/>
+    <w:uiPriority w:val="99"/>
+    <w:semiHidden/>
+    <w:unhideWhenUsed/>
+    <w:tblPr>
+      <w:tblCellMar>
+        <w:top w:w="0" w:type="dxa"/>
+        <w:left w:w="108" w:type="dxa"/>
+        <w:bottom w:w="0" w:type="dxa"/>
+        <w:right w:w="108" w:type="dxa"/>
+      </w:tblCellMar>
+    </w:tblPr>
   </w:style>
 </w:styles>
 </file>
 
 <file path=word/theme/theme1.xml><?xml version="1.0" encoding="utf-8"?>
-<a:theme xmlns:a="http://schemas.openxmlformats.org/drawingml/2006/main" name="Office Theme">
+<a:theme xmlns:a="http://schemas.openxmlformats.org/drawingml/2006/main" xmlns:r="http://schemas.openxmlformats.org/officeDocument/2006/relationships" name="Office Theme">
   <a:themeElements>
     <a:clrScheme name="Office">
       <a:dk1>
@@ -3139,12 +3511,12 @@
     </a:clrScheme>
     <a:fontScheme name="Office">
       <a:majorFont>
-        <a:latin typeface="Aptos Display" panose="02110004020202020204"/>
+        <a:latin typeface="Aptos Display" panose="02110004020202020204" pitchFamily="0" charset="1"/>
         <a:ea typeface=""/>
         <a:cs typeface=""/>
       </a:majorFont>
       <a:minorFont>
-        <a:latin typeface="Aptos" panose="02110004020202020204"/>
+        <a:latin typeface="Aptos" panose="02110004020202020204" pitchFamily="0" charset="1"/>
         <a:ea typeface=""/>
         <a:cs typeface=""/>
       </a:minorFont>
@@ -3176,7 +3548,7 @@
             </a:gs>
           </a:gsLst>
           <a:lin ang="5400000" scaled="0"/>
-          <a:tileRect/>
+          <a:tileRect l="0" t="0" r="0" b="0"/>
         </a:gradFill>
         <a:gradFill>
           <a:gsLst>
@@ -3200,7 +3572,7 @@
             </a:gs>
           </a:gsLst>
           <a:lin ang="5400000" scaled="0"/>
-          <a:tileRect/>
+          <a:tileRect l="0" t="0" r="0" b="0"/>
         </a:gradFill>
       </a:fillStyleLst>
       <a:lnStyleLst>
@@ -3260,12 +3632,10 @@
             </a:gs>
           </a:gsLst>
           <a:lin ang="5400000" scaled="0"/>
-          <a:tileRect/>
+          <a:tileRect l="0" t="0" r="0" b="0"/>
         </a:gradFill>
       </a:bgFillStyleLst>
     </a:fmtScheme>
   </a:themeElements>
-  <a:objectDefaults/>
-  <a:extraClrSchemeLst/>
 </a:theme>
 </file>
</xml_diff>